<commit_message>
Sync ERD and structure docs with Data Dictionary runtime field names
- craycare_erd.dbml: rename fields to runtime Firestore names (notif_type,
  pH_/DO_/waterLevel_*, dispenseCount, lastSeen, time/ampm/timeValue/days,
  effective_at_ms, type, schedule_key, timestamp/ts_epoch, sensor/label/value,
  total_weight/total_length) and add runtime-stored fields (users.fcmTokens,
  tank pointer fields, hardware uid, daily summary _sum/_count + maintenance
  fields, schedule outcome fields, feeder_logs.schedule_time, WQAD uid/
  ts_epoch/contributors, batch growth counters, sampling ABW/ABL/biomass,
  harvest abw_grams). Field counts now match the Data Dictionary exactly.
- firestore_structure.json: add missing verification_note to feeder_logs
  (written by ESP32 firmware).
- Data Dictionary.docx: add missing *_sum/*_count fields to
  sensor_daily_summaries (written by the daily summary Cloud Function).
</commit_message>
<xml_diff>
--- a/docs/Deliverables/Data Dictionary.docx
+++ b/docs/Deliverables/Data Dictionary.docx
@@ -7325,6 +7325,150 @@
               <w:jc w:val="left"/>
             </w:pPr>
             <w:r>
+              <w:t>temp_count</w:t>
+            </w:r>
+          </w:p>
+        </w:tc>
+        <w:tc>
+          <w:tcPr>
+            <w:tcW w:w="1350" w:type="dxa"/>
+          </w:tcPr>
+          <w:p>
+            <w:pPr>
+              <w:spacing w:after="0" w:line="240" w:lineRule="auto"/>
+              <w:jc w:val="left"/>
+            </w:pPr>
+            <w:r>
+              <w:t>int</w:t>
+            </w:r>
+          </w:p>
+        </w:tc>
+        <w:tc>
+          <w:tcPr>
+            <w:tcW w:w="1656" w:type="dxa"/>
+          </w:tcPr>
+          <w:p>
+            <w:pPr>
+              <w:spacing w:after="0" w:line="240" w:lineRule="auto"/>
+              <w:jc w:val="left"/>
+            </w:pPr>
+            <w:r>
+              <w:t>Optional</w:t>
+            </w:r>
+          </w:p>
+        </w:tc>
+        <w:tc>
+          <w:tcPr>
+            <w:tcW w:w="1656" w:type="dxa"/>
+          </w:tcPr>
+          <w:p>
+            <w:pPr>
+              <w:spacing w:after="0" w:line="240" w:lineRule="auto"/>
+              <w:jc w:val="left"/>
+            </w:pPr>
+            <w:r>
+              <w:t>0</w:t>
+            </w:r>
+          </w:p>
+        </w:tc>
+        <w:tc>
+          <w:tcPr>
+            <w:tcW w:w="2808" w:type="dxa"/>
+          </w:tcPr>
+          <w:p>
+            <w:pPr>
+              <w:spacing w:after="0" w:line="240" w:lineRule="auto"/>
+              <w:jc w:val="left"/>
+            </w:pPr>
+            <w:r>
+              <w:t>Number of history entries contributing to the sum and mean.</w:t>
+            </w:r>
+          </w:p>
+        </w:tc>
+      </w:tr>
+      <w:tr>
+        <w:tc>
+          <w:tcPr>
+            <w:tcW w:w="1458" w:type="dxa"/>
+          </w:tcPr>
+          <w:p>
+            <w:pPr>
+              <w:spacing w:after="0" w:line="240" w:lineRule="auto"/>
+              <w:jc w:val="left"/>
+            </w:pPr>
+            <w:r>
+              <w:t>temp_sum</w:t>
+            </w:r>
+          </w:p>
+        </w:tc>
+        <w:tc>
+          <w:tcPr>
+            <w:tcW w:w="1350" w:type="dxa"/>
+          </w:tcPr>
+          <w:p>
+            <w:pPr>
+              <w:spacing w:after="0" w:line="240" w:lineRule="auto"/>
+              <w:jc w:val="left"/>
+            </w:pPr>
+            <w:r>
+              <w:t>decimal(10,2)</w:t>
+            </w:r>
+          </w:p>
+        </w:tc>
+        <w:tc>
+          <w:tcPr>
+            <w:tcW w:w="1656" w:type="dxa"/>
+          </w:tcPr>
+          <w:p>
+            <w:pPr>
+              <w:spacing w:after="0" w:line="240" w:lineRule="auto"/>
+              <w:jc w:val="left"/>
+            </w:pPr>
+            <w:r>
+              <w:t>Optional</w:t>
+            </w:r>
+          </w:p>
+        </w:tc>
+        <w:tc>
+          <w:tcPr>
+            <w:tcW w:w="1656" w:type="dxa"/>
+          </w:tcPr>
+          <w:p>
+            <w:pPr>
+              <w:spacing w:after="0" w:line="240" w:lineRule="auto"/>
+              <w:jc w:val="left"/>
+            </w:pPr>
+            <w:r>
+              <w:t>0.00</w:t>
+            </w:r>
+          </w:p>
+        </w:tc>
+        <w:tc>
+          <w:tcPr>
+            <w:tcW w:w="2808" w:type="dxa"/>
+          </w:tcPr>
+          <w:p>
+            <w:pPr>
+              <w:spacing w:after="0" w:line="240" w:lineRule="auto"/>
+              <w:jc w:val="left"/>
+            </w:pPr>
+            <w:r>
+              <w:t>Sum of per-window average values; combined with count to recompute the overall mean.</w:t>
+            </w:r>
+          </w:p>
+        </w:tc>
+      </w:tr>
+      <w:tr>
+        <w:tc>
+          <w:tcPr>
+            <w:tcW w:w="1458" w:type="dxa"/>
+          </w:tcPr>
+          <w:p>
+            <w:pPr>
+              <w:spacing w:after="0" w:line="240" w:lineRule="auto"/>
+              <w:jc w:val="left"/>
+            </w:pPr>
+            <w:r>
               <w:t>pH_min</w:t>
             </w:r>
           </w:p>
@@ -7541,6 +7685,150 @@
               <w:jc w:val="left"/>
             </w:pPr>
             <w:r>
+              <w:t>pH_count</w:t>
+            </w:r>
+          </w:p>
+        </w:tc>
+        <w:tc>
+          <w:tcPr>
+            <w:tcW w:w="1350" w:type="dxa"/>
+          </w:tcPr>
+          <w:p>
+            <w:pPr>
+              <w:spacing w:after="0" w:line="240" w:lineRule="auto"/>
+              <w:jc w:val="left"/>
+            </w:pPr>
+            <w:r>
+              <w:t>int</w:t>
+            </w:r>
+          </w:p>
+        </w:tc>
+        <w:tc>
+          <w:tcPr>
+            <w:tcW w:w="1656" w:type="dxa"/>
+          </w:tcPr>
+          <w:p>
+            <w:pPr>
+              <w:spacing w:after="0" w:line="240" w:lineRule="auto"/>
+              <w:jc w:val="left"/>
+            </w:pPr>
+            <w:r>
+              <w:t>Optional</w:t>
+            </w:r>
+          </w:p>
+        </w:tc>
+        <w:tc>
+          <w:tcPr>
+            <w:tcW w:w="1656" w:type="dxa"/>
+          </w:tcPr>
+          <w:p>
+            <w:pPr>
+              <w:spacing w:after="0" w:line="240" w:lineRule="auto"/>
+              <w:jc w:val="left"/>
+            </w:pPr>
+            <w:r>
+              <w:t>0</w:t>
+            </w:r>
+          </w:p>
+        </w:tc>
+        <w:tc>
+          <w:tcPr>
+            <w:tcW w:w="2808" w:type="dxa"/>
+          </w:tcPr>
+          <w:p>
+            <w:pPr>
+              <w:spacing w:after="0" w:line="240" w:lineRule="auto"/>
+              <w:jc w:val="left"/>
+            </w:pPr>
+            <w:r>
+              <w:t>Number of history entries contributing to the sum and mean.</w:t>
+            </w:r>
+          </w:p>
+        </w:tc>
+      </w:tr>
+      <w:tr>
+        <w:tc>
+          <w:tcPr>
+            <w:tcW w:w="1458" w:type="dxa"/>
+          </w:tcPr>
+          <w:p>
+            <w:pPr>
+              <w:spacing w:after="0" w:line="240" w:lineRule="auto"/>
+              <w:jc w:val="left"/>
+            </w:pPr>
+            <w:r>
+              <w:t>pH_sum</w:t>
+            </w:r>
+          </w:p>
+        </w:tc>
+        <w:tc>
+          <w:tcPr>
+            <w:tcW w:w="1350" w:type="dxa"/>
+          </w:tcPr>
+          <w:p>
+            <w:pPr>
+              <w:spacing w:after="0" w:line="240" w:lineRule="auto"/>
+              <w:jc w:val="left"/>
+            </w:pPr>
+            <w:r>
+              <w:t>decimal(8,2)</w:t>
+            </w:r>
+          </w:p>
+        </w:tc>
+        <w:tc>
+          <w:tcPr>
+            <w:tcW w:w="1656" w:type="dxa"/>
+          </w:tcPr>
+          <w:p>
+            <w:pPr>
+              <w:spacing w:after="0" w:line="240" w:lineRule="auto"/>
+              <w:jc w:val="left"/>
+            </w:pPr>
+            <w:r>
+              <w:t>Optional</w:t>
+            </w:r>
+          </w:p>
+        </w:tc>
+        <w:tc>
+          <w:tcPr>
+            <w:tcW w:w="1656" w:type="dxa"/>
+          </w:tcPr>
+          <w:p>
+            <w:pPr>
+              <w:spacing w:after="0" w:line="240" w:lineRule="auto"/>
+              <w:jc w:val="left"/>
+            </w:pPr>
+            <w:r>
+              <w:t>0.00</w:t>
+            </w:r>
+          </w:p>
+        </w:tc>
+        <w:tc>
+          <w:tcPr>
+            <w:tcW w:w="2808" w:type="dxa"/>
+          </w:tcPr>
+          <w:p>
+            <w:pPr>
+              <w:spacing w:after="0" w:line="240" w:lineRule="auto"/>
+              <w:jc w:val="left"/>
+            </w:pPr>
+            <w:r>
+              <w:t>Sum of per-window average values; combined with count to recompute the overall mean.</w:t>
+            </w:r>
+          </w:p>
+        </w:tc>
+      </w:tr>
+      <w:tr>
+        <w:tc>
+          <w:tcPr>
+            <w:tcW w:w="1458" w:type="dxa"/>
+          </w:tcPr>
+          <w:p>
+            <w:pPr>
+              <w:spacing w:after="0" w:line="240" w:lineRule="auto"/>
+              <w:jc w:val="left"/>
+            </w:pPr>
+            <w:r>
               <w:t>DO_min</w:t>
             </w:r>
           </w:p>
@@ -7742,6 +8030,150 @@
             </w:pPr>
             <w:r>
               <w:t>Mean dissolved oxygen in mg/L for the calendar day.</w:t>
+            </w:r>
+          </w:p>
+        </w:tc>
+      </w:tr>
+      <w:tr>
+        <w:tc>
+          <w:tcPr>
+            <w:tcW w:w="1458" w:type="dxa"/>
+          </w:tcPr>
+          <w:p>
+            <w:pPr>
+              <w:spacing w:after="0" w:line="240" w:lineRule="auto"/>
+              <w:jc w:val="left"/>
+            </w:pPr>
+            <w:r>
+              <w:t>DO_count</w:t>
+            </w:r>
+          </w:p>
+        </w:tc>
+        <w:tc>
+          <w:tcPr>
+            <w:tcW w:w="1350" w:type="dxa"/>
+          </w:tcPr>
+          <w:p>
+            <w:pPr>
+              <w:spacing w:after="0" w:line="240" w:lineRule="auto"/>
+              <w:jc w:val="left"/>
+            </w:pPr>
+            <w:r>
+              <w:t>int</w:t>
+            </w:r>
+          </w:p>
+        </w:tc>
+        <w:tc>
+          <w:tcPr>
+            <w:tcW w:w="1656" w:type="dxa"/>
+          </w:tcPr>
+          <w:p>
+            <w:pPr>
+              <w:spacing w:after="0" w:line="240" w:lineRule="auto"/>
+              <w:jc w:val="left"/>
+            </w:pPr>
+            <w:r>
+              <w:t>Optional</w:t>
+            </w:r>
+          </w:p>
+        </w:tc>
+        <w:tc>
+          <w:tcPr>
+            <w:tcW w:w="1656" w:type="dxa"/>
+          </w:tcPr>
+          <w:p>
+            <w:pPr>
+              <w:spacing w:after="0" w:line="240" w:lineRule="auto"/>
+              <w:jc w:val="left"/>
+            </w:pPr>
+            <w:r>
+              <w:t>0</w:t>
+            </w:r>
+          </w:p>
+        </w:tc>
+        <w:tc>
+          <w:tcPr>
+            <w:tcW w:w="2808" w:type="dxa"/>
+          </w:tcPr>
+          <w:p>
+            <w:pPr>
+              <w:spacing w:after="0" w:line="240" w:lineRule="auto"/>
+              <w:jc w:val="left"/>
+            </w:pPr>
+            <w:r>
+              <w:t>Number of history entries contributing to the sum and mean.</w:t>
+            </w:r>
+          </w:p>
+        </w:tc>
+      </w:tr>
+      <w:tr>
+        <w:tc>
+          <w:tcPr>
+            <w:tcW w:w="1458" w:type="dxa"/>
+          </w:tcPr>
+          <w:p>
+            <w:pPr>
+              <w:spacing w:after="0" w:line="240" w:lineRule="auto"/>
+              <w:jc w:val="left"/>
+            </w:pPr>
+            <w:r>
+              <w:t>DO_sum</w:t>
+            </w:r>
+          </w:p>
+        </w:tc>
+        <w:tc>
+          <w:tcPr>
+            <w:tcW w:w="1350" w:type="dxa"/>
+          </w:tcPr>
+          <w:p>
+            <w:pPr>
+              <w:spacing w:after="0" w:line="240" w:lineRule="auto"/>
+              <w:jc w:val="left"/>
+            </w:pPr>
+            <w:r>
+              <w:t>decimal(8,2)</w:t>
+            </w:r>
+          </w:p>
+        </w:tc>
+        <w:tc>
+          <w:tcPr>
+            <w:tcW w:w="1656" w:type="dxa"/>
+          </w:tcPr>
+          <w:p>
+            <w:pPr>
+              <w:spacing w:after="0" w:line="240" w:lineRule="auto"/>
+              <w:jc w:val="left"/>
+            </w:pPr>
+            <w:r>
+              <w:t>Optional</w:t>
+            </w:r>
+          </w:p>
+        </w:tc>
+        <w:tc>
+          <w:tcPr>
+            <w:tcW w:w="1656" w:type="dxa"/>
+          </w:tcPr>
+          <w:p>
+            <w:pPr>
+              <w:spacing w:after="0" w:line="240" w:lineRule="auto"/>
+              <w:jc w:val="left"/>
+            </w:pPr>
+            <w:r>
+              <w:t>0.00</w:t>
+            </w:r>
+          </w:p>
+        </w:tc>
+        <w:tc>
+          <w:tcPr>
+            <w:tcW w:w="2808" w:type="dxa"/>
+          </w:tcPr>
+          <w:p>
+            <w:pPr>
+              <w:spacing w:after="0" w:line="240" w:lineRule="auto"/>
+              <w:jc w:val="left"/>
+            </w:pPr>
+            <w:r>
+              <w:t>Sum of per-window average values; combined with count to recompute the overall mean.</w:t>
             </w:r>
           </w:p>
         </w:tc>
@@ -7988,6 +8420,150 @@
               <w:jc w:val="left"/>
             </w:pPr>
             <w:r>
+              <w:t>turbidity_count</w:t>
+            </w:r>
+          </w:p>
+        </w:tc>
+        <w:tc>
+          <w:tcPr>
+            <w:tcW w:w="1350" w:type="dxa"/>
+          </w:tcPr>
+          <w:p>
+            <w:pPr>
+              <w:spacing w:after="0" w:line="240" w:lineRule="auto"/>
+              <w:jc w:val="left"/>
+            </w:pPr>
+            <w:r>
+              <w:t>int</w:t>
+            </w:r>
+          </w:p>
+        </w:tc>
+        <w:tc>
+          <w:tcPr>
+            <w:tcW w:w="1656" w:type="dxa"/>
+          </w:tcPr>
+          <w:p>
+            <w:pPr>
+              <w:spacing w:after="0" w:line="240" w:lineRule="auto"/>
+              <w:jc w:val="left"/>
+            </w:pPr>
+            <w:r>
+              <w:t>Optional</w:t>
+            </w:r>
+          </w:p>
+        </w:tc>
+        <w:tc>
+          <w:tcPr>
+            <w:tcW w:w="1656" w:type="dxa"/>
+          </w:tcPr>
+          <w:p>
+            <w:pPr>
+              <w:spacing w:after="0" w:line="240" w:lineRule="auto"/>
+              <w:jc w:val="left"/>
+            </w:pPr>
+            <w:r>
+              <w:t>0</w:t>
+            </w:r>
+          </w:p>
+        </w:tc>
+        <w:tc>
+          <w:tcPr>
+            <w:tcW w:w="2808" w:type="dxa"/>
+          </w:tcPr>
+          <w:p>
+            <w:pPr>
+              <w:spacing w:after="0" w:line="240" w:lineRule="auto"/>
+              <w:jc w:val="left"/>
+            </w:pPr>
+            <w:r>
+              <w:t>Number of history entries contributing to the sum and mean.</w:t>
+            </w:r>
+          </w:p>
+        </w:tc>
+      </w:tr>
+      <w:tr>
+        <w:tc>
+          <w:tcPr>
+            <w:tcW w:w="1458" w:type="dxa"/>
+          </w:tcPr>
+          <w:p>
+            <w:pPr>
+              <w:spacing w:after="0" w:line="240" w:lineRule="auto"/>
+              <w:jc w:val="left"/>
+            </w:pPr>
+            <w:r>
+              <w:t>turbidity_sum</w:t>
+            </w:r>
+          </w:p>
+        </w:tc>
+        <w:tc>
+          <w:tcPr>
+            <w:tcW w:w="1350" w:type="dxa"/>
+          </w:tcPr>
+          <w:p>
+            <w:pPr>
+              <w:spacing w:after="0" w:line="240" w:lineRule="auto"/>
+              <w:jc w:val="left"/>
+            </w:pPr>
+            <w:r>
+              <w:t>decimal(12,2)</w:t>
+            </w:r>
+          </w:p>
+        </w:tc>
+        <w:tc>
+          <w:tcPr>
+            <w:tcW w:w="1656" w:type="dxa"/>
+          </w:tcPr>
+          <w:p>
+            <w:pPr>
+              <w:spacing w:after="0" w:line="240" w:lineRule="auto"/>
+              <w:jc w:val="left"/>
+            </w:pPr>
+            <w:r>
+              <w:t>Optional</w:t>
+            </w:r>
+          </w:p>
+        </w:tc>
+        <w:tc>
+          <w:tcPr>
+            <w:tcW w:w="1656" w:type="dxa"/>
+          </w:tcPr>
+          <w:p>
+            <w:pPr>
+              <w:spacing w:after="0" w:line="240" w:lineRule="auto"/>
+              <w:jc w:val="left"/>
+            </w:pPr>
+            <w:r>
+              <w:t>0.00</w:t>
+            </w:r>
+          </w:p>
+        </w:tc>
+        <w:tc>
+          <w:tcPr>
+            <w:tcW w:w="2808" w:type="dxa"/>
+          </w:tcPr>
+          <w:p>
+            <w:pPr>
+              <w:spacing w:after="0" w:line="240" w:lineRule="auto"/>
+              <w:jc w:val="left"/>
+            </w:pPr>
+            <w:r>
+              <w:t>Sum of per-window average values; combined with count to recompute the overall mean.</w:t>
+            </w:r>
+          </w:p>
+        </w:tc>
+      </w:tr>
+      <w:tr>
+        <w:tc>
+          <w:tcPr>
+            <w:tcW w:w="1458" w:type="dxa"/>
+          </w:tcPr>
+          <w:p>
+            <w:pPr>
+              <w:spacing w:after="0" w:line="240" w:lineRule="auto"/>
+              <w:jc w:val="left"/>
+            </w:pPr>
+            <w:r>
               <w:t>waterLevel_min</w:t>
             </w:r>
           </w:p>
@@ -8189,6 +8765,150 @@
             </w:pPr>
             <w:r>
               <w:t>Mean water depth in cm for the calendar day.</w:t>
+            </w:r>
+          </w:p>
+        </w:tc>
+      </w:tr>
+      <w:tr>
+        <w:tc>
+          <w:tcPr>
+            <w:tcW w:w="1458" w:type="dxa"/>
+          </w:tcPr>
+          <w:p>
+            <w:pPr>
+              <w:spacing w:after="0" w:line="240" w:lineRule="auto"/>
+              <w:jc w:val="left"/>
+            </w:pPr>
+            <w:r>
+              <w:t>waterLevel_count</w:t>
+            </w:r>
+          </w:p>
+        </w:tc>
+        <w:tc>
+          <w:tcPr>
+            <w:tcW w:w="1350" w:type="dxa"/>
+          </w:tcPr>
+          <w:p>
+            <w:pPr>
+              <w:spacing w:after="0" w:line="240" w:lineRule="auto"/>
+              <w:jc w:val="left"/>
+            </w:pPr>
+            <w:r>
+              <w:t>int</w:t>
+            </w:r>
+          </w:p>
+        </w:tc>
+        <w:tc>
+          <w:tcPr>
+            <w:tcW w:w="1656" w:type="dxa"/>
+          </w:tcPr>
+          <w:p>
+            <w:pPr>
+              <w:spacing w:after="0" w:line="240" w:lineRule="auto"/>
+              <w:jc w:val="left"/>
+            </w:pPr>
+            <w:r>
+              <w:t>Optional</w:t>
+            </w:r>
+          </w:p>
+        </w:tc>
+        <w:tc>
+          <w:tcPr>
+            <w:tcW w:w="1656" w:type="dxa"/>
+          </w:tcPr>
+          <w:p>
+            <w:pPr>
+              <w:spacing w:after="0" w:line="240" w:lineRule="auto"/>
+              <w:jc w:val="left"/>
+            </w:pPr>
+            <w:r>
+              <w:t>0</w:t>
+            </w:r>
+          </w:p>
+        </w:tc>
+        <w:tc>
+          <w:tcPr>
+            <w:tcW w:w="2808" w:type="dxa"/>
+          </w:tcPr>
+          <w:p>
+            <w:pPr>
+              <w:spacing w:after="0" w:line="240" w:lineRule="auto"/>
+              <w:jc w:val="left"/>
+            </w:pPr>
+            <w:r>
+              <w:t>Number of history entries contributing to the sum and mean.</w:t>
+            </w:r>
+          </w:p>
+        </w:tc>
+      </w:tr>
+      <w:tr>
+        <w:tc>
+          <w:tcPr>
+            <w:tcW w:w="1458" w:type="dxa"/>
+          </w:tcPr>
+          <w:p>
+            <w:pPr>
+              <w:spacing w:after="0" w:line="240" w:lineRule="auto"/>
+              <w:jc w:val="left"/>
+            </w:pPr>
+            <w:r>
+              <w:t>waterLevel_sum</w:t>
+            </w:r>
+          </w:p>
+        </w:tc>
+        <w:tc>
+          <w:tcPr>
+            <w:tcW w:w="1350" w:type="dxa"/>
+          </w:tcPr>
+          <w:p>
+            <w:pPr>
+              <w:spacing w:after="0" w:line="240" w:lineRule="auto"/>
+              <w:jc w:val="left"/>
+            </w:pPr>
+            <w:r>
+              <w:t>decimal(10,2)</w:t>
+            </w:r>
+          </w:p>
+        </w:tc>
+        <w:tc>
+          <w:tcPr>
+            <w:tcW w:w="1656" w:type="dxa"/>
+          </w:tcPr>
+          <w:p>
+            <w:pPr>
+              <w:spacing w:after="0" w:line="240" w:lineRule="auto"/>
+              <w:jc w:val="left"/>
+            </w:pPr>
+            <w:r>
+              <w:t>Optional</w:t>
+            </w:r>
+          </w:p>
+        </w:tc>
+        <w:tc>
+          <w:tcPr>
+            <w:tcW w:w="1656" w:type="dxa"/>
+          </w:tcPr>
+          <w:p>
+            <w:pPr>
+              <w:spacing w:after="0" w:line="240" w:lineRule="auto"/>
+              <w:jc w:val="left"/>
+            </w:pPr>
+            <w:r>
+              <w:t>0.00</w:t>
+            </w:r>
+          </w:p>
+        </w:tc>
+        <w:tc>
+          <w:tcPr>
+            <w:tcW w:w="2808" w:type="dxa"/>
+          </w:tcPr>
+          <w:p>
+            <w:pPr>
+              <w:spacing w:after="0" w:line="240" w:lineRule="auto"/>
+              <w:jc w:val="left"/>
+            </w:pPr>
+            <w:r>
+              <w:t>Sum of per-window average values; combined with count to recompute the overall mean.</w:t>
             </w:r>
           </w:p>
         </w:tc>

</xml_diff>

<commit_message>
Normalize tank schema to batch-sourced single source of truth
</commit_message>
<xml_diff>
--- a/docs/Deliverables/Data Dictionary.docx
+++ b/docs/Deliverables/Data Dictionary.docx
@@ -24,6 +24,9 @@
         <w:jc w:val="center"/>
       </w:pPr>
       <w:r>
+        <w:rPr>
+          <w:rFonts w:ascii="Arial" w:hAnsi="Arial" w:eastAsia="Arial"/>
+        </w:rPr>
         <w:t>Table 1</w:t>
       </w:r>
     </w:p>
@@ -730,6 +733,9 @@
         <w:jc w:val="center"/>
       </w:pPr>
       <w:r>
+        <w:rPr>
+          <w:rFonts w:ascii="Arial" w:hAnsi="Arial" w:eastAsia="Arial"/>
+        </w:rPr>
         <w:t>Table 2</w:t>
       </w:r>
     </w:p>
@@ -1506,6 +1512,9 @@
         <w:jc w:val="center"/>
       </w:pPr>
       <w:r>
+        <w:rPr>
+          <w:rFonts w:ascii="Arial" w:hAnsi="Arial" w:eastAsia="Arial"/>
+        </w:rPr>
         <w:t>Table 3</w:t>
       </w:r>
     </w:p>
@@ -1852,438 +1861,6 @@
               <w:jc w:val="left"/>
             </w:pPr>
             <w:r>
-              <w:t>stocking_date</w:t>
-            </w:r>
-          </w:p>
-        </w:tc>
-        <w:tc>
-          <w:tcPr>
-            <w:tcW w:w="1350" w:type="dxa"/>
-          </w:tcPr>
-          <w:p>
-            <w:pPr>
-              <w:spacing w:after="0" w:line="240" w:lineRule="auto"/>
-              <w:jc w:val="left"/>
-            </w:pPr>
-            <w:r>
-              <w:t>date</w:t>
-            </w:r>
-          </w:p>
-        </w:tc>
-        <w:tc>
-          <w:tcPr>
-            <w:tcW w:w="1656" w:type="dxa"/>
-          </w:tcPr>
-          <w:p>
-            <w:pPr>
-              <w:spacing w:after="0" w:line="240" w:lineRule="auto"/>
-              <w:jc w:val="left"/>
-            </w:pPr>
-            <w:r>
-              <w:t>Optional</w:t>
-            </w:r>
-          </w:p>
-        </w:tc>
-        <w:tc>
-          <w:tcPr>
-            <w:tcW w:w="1656" w:type="dxa"/>
-          </w:tcPr>
-          <w:p>
-            <w:pPr>
-              <w:spacing w:after="0" w:line="240" w:lineRule="auto"/>
-              <w:jc w:val="left"/>
-            </w:pPr>
-            <w:r>
-              <w:t>2026-09-06</w:t>
-            </w:r>
-          </w:p>
-        </w:tc>
-        <w:tc>
-          <w:tcPr>
-            <w:tcW w:w="2808" w:type="dxa"/>
-          </w:tcPr>
-          <w:p>
-            <w:pPr>
-              <w:spacing w:after="0" w:line="240" w:lineRule="auto"/>
-              <w:jc w:val="left"/>
-            </w:pPr>
-            <w:r>
-              <w:t>Day 0 stocking date; stored in Firestore as integer epoch milliseconds.</w:t>
-            </w:r>
-          </w:p>
-        </w:tc>
-      </w:tr>
-      <w:tr>
-        <w:tc>
-          <w:tcPr>
-            <w:tcW w:w="1458" w:type="dxa"/>
-          </w:tcPr>
-          <w:p>
-            <w:pPr>
-              <w:spacing w:after="0" w:line="240" w:lineRule="auto"/>
-              <w:jc w:val="left"/>
-            </w:pPr>
-            <w:r>
-              <w:t>last_sample_date</w:t>
-            </w:r>
-          </w:p>
-        </w:tc>
-        <w:tc>
-          <w:tcPr>
-            <w:tcW w:w="1350" w:type="dxa"/>
-          </w:tcPr>
-          <w:p>
-            <w:pPr>
-              <w:spacing w:after="0" w:line="240" w:lineRule="auto"/>
-              <w:jc w:val="left"/>
-            </w:pPr>
-            <w:r>
-              <w:t>date</w:t>
-            </w:r>
-          </w:p>
-        </w:tc>
-        <w:tc>
-          <w:tcPr>
-            <w:tcW w:w="1656" w:type="dxa"/>
-          </w:tcPr>
-          <w:p>
-            <w:pPr>
-              <w:spacing w:after="0" w:line="240" w:lineRule="auto"/>
-              <w:jc w:val="left"/>
-            </w:pPr>
-            <w:r>
-              <w:t>Optional</w:t>
-            </w:r>
-          </w:p>
-        </w:tc>
-        <w:tc>
-          <w:tcPr>
-            <w:tcW w:w="1656" w:type="dxa"/>
-          </w:tcPr>
-          <w:p>
-            <w:pPr>
-              <w:spacing w:after="0" w:line="240" w:lineRule="auto"/>
-              <w:jc w:val="left"/>
-            </w:pPr>
-            <w:r>
-              <w:t>2026-09-06</w:t>
-            </w:r>
-          </w:p>
-        </w:tc>
-        <w:tc>
-          <w:tcPr>
-            <w:tcW w:w="2808" w:type="dxa"/>
-          </w:tcPr>
-          <w:p>
-            <w:pPr>
-              <w:spacing w:after="0" w:line="240" w:lineRule="auto"/>
-              <w:jc w:val="left"/>
-            </w:pPr>
-            <w:r>
-              <w:t>Date of the latest baseline or weekly sampling; stored as epoch milliseconds.</w:t>
-            </w:r>
-          </w:p>
-        </w:tc>
-      </w:tr>
-      <w:tr>
-        <w:tc>
-          <w:tcPr>
-            <w:tcW w:w="1458" w:type="dxa"/>
-          </w:tcPr>
-          <w:p>
-            <w:pPr>
-              <w:spacing w:after="0" w:line="240" w:lineRule="auto"/>
-              <w:jc w:val="left"/>
-            </w:pPr>
-            <w:r>
-              <w:t>sample_count</w:t>
-            </w:r>
-          </w:p>
-        </w:tc>
-        <w:tc>
-          <w:tcPr>
-            <w:tcW w:w="1350" w:type="dxa"/>
-          </w:tcPr>
-          <w:p>
-            <w:pPr>
-              <w:spacing w:after="0" w:line="240" w:lineRule="auto"/>
-              <w:jc w:val="left"/>
-            </w:pPr>
-            <w:r>
-              <w:t>int</w:t>
-            </w:r>
-          </w:p>
-        </w:tc>
-        <w:tc>
-          <w:tcPr>
-            <w:tcW w:w="1656" w:type="dxa"/>
-          </w:tcPr>
-          <w:p>
-            <w:pPr>
-              <w:spacing w:after="0" w:line="240" w:lineRule="auto"/>
-              <w:jc w:val="left"/>
-            </w:pPr>
-            <w:r>
-              <w:t>NOT NULL</w:t>
-            </w:r>
-          </w:p>
-        </w:tc>
-        <w:tc>
-          <w:tcPr>
-            <w:tcW w:w="1656" w:type="dxa"/>
-          </w:tcPr>
-          <w:p>
-            <w:pPr>
-              <w:spacing w:after="0" w:line="240" w:lineRule="auto"/>
-              <w:jc w:val="left"/>
-            </w:pPr>
-            <w:r>
-              <w:t>25</w:t>
-            </w:r>
-          </w:p>
-        </w:tc>
-        <w:tc>
-          <w:tcPr>
-            <w:tcW w:w="2808" w:type="dxa"/>
-          </w:tcPr>
-          <w:p>
-            <w:pPr>
-              <w:spacing w:after="0" w:line="240" w:lineRule="auto"/>
-              <w:jc w:val="left"/>
-            </w:pPr>
-            <w:r>
-              <w:t>Number of crayfish measured in the initial sample.</w:t>
-            </w:r>
-          </w:p>
-        </w:tc>
-      </w:tr>
-      <w:tr>
-        <w:tc>
-          <w:tcPr>
-            <w:tcW w:w="1458" w:type="dxa"/>
-          </w:tcPr>
-          <w:p>
-            <w:pPr>
-              <w:spacing w:after="0" w:line="240" w:lineRule="auto"/>
-              <w:jc w:val="left"/>
-            </w:pPr>
-            <w:r>
-              <w:t>initial_total_sample_weight</w:t>
-            </w:r>
-          </w:p>
-        </w:tc>
-        <w:tc>
-          <w:tcPr>
-            <w:tcW w:w="1350" w:type="dxa"/>
-          </w:tcPr>
-          <w:p>
-            <w:pPr>
-              <w:spacing w:after="0" w:line="240" w:lineRule="auto"/>
-              <w:jc w:val="left"/>
-            </w:pPr>
-            <w:r>
-              <w:t>decimal(10,2)</w:t>
-            </w:r>
-          </w:p>
-        </w:tc>
-        <w:tc>
-          <w:tcPr>
-            <w:tcW w:w="1656" w:type="dxa"/>
-          </w:tcPr>
-          <w:p>
-            <w:pPr>
-              <w:spacing w:after="0" w:line="240" w:lineRule="auto"/>
-              <w:jc w:val="left"/>
-            </w:pPr>
-            <w:r>
-              <w:t>NOT NULL</w:t>
-            </w:r>
-          </w:p>
-        </w:tc>
-        <w:tc>
-          <w:tcPr>
-            <w:tcW w:w="1656" w:type="dxa"/>
-          </w:tcPr>
-          <w:p>
-            <w:pPr>
-              <w:spacing w:after="0" w:line="240" w:lineRule="auto"/>
-              <w:jc w:val="left"/>
-            </w:pPr>
-            <w:r>
-              <w:t>1250.00</w:t>
-            </w:r>
-          </w:p>
-        </w:tc>
-        <w:tc>
-          <w:tcPr>
-            <w:tcW w:w="2808" w:type="dxa"/>
-          </w:tcPr>
-          <w:p>
-            <w:pPr>
-              <w:spacing w:after="0" w:line="240" w:lineRule="auto"/>
-              <w:jc w:val="left"/>
-            </w:pPr>
-            <w:r>
-              <w:t>Combined weight (g) of the initial sampled group.</w:t>
-            </w:r>
-          </w:p>
-        </w:tc>
-      </w:tr>
-      <w:tr>
-        <w:tc>
-          <w:tcPr>
-            <w:tcW w:w="1458" w:type="dxa"/>
-          </w:tcPr>
-          <w:p>
-            <w:pPr>
-              <w:spacing w:after="0" w:line="240" w:lineRule="auto"/>
-              <w:jc w:val="left"/>
-            </w:pPr>
-            <w:r>
-              <w:t>initial_total_sample_length</w:t>
-            </w:r>
-          </w:p>
-        </w:tc>
-        <w:tc>
-          <w:tcPr>
-            <w:tcW w:w="1350" w:type="dxa"/>
-          </w:tcPr>
-          <w:p>
-            <w:pPr>
-              <w:spacing w:after="0" w:line="240" w:lineRule="auto"/>
-              <w:jc w:val="left"/>
-            </w:pPr>
-            <w:r>
-              <w:t>decimal(10,2)</w:t>
-            </w:r>
-          </w:p>
-        </w:tc>
-        <w:tc>
-          <w:tcPr>
-            <w:tcW w:w="1656" w:type="dxa"/>
-          </w:tcPr>
-          <w:p>
-            <w:pPr>
-              <w:spacing w:after="0" w:line="240" w:lineRule="auto"/>
-              <w:jc w:val="left"/>
-            </w:pPr>
-            <w:r>
-              <w:t>NOT NULL</w:t>
-            </w:r>
-          </w:p>
-        </w:tc>
-        <w:tc>
-          <w:tcPr>
-            <w:tcW w:w="1656" w:type="dxa"/>
-          </w:tcPr>
-          <w:p>
-            <w:pPr>
-              <w:spacing w:after="0" w:line="240" w:lineRule="auto"/>
-              <w:jc w:val="left"/>
-            </w:pPr>
-            <w:r>
-              <w:t>450.00</w:t>
-            </w:r>
-          </w:p>
-        </w:tc>
-        <w:tc>
-          <w:tcPr>
-            <w:tcW w:w="2808" w:type="dxa"/>
-          </w:tcPr>
-          <w:p>
-            <w:pPr>
-              <w:spacing w:after="0" w:line="240" w:lineRule="auto"/>
-              <w:jc w:val="left"/>
-            </w:pPr>
-            <w:r>
-              <w:t>Combined length (cm) of the initial sampled group.</w:t>
-            </w:r>
-          </w:p>
-        </w:tc>
-      </w:tr>
-      <w:tr>
-        <w:tc>
-          <w:tcPr>
-            <w:tcW w:w="1458" w:type="dxa"/>
-          </w:tcPr>
-          <w:p>
-            <w:pPr>
-              <w:spacing w:after="0" w:line="240" w:lineRule="auto"/>
-              <w:jc w:val="left"/>
-            </w:pPr>
-            <w:r>
-              <w:t>initial_population</w:t>
-            </w:r>
-          </w:p>
-        </w:tc>
-        <w:tc>
-          <w:tcPr>
-            <w:tcW w:w="1350" w:type="dxa"/>
-          </w:tcPr>
-          <w:p>
-            <w:pPr>
-              <w:spacing w:after="0" w:line="240" w:lineRule="auto"/>
-              <w:jc w:val="left"/>
-            </w:pPr>
-            <w:r>
-              <w:t>int</w:t>
-            </w:r>
-          </w:p>
-        </w:tc>
-        <w:tc>
-          <w:tcPr>
-            <w:tcW w:w="1656" w:type="dxa"/>
-          </w:tcPr>
-          <w:p>
-            <w:pPr>
-              <w:spacing w:after="0" w:line="240" w:lineRule="auto"/>
-              <w:jc w:val="left"/>
-            </w:pPr>
-            <w:r>
-              <w:t>NOT NULL</w:t>
-            </w:r>
-          </w:p>
-        </w:tc>
-        <w:tc>
-          <w:tcPr>
-            <w:tcW w:w="1656" w:type="dxa"/>
-          </w:tcPr>
-          <w:p>
-            <w:pPr>
-              <w:spacing w:after="0" w:line="240" w:lineRule="auto"/>
-              <w:jc w:val="left"/>
-            </w:pPr>
-            <w:r>
-              <w:t>500</w:t>
-            </w:r>
-          </w:p>
-        </w:tc>
-        <w:tc>
-          <w:tcPr>
-            <w:tcW w:w="2808" w:type="dxa"/>
-          </w:tcPr>
-          <w:p>
-            <w:pPr>
-              <w:spacing w:after="0" w:line="240" w:lineRule="auto"/>
-              <w:jc w:val="left"/>
-            </w:pPr>
-            <w:r>
-              <w:t>Total stock count upon start (Day 0).</w:t>
-            </w:r>
-          </w:p>
-        </w:tc>
-      </w:tr>
-      <w:tr>
-        <w:tc>
-          <w:tcPr>
-            <w:tcW w:w="1458" w:type="dxa"/>
-          </w:tcPr>
-          <w:p>
-            <w:pPr>
-              <w:spacing w:after="0" w:line="240" w:lineRule="auto"/>
-              <w:jc w:val="left"/>
-            </w:pPr>
-            <w:r>
               <w:t>is_initialized</w:t>
             </w:r>
           </w:p>
@@ -2425,6 +2002,9 @@
         <w:jc w:val="center"/>
       </w:pPr>
       <w:r>
+        <w:rPr>
+          <w:rFonts w:ascii="Arial" w:hAnsi="Arial" w:eastAsia="Arial"/>
+        </w:rPr>
         <w:t>Table 4</w:t>
       </w:r>
     </w:p>
@@ -2912,6 +2492,9 @@
         <w:jc w:val="center"/>
       </w:pPr>
       <w:r>
+        <w:rPr>
+          <w:rFonts w:ascii="Arial" w:hAnsi="Arial" w:eastAsia="Arial"/>
+        </w:rPr>
         <w:t>Table 5</w:t>
       </w:r>
     </w:p>
@@ -3543,6 +3126,9 @@
         <w:jc w:val="center"/>
       </w:pPr>
       <w:r>
+        <w:rPr>
+          <w:rFonts w:ascii="Arial" w:hAnsi="Arial" w:eastAsia="Arial"/>
+        </w:rPr>
         <w:t>Table 6</w:t>
       </w:r>
     </w:p>
@@ -4177,6 +3763,9 @@
         <w:jc w:val="center"/>
       </w:pPr>
       <w:r>
+        <w:rPr>
+          <w:rFonts w:ascii="Arial" w:hAnsi="Arial" w:eastAsia="Arial"/>
+        </w:rPr>
         <w:t>Table 7</w:t>
       </w:r>
     </w:p>
@@ -5835,6 +5424,9 @@
         <w:jc w:val="center"/>
       </w:pPr>
       <w:r>
+        <w:rPr>
+          <w:rFonts w:ascii="Arial" w:hAnsi="Arial" w:eastAsia="Arial"/>
+        </w:rPr>
         <w:t>Table 8</w:t>
       </w:r>
     </w:p>
@@ -6757,15 +6349,7 @@
       </w:tr>
     </w:tbl>
     <w:p/>
-    <w:p>
-      <w:pPr>
-        <w:keepNext/>
-        <w:jc w:val="center"/>
-      </w:pPr>
-      <w:r>
-        <w:t>Table 9</w:t>
-      </w:r>
-    </w:p>
+    <w:p/>
     <w:p>
       <w:pPr>
         <w:keepNext/>
@@ -6773,2515 +6357,9 @@
       </w:pPr>
       <w:r>
         <w:rPr>
-          <w:b/>
+          <w:rFonts w:ascii="Arial" w:hAnsi="Arial" w:eastAsia="Arial"/>
         </w:rPr>
-        <w:t>sensor_daily_summaries Table</w:t>
-      </w:r>
-    </w:p>
-    <w:tbl>
-      <w:tblPr>
-        <w:tblStyle w:val="TableGrid"/>
-        <w:tblW w:w="8928" w:type="dxa"/>
-        <w:tblLayout w:type="fixed"/>
-        <w:tblLook w:val="04A0" w:firstRow="1" w:lastRow="0" w:firstColumn="1" w:lastColumn="0" w:noHBand="0" w:noVBand="1"/>
-      </w:tblPr>
-      <w:tblGrid>
-        <w:gridCol w:w="1458"/>
-        <w:gridCol w:w="1350"/>
-        <w:gridCol w:w="1656"/>
-        <w:gridCol w:w="1656"/>
-        <w:gridCol w:w="2808"/>
-      </w:tblGrid>
-      <w:tr>
-        <w:trPr>
-          <w:tblHeader/>
-        </w:trPr>
-        <w:tc>
-          <w:tcPr>
-            <w:tcW w:w="1458" w:type="dxa"/>
-          </w:tcPr>
-          <w:p>
-            <w:pPr>
-              <w:spacing w:after="0" w:line="240" w:lineRule="auto"/>
-              <w:jc w:val="left"/>
-            </w:pPr>
-            <w:r>
-              <w:rPr>
-                <w:b/>
-              </w:rPr>
-              <w:t>Field Name</w:t>
-            </w:r>
-          </w:p>
-        </w:tc>
-        <w:tc>
-          <w:tcPr>
-            <w:tcW w:w="1350" w:type="dxa"/>
-          </w:tcPr>
-          <w:p>
-            <w:pPr>
-              <w:spacing w:after="0" w:line="240" w:lineRule="auto"/>
-              <w:jc w:val="left"/>
-            </w:pPr>
-            <w:r>
-              <w:rPr>
-                <w:b/>
-              </w:rPr>
-              <w:t>Data Type</w:t>
-            </w:r>
-          </w:p>
-        </w:tc>
-        <w:tc>
-          <w:tcPr>
-            <w:tcW w:w="1656" w:type="dxa"/>
-          </w:tcPr>
-          <w:p>
-            <w:pPr>
-              <w:spacing w:after="0" w:line="240" w:lineRule="auto"/>
-              <w:jc w:val="left"/>
-            </w:pPr>
-            <w:r>
-              <w:rPr>
-                <w:b/>
-              </w:rPr>
-              <w:t>Constraint</w:t>
-            </w:r>
-          </w:p>
-        </w:tc>
-        <w:tc>
-          <w:tcPr>
-            <w:tcW w:w="1656" w:type="dxa"/>
-          </w:tcPr>
-          <w:p>
-            <w:pPr>
-              <w:spacing w:after="0" w:line="240" w:lineRule="auto"/>
-              <w:jc w:val="left"/>
-            </w:pPr>
-            <w:r>
-              <w:rPr>
-                <w:b/>
-              </w:rPr>
-              <w:t>Format</w:t>
-            </w:r>
-          </w:p>
-        </w:tc>
-        <w:tc>
-          <w:tcPr>
-            <w:tcW w:w="2808" w:type="dxa"/>
-          </w:tcPr>
-          <w:p>
-            <w:pPr>
-              <w:spacing w:after="0" w:line="240" w:lineRule="auto"/>
-              <w:jc w:val="left"/>
-            </w:pPr>
-            <w:r>
-              <w:rPr>
-                <w:b/>
-              </w:rPr>
-              <w:t>Description</w:t>
-            </w:r>
-          </w:p>
-        </w:tc>
-      </w:tr>
-      <w:tr>
-        <w:tc>
-          <w:tcPr>
-            <w:tcW w:w="1458" w:type="dxa"/>
-          </w:tcPr>
-          <w:p>
-            <w:pPr>
-              <w:spacing w:after="0" w:line="240" w:lineRule="auto"/>
-              <w:jc w:val="left"/>
-            </w:pPr>
-            <w:r>
-              <w:t>tank_id</w:t>
-            </w:r>
-          </w:p>
-        </w:tc>
-        <w:tc>
-          <w:tcPr>
-            <w:tcW w:w="1350" w:type="dxa"/>
-          </w:tcPr>
-          <w:p>
-            <w:pPr>
-              <w:spacing w:after="0" w:line="240" w:lineRule="auto"/>
-              <w:jc w:val="left"/>
-            </w:pPr>
-            <w:r>
-              <w:t>varchar</w:t>
-            </w:r>
-          </w:p>
-        </w:tc>
-        <w:tc>
-          <w:tcPr>
-            <w:tcW w:w="1656" w:type="dxa"/>
-          </w:tcPr>
-          <w:p>
-            <w:pPr>
-              <w:spacing w:after="0" w:line="240" w:lineRule="auto"/>
-              <w:jc w:val="left"/>
-            </w:pPr>
-            <w:r>
-              <w:t>Composite PRIMARY KEY; FOREIGN KEY; NOT NULL</w:t>
-            </w:r>
-          </w:p>
-        </w:tc>
-        <w:tc>
-          <w:tcPr>
-            <w:tcW w:w="1656" w:type="dxa"/>
-          </w:tcPr>
-          <w:p>
-            <w:pPr>
-              <w:spacing w:after="0" w:line="240" w:lineRule="auto"/>
-              <w:jc w:val="left"/>
-            </w:pPr>
-            <w:r>
-              <w:t>tank_001</w:t>
-            </w:r>
-          </w:p>
-        </w:tc>
-        <w:tc>
-          <w:tcPr>
-            <w:tcW w:w="2808" w:type="dxa"/>
-          </w:tcPr>
-          <w:p>
-            <w:pPr>
-              <w:spacing w:after="0" w:line="240" w:lineRule="auto"/>
-              <w:jc w:val="left"/>
-            </w:pPr>
-            <w:r>
-              <w:t>Identifier of the tank record.</w:t>
-            </w:r>
-          </w:p>
-        </w:tc>
-      </w:tr>
-      <w:tr>
-        <w:tc>
-          <w:tcPr>
-            <w:tcW w:w="1458" w:type="dxa"/>
-          </w:tcPr>
-          <w:p>
-            <w:pPr>
-              <w:spacing w:after="0" w:line="240" w:lineRule="auto"/>
-              <w:jc w:val="left"/>
-            </w:pPr>
-            <w:r>
-              <w:t>date_key</w:t>
-            </w:r>
-          </w:p>
-        </w:tc>
-        <w:tc>
-          <w:tcPr>
-            <w:tcW w:w="1350" w:type="dxa"/>
-          </w:tcPr>
-          <w:p>
-            <w:pPr>
-              <w:spacing w:after="0" w:line="240" w:lineRule="auto"/>
-              <w:jc w:val="left"/>
-            </w:pPr>
-            <w:r>
-              <w:t>varchar</w:t>
-            </w:r>
-          </w:p>
-        </w:tc>
-        <w:tc>
-          <w:tcPr>
-            <w:tcW w:w="1656" w:type="dxa"/>
-          </w:tcPr>
-          <w:p>
-            <w:pPr>
-              <w:spacing w:after="0" w:line="240" w:lineRule="auto"/>
-              <w:jc w:val="left"/>
-            </w:pPr>
-            <w:r>
-              <w:t>Composite PRIMARY KEY; NOT NULL</w:t>
-            </w:r>
-          </w:p>
-        </w:tc>
-        <w:tc>
-          <w:tcPr>
-            <w:tcW w:w="1656" w:type="dxa"/>
-          </w:tcPr>
-          <w:p>
-            <w:pPr>
-              <w:spacing w:after="0" w:line="240" w:lineRule="auto"/>
-              <w:jc w:val="left"/>
-            </w:pPr>
-            <w:r>
-              <w:t>2026-09-06</w:t>
-            </w:r>
-          </w:p>
-        </w:tc>
-        <w:tc>
-          <w:tcPr>
-            <w:tcW w:w="2808" w:type="dxa"/>
-          </w:tcPr>
-          <w:p>
-            <w:pPr>
-              <w:spacing w:after="0" w:line="240" w:lineRule="auto"/>
-              <w:jc w:val="left"/>
-            </w:pPr>
-            <w:r>
-              <w:t>Calendar key represented by this daily record.</w:t>
-            </w:r>
-          </w:p>
-        </w:tc>
-      </w:tr>
-      <w:tr>
-        <w:tc>
-          <w:tcPr>
-            <w:tcW w:w="1458" w:type="dxa"/>
-          </w:tcPr>
-          <w:p>
-            <w:pPr>
-              <w:spacing w:after="0" w:line="240" w:lineRule="auto"/>
-              <w:jc w:val="left"/>
-            </w:pPr>
-            <w:r>
-              <w:t>sample_count</w:t>
-            </w:r>
-          </w:p>
-        </w:tc>
-        <w:tc>
-          <w:tcPr>
-            <w:tcW w:w="1350" w:type="dxa"/>
-          </w:tcPr>
-          <w:p>
-            <w:pPr>
-              <w:spacing w:after="0" w:line="240" w:lineRule="auto"/>
-              <w:jc w:val="left"/>
-            </w:pPr>
-            <w:r>
-              <w:t>int</w:t>
-            </w:r>
-          </w:p>
-        </w:tc>
-        <w:tc>
-          <w:tcPr>
-            <w:tcW w:w="1656" w:type="dxa"/>
-          </w:tcPr>
-          <w:p>
-            <w:pPr>
-              <w:spacing w:after="0" w:line="240" w:lineRule="auto"/>
-              <w:jc w:val="left"/>
-            </w:pPr>
-            <w:r>
-              <w:t>NOT NULL</w:t>
-            </w:r>
-          </w:p>
-        </w:tc>
-        <w:tc>
-          <w:tcPr>
-            <w:tcW w:w="1656" w:type="dxa"/>
-          </w:tcPr>
-          <w:p>
-            <w:pPr>
-              <w:spacing w:after="0" w:line="240" w:lineRule="auto"/>
-              <w:jc w:val="left"/>
-            </w:pPr>
-            <w:r>
-              <w:t>144</w:t>
-            </w:r>
-          </w:p>
-        </w:tc>
-        <w:tc>
-          <w:tcPr>
-            <w:tcW w:w="2808" w:type="dxa"/>
-          </w:tcPr>
-          <w:p>
-            <w:pPr>
-              <w:spacing w:after="0" w:line="240" w:lineRule="auto"/>
-              <w:jc w:val="left"/>
-            </w:pPr>
-            <w:r>
-              <w:t>Number of sensor history entries included in the daily summary.</w:t>
-            </w:r>
-          </w:p>
-        </w:tc>
-      </w:tr>
-      <w:tr>
-        <w:tc>
-          <w:tcPr>
-            <w:tcW w:w="1458" w:type="dxa"/>
-          </w:tcPr>
-          <w:p>
-            <w:pPr>
-              <w:spacing w:after="0" w:line="240" w:lineRule="auto"/>
-              <w:jc w:val="left"/>
-            </w:pPr>
-            <w:r>
-              <w:t>temp_min</w:t>
-            </w:r>
-          </w:p>
-        </w:tc>
-        <w:tc>
-          <w:tcPr>
-            <w:tcW w:w="1350" w:type="dxa"/>
-          </w:tcPr>
-          <w:p>
-            <w:pPr>
-              <w:spacing w:after="0" w:line="240" w:lineRule="auto"/>
-              <w:jc w:val="left"/>
-            </w:pPr>
-            <w:r>
-              <w:t>decimal(6,2)</w:t>
-            </w:r>
-          </w:p>
-        </w:tc>
-        <w:tc>
-          <w:tcPr>
-            <w:tcW w:w="1656" w:type="dxa"/>
-          </w:tcPr>
-          <w:p>
-            <w:pPr>
-              <w:spacing w:after="0" w:line="240" w:lineRule="auto"/>
-              <w:jc w:val="left"/>
-            </w:pPr>
-            <w:r>
-              <w:t>Optional</w:t>
-            </w:r>
-          </w:p>
-        </w:tc>
-        <w:tc>
-          <w:tcPr>
-            <w:tcW w:w="1656" w:type="dxa"/>
-          </w:tcPr>
-          <w:p>
-            <w:pPr>
-              <w:spacing w:after="0" w:line="240" w:lineRule="auto"/>
-              <w:jc w:val="left"/>
-            </w:pPr>
-            <w:r>
-              <w:t>27</w:t>
-            </w:r>
-          </w:p>
-        </w:tc>
-        <w:tc>
-          <w:tcPr>
-            <w:tcW w:w="2808" w:type="dxa"/>
-          </w:tcPr>
-          <w:p>
-            <w:pPr>
-              <w:spacing w:after="0" w:line="240" w:lineRule="auto"/>
-              <w:jc w:val="left"/>
-            </w:pPr>
-            <w:r>
-              <w:t>Minimum temperature in degrees Celsius for the calendar day.</w:t>
-            </w:r>
-          </w:p>
-        </w:tc>
-      </w:tr>
-      <w:tr>
-        <w:tc>
-          <w:tcPr>
-            <w:tcW w:w="1458" w:type="dxa"/>
-          </w:tcPr>
-          <w:p>
-            <w:pPr>
-              <w:spacing w:after="0" w:line="240" w:lineRule="auto"/>
-              <w:jc w:val="left"/>
-            </w:pPr>
-            <w:r>
-              <w:t>temp_max</w:t>
-            </w:r>
-          </w:p>
-        </w:tc>
-        <w:tc>
-          <w:tcPr>
-            <w:tcW w:w="1350" w:type="dxa"/>
-          </w:tcPr>
-          <w:p>
-            <w:pPr>
-              <w:spacing w:after="0" w:line="240" w:lineRule="auto"/>
-              <w:jc w:val="left"/>
-            </w:pPr>
-            <w:r>
-              <w:t>decimal(6,2)</w:t>
-            </w:r>
-          </w:p>
-        </w:tc>
-        <w:tc>
-          <w:tcPr>
-            <w:tcW w:w="1656" w:type="dxa"/>
-          </w:tcPr>
-          <w:p>
-            <w:pPr>
-              <w:spacing w:after="0" w:line="240" w:lineRule="auto"/>
-              <w:jc w:val="left"/>
-            </w:pPr>
-            <w:r>
-              <w:t>Optional</w:t>
-            </w:r>
-          </w:p>
-        </w:tc>
-        <w:tc>
-          <w:tcPr>
-            <w:tcW w:w="1656" w:type="dxa"/>
-          </w:tcPr>
-          <w:p>
-            <w:pPr>
-              <w:spacing w:after="0" w:line="240" w:lineRule="auto"/>
-              <w:jc w:val="left"/>
-            </w:pPr>
-            <w:r>
-              <w:t>28</w:t>
-            </w:r>
-          </w:p>
-        </w:tc>
-        <w:tc>
-          <w:tcPr>
-            <w:tcW w:w="2808" w:type="dxa"/>
-          </w:tcPr>
-          <w:p>
-            <w:pPr>
-              <w:spacing w:after="0" w:line="240" w:lineRule="auto"/>
-              <w:jc w:val="left"/>
-            </w:pPr>
-            <w:r>
-              <w:t>Maximum temperature in degrees Celsius for the calendar day.</w:t>
-            </w:r>
-          </w:p>
-        </w:tc>
-      </w:tr>
-      <w:tr>
-        <w:tc>
-          <w:tcPr>
-            <w:tcW w:w="1458" w:type="dxa"/>
-          </w:tcPr>
-          <w:p>
-            <w:pPr>
-              <w:spacing w:after="0" w:line="240" w:lineRule="auto"/>
-              <w:jc w:val="left"/>
-            </w:pPr>
-            <w:r>
-              <w:t>temp_avg</w:t>
-            </w:r>
-          </w:p>
-        </w:tc>
-        <w:tc>
-          <w:tcPr>
-            <w:tcW w:w="1350" w:type="dxa"/>
-          </w:tcPr>
-          <w:p>
-            <w:pPr>
-              <w:spacing w:after="0" w:line="240" w:lineRule="auto"/>
-              <w:jc w:val="left"/>
-            </w:pPr>
-            <w:r>
-              <w:t>decimal(6,2)</w:t>
-            </w:r>
-          </w:p>
-        </w:tc>
-        <w:tc>
-          <w:tcPr>
-            <w:tcW w:w="1656" w:type="dxa"/>
-          </w:tcPr>
-          <w:p>
-            <w:pPr>
-              <w:spacing w:after="0" w:line="240" w:lineRule="auto"/>
-              <w:jc w:val="left"/>
-            </w:pPr>
-            <w:r>
-              <w:t>Optional</w:t>
-            </w:r>
-          </w:p>
-        </w:tc>
-        <w:tc>
-          <w:tcPr>
-            <w:tcW w:w="1656" w:type="dxa"/>
-          </w:tcPr>
-          <w:p>
-            <w:pPr>
-              <w:spacing w:after="0" w:line="240" w:lineRule="auto"/>
-              <w:jc w:val="left"/>
-            </w:pPr>
-            <w:r>
-              <w:t>27</w:t>
-            </w:r>
-          </w:p>
-        </w:tc>
-        <w:tc>
-          <w:tcPr>
-            <w:tcW w:w="2808" w:type="dxa"/>
-          </w:tcPr>
-          <w:p>
-            <w:pPr>
-              <w:spacing w:after="0" w:line="240" w:lineRule="auto"/>
-              <w:jc w:val="left"/>
-            </w:pPr>
-            <w:r>
-              <w:t>Mean temperature in degrees Celsius for the calendar day.</w:t>
-            </w:r>
-          </w:p>
-        </w:tc>
-      </w:tr>
-      <w:tr>
-        <w:tc>
-          <w:tcPr>
-            <w:tcW w:w="1458" w:type="dxa"/>
-          </w:tcPr>
-          <w:p>
-            <w:pPr>
-              <w:spacing w:after="0" w:line="240" w:lineRule="auto"/>
-              <w:jc w:val="left"/>
-            </w:pPr>
-            <w:r>
-              <w:t>temp_count</w:t>
-            </w:r>
-          </w:p>
-        </w:tc>
-        <w:tc>
-          <w:tcPr>
-            <w:tcW w:w="1350" w:type="dxa"/>
-          </w:tcPr>
-          <w:p>
-            <w:pPr>
-              <w:spacing w:after="0" w:line="240" w:lineRule="auto"/>
-              <w:jc w:val="left"/>
-            </w:pPr>
-            <w:r>
-              <w:t>int</w:t>
-            </w:r>
-          </w:p>
-        </w:tc>
-        <w:tc>
-          <w:tcPr>
-            <w:tcW w:w="1656" w:type="dxa"/>
-          </w:tcPr>
-          <w:p>
-            <w:pPr>
-              <w:spacing w:after="0" w:line="240" w:lineRule="auto"/>
-              <w:jc w:val="left"/>
-            </w:pPr>
-            <w:r>
-              <w:t>Optional</w:t>
-            </w:r>
-          </w:p>
-        </w:tc>
-        <w:tc>
-          <w:tcPr>
-            <w:tcW w:w="1656" w:type="dxa"/>
-          </w:tcPr>
-          <w:p>
-            <w:pPr>
-              <w:spacing w:after="0" w:line="240" w:lineRule="auto"/>
-              <w:jc w:val="left"/>
-            </w:pPr>
-            <w:r>
-              <w:t>0</w:t>
-            </w:r>
-          </w:p>
-        </w:tc>
-        <w:tc>
-          <w:tcPr>
-            <w:tcW w:w="2808" w:type="dxa"/>
-          </w:tcPr>
-          <w:p>
-            <w:pPr>
-              <w:spacing w:after="0" w:line="240" w:lineRule="auto"/>
-              <w:jc w:val="left"/>
-            </w:pPr>
-            <w:r>
-              <w:t>Number of history entries contributing to the sum and mean.</w:t>
-            </w:r>
-          </w:p>
-        </w:tc>
-      </w:tr>
-      <w:tr>
-        <w:tc>
-          <w:tcPr>
-            <w:tcW w:w="1458" w:type="dxa"/>
-          </w:tcPr>
-          <w:p>
-            <w:pPr>
-              <w:spacing w:after="0" w:line="240" w:lineRule="auto"/>
-              <w:jc w:val="left"/>
-            </w:pPr>
-            <w:r>
-              <w:t>temp_sum</w:t>
-            </w:r>
-          </w:p>
-        </w:tc>
-        <w:tc>
-          <w:tcPr>
-            <w:tcW w:w="1350" w:type="dxa"/>
-          </w:tcPr>
-          <w:p>
-            <w:pPr>
-              <w:spacing w:after="0" w:line="240" w:lineRule="auto"/>
-              <w:jc w:val="left"/>
-            </w:pPr>
-            <w:r>
-              <w:t>decimal(10,2)</w:t>
-            </w:r>
-          </w:p>
-        </w:tc>
-        <w:tc>
-          <w:tcPr>
-            <w:tcW w:w="1656" w:type="dxa"/>
-          </w:tcPr>
-          <w:p>
-            <w:pPr>
-              <w:spacing w:after="0" w:line="240" w:lineRule="auto"/>
-              <w:jc w:val="left"/>
-            </w:pPr>
-            <w:r>
-              <w:t>Optional</w:t>
-            </w:r>
-          </w:p>
-        </w:tc>
-        <w:tc>
-          <w:tcPr>
-            <w:tcW w:w="1656" w:type="dxa"/>
-          </w:tcPr>
-          <w:p>
-            <w:pPr>
-              <w:spacing w:after="0" w:line="240" w:lineRule="auto"/>
-              <w:jc w:val="left"/>
-            </w:pPr>
-            <w:r>
-              <w:t>0.00</w:t>
-            </w:r>
-          </w:p>
-        </w:tc>
-        <w:tc>
-          <w:tcPr>
-            <w:tcW w:w="2808" w:type="dxa"/>
-          </w:tcPr>
-          <w:p>
-            <w:pPr>
-              <w:spacing w:after="0" w:line="240" w:lineRule="auto"/>
-              <w:jc w:val="left"/>
-            </w:pPr>
-            <w:r>
-              <w:t>Sum of per-window average values; combined with count to recompute the overall mean.</w:t>
-            </w:r>
-          </w:p>
-        </w:tc>
-      </w:tr>
-      <w:tr>
-        <w:tc>
-          <w:tcPr>
-            <w:tcW w:w="1458" w:type="dxa"/>
-          </w:tcPr>
-          <w:p>
-            <w:pPr>
-              <w:spacing w:after="0" w:line="240" w:lineRule="auto"/>
-              <w:jc w:val="left"/>
-            </w:pPr>
-            <w:r>
-              <w:t>pH_min</w:t>
-            </w:r>
-          </w:p>
-        </w:tc>
-        <w:tc>
-          <w:tcPr>
-            <w:tcW w:w="1350" w:type="dxa"/>
-          </w:tcPr>
-          <w:p>
-            <w:pPr>
-              <w:spacing w:after="0" w:line="240" w:lineRule="auto"/>
-              <w:jc w:val="left"/>
-            </w:pPr>
-            <w:r>
-              <w:t>decimal(5,2)</w:t>
-            </w:r>
-          </w:p>
-        </w:tc>
-        <w:tc>
-          <w:tcPr>
-            <w:tcW w:w="1656" w:type="dxa"/>
-          </w:tcPr>
-          <w:p>
-            <w:pPr>
-              <w:spacing w:after="0" w:line="240" w:lineRule="auto"/>
-              <w:jc w:val="left"/>
-            </w:pPr>
-            <w:r>
-              <w:t>Optional</w:t>
-            </w:r>
-          </w:p>
-        </w:tc>
-        <w:tc>
-          <w:tcPr>
-            <w:tcW w:w="1656" w:type="dxa"/>
-          </w:tcPr>
-          <w:p>
-            <w:pPr>
-              <w:spacing w:after="0" w:line="240" w:lineRule="auto"/>
-              <w:jc w:val="left"/>
-            </w:pPr>
-            <w:r>
-              <w:t>7</w:t>
-            </w:r>
-          </w:p>
-        </w:tc>
-        <w:tc>
-          <w:tcPr>
-            <w:tcW w:w="2808" w:type="dxa"/>
-          </w:tcPr>
-          <w:p>
-            <w:pPr>
-              <w:spacing w:after="0" w:line="240" w:lineRule="auto"/>
-              <w:jc w:val="left"/>
-            </w:pPr>
-            <w:r>
-              <w:t>Minimum pH for the calendar day.</w:t>
-            </w:r>
-          </w:p>
-        </w:tc>
-      </w:tr>
-      <w:tr>
-        <w:tc>
-          <w:tcPr>
-            <w:tcW w:w="1458" w:type="dxa"/>
-          </w:tcPr>
-          <w:p>
-            <w:pPr>
-              <w:spacing w:after="0" w:line="240" w:lineRule="auto"/>
-              <w:jc w:val="left"/>
-            </w:pPr>
-            <w:r>
-              <w:t>pH_max</w:t>
-            </w:r>
-          </w:p>
-        </w:tc>
-        <w:tc>
-          <w:tcPr>
-            <w:tcW w:w="1350" w:type="dxa"/>
-          </w:tcPr>
-          <w:p>
-            <w:pPr>
-              <w:spacing w:after="0" w:line="240" w:lineRule="auto"/>
-              <w:jc w:val="left"/>
-            </w:pPr>
-            <w:r>
-              <w:t>decimal(5,2)</w:t>
-            </w:r>
-          </w:p>
-        </w:tc>
-        <w:tc>
-          <w:tcPr>
-            <w:tcW w:w="1656" w:type="dxa"/>
-          </w:tcPr>
-          <w:p>
-            <w:pPr>
-              <w:spacing w:after="0" w:line="240" w:lineRule="auto"/>
-              <w:jc w:val="left"/>
-            </w:pPr>
-            <w:r>
-              <w:t>Optional</w:t>
-            </w:r>
-          </w:p>
-        </w:tc>
-        <w:tc>
-          <w:tcPr>
-            <w:tcW w:w="1656" w:type="dxa"/>
-          </w:tcPr>
-          <w:p>
-            <w:pPr>
-              <w:spacing w:after="0" w:line="240" w:lineRule="auto"/>
-              <w:jc w:val="left"/>
-            </w:pPr>
-            <w:r>
-              <w:t>8</w:t>
-            </w:r>
-          </w:p>
-        </w:tc>
-        <w:tc>
-          <w:tcPr>
-            <w:tcW w:w="2808" w:type="dxa"/>
-          </w:tcPr>
-          <w:p>
-            <w:pPr>
-              <w:spacing w:after="0" w:line="240" w:lineRule="auto"/>
-              <w:jc w:val="left"/>
-            </w:pPr>
-            <w:r>
-              <w:t>Maximum pH for the calendar day.</w:t>
-            </w:r>
-          </w:p>
-        </w:tc>
-      </w:tr>
-      <w:tr>
-        <w:tc>
-          <w:tcPr>
-            <w:tcW w:w="1458" w:type="dxa"/>
-          </w:tcPr>
-          <w:p>
-            <w:pPr>
-              <w:spacing w:after="0" w:line="240" w:lineRule="auto"/>
-              <w:jc w:val="left"/>
-            </w:pPr>
-            <w:r>
-              <w:t>pH_avg</w:t>
-            </w:r>
-          </w:p>
-        </w:tc>
-        <w:tc>
-          <w:tcPr>
-            <w:tcW w:w="1350" w:type="dxa"/>
-          </w:tcPr>
-          <w:p>
-            <w:pPr>
-              <w:spacing w:after="0" w:line="240" w:lineRule="auto"/>
-              <w:jc w:val="left"/>
-            </w:pPr>
-            <w:r>
-              <w:t>decimal(5,2)</w:t>
-            </w:r>
-          </w:p>
-        </w:tc>
-        <w:tc>
-          <w:tcPr>
-            <w:tcW w:w="1656" w:type="dxa"/>
-          </w:tcPr>
-          <w:p>
-            <w:pPr>
-              <w:spacing w:after="0" w:line="240" w:lineRule="auto"/>
-              <w:jc w:val="left"/>
-            </w:pPr>
-            <w:r>
-              <w:t>Optional</w:t>
-            </w:r>
-          </w:p>
-        </w:tc>
-        <w:tc>
-          <w:tcPr>
-            <w:tcW w:w="1656" w:type="dxa"/>
-          </w:tcPr>
-          <w:p>
-            <w:pPr>
-              <w:spacing w:after="0" w:line="240" w:lineRule="auto"/>
-              <w:jc w:val="left"/>
-            </w:pPr>
-            <w:r>
-              <w:t>7</w:t>
-            </w:r>
-          </w:p>
-        </w:tc>
-        <w:tc>
-          <w:tcPr>
-            <w:tcW w:w="2808" w:type="dxa"/>
-          </w:tcPr>
-          <w:p>
-            <w:pPr>
-              <w:spacing w:after="0" w:line="240" w:lineRule="auto"/>
-              <w:jc w:val="left"/>
-            </w:pPr>
-            <w:r>
-              <w:t>Mean pH for the calendar day.</w:t>
-            </w:r>
-          </w:p>
-        </w:tc>
-      </w:tr>
-      <w:tr>
-        <w:tc>
-          <w:tcPr>
-            <w:tcW w:w="1458" w:type="dxa"/>
-          </w:tcPr>
-          <w:p>
-            <w:pPr>
-              <w:spacing w:after="0" w:line="240" w:lineRule="auto"/>
-              <w:jc w:val="left"/>
-            </w:pPr>
-            <w:r>
-              <w:t>pH_count</w:t>
-            </w:r>
-          </w:p>
-        </w:tc>
-        <w:tc>
-          <w:tcPr>
-            <w:tcW w:w="1350" w:type="dxa"/>
-          </w:tcPr>
-          <w:p>
-            <w:pPr>
-              <w:spacing w:after="0" w:line="240" w:lineRule="auto"/>
-              <w:jc w:val="left"/>
-            </w:pPr>
-            <w:r>
-              <w:t>int</w:t>
-            </w:r>
-          </w:p>
-        </w:tc>
-        <w:tc>
-          <w:tcPr>
-            <w:tcW w:w="1656" w:type="dxa"/>
-          </w:tcPr>
-          <w:p>
-            <w:pPr>
-              <w:spacing w:after="0" w:line="240" w:lineRule="auto"/>
-              <w:jc w:val="left"/>
-            </w:pPr>
-            <w:r>
-              <w:t>Optional</w:t>
-            </w:r>
-          </w:p>
-        </w:tc>
-        <w:tc>
-          <w:tcPr>
-            <w:tcW w:w="1656" w:type="dxa"/>
-          </w:tcPr>
-          <w:p>
-            <w:pPr>
-              <w:spacing w:after="0" w:line="240" w:lineRule="auto"/>
-              <w:jc w:val="left"/>
-            </w:pPr>
-            <w:r>
-              <w:t>0</w:t>
-            </w:r>
-          </w:p>
-        </w:tc>
-        <w:tc>
-          <w:tcPr>
-            <w:tcW w:w="2808" w:type="dxa"/>
-          </w:tcPr>
-          <w:p>
-            <w:pPr>
-              <w:spacing w:after="0" w:line="240" w:lineRule="auto"/>
-              <w:jc w:val="left"/>
-            </w:pPr>
-            <w:r>
-              <w:t>Number of history entries contributing to the sum and mean.</w:t>
-            </w:r>
-          </w:p>
-        </w:tc>
-      </w:tr>
-      <w:tr>
-        <w:tc>
-          <w:tcPr>
-            <w:tcW w:w="1458" w:type="dxa"/>
-          </w:tcPr>
-          <w:p>
-            <w:pPr>
-              <w:spacing w:after="0" w:line="240" w:lineRule="auto"/>
-              <w:jc w:val="left"/>
-            </w:pPr>
-            <w:r>
-              <w:t>pH_sum</w:t>
-            </w:r>
-          </w:p>
-        </w:tc>
-        <w:tc>
-          <w:tcPr>
-            <w:tcW w:w="1350" w:type="dxa"/>
-          </w:tcPr>
-          <w:p>
-            <w:pPr>
-              <w:spacing w:after="0" w:line="240" w:lineRule="auto"/>
-              <w:jc w:val="left"/>
-            </w:pPr>
-            <w:r>
-              <w:t>decimal(8,2)</w:t>
-            </w:r>
-          </w:p>
-        </w:tc>
-        <w:tc>
-          <w:tcPr>
-            <w:tcW w:w="1656" w:type="dxa"/>
-          </w:tcPr>
-          <w:p>
-            <w:pPr>
-              <w:spacing w:after="0" w:line="240" w:lineRule="auto"/>
-              <w:jc w:val="left"/>
-            </w:pPr>
-            <w:r>
-              <w:t>Optional</w:t>
-            </w:r>
-          </w:p>
-        </w:tc>
-        <w:tc>
-          <w:tcPr>
-            <w:tcW w:w="1656" w:type="dxa"/>
-          </w:tcPr>
-          <w:p>
-            <w:pPr>
-              <w:spacing w:after="0" w:line="240" w:lineRule="auto"/>
-              <w:jc w:val="left"/>
-            </w:pPr>
-            <w:r>
-              <w:t>0.00</w:t>
-            </w:r>
-          </w:p>
-        </w:tc>
-        <w:tc>
-          <w:tcPr>
-            <w:tcW w:w="2808" w:type="dxa"/>
-          </w:tcPr>
-          <w:p>
-            <w:pPr>
-              <w:spacing w:after="0" w:line="240" w:lineRule="auto"/>
-              <w:jc w:val="left"/>
-            </w:pPr>
-            <w:r>
-              <w:t>Sum of per-window average values; combined with count to recompute the overall mean.</w:t>
-            </w:r>
-          </w:p>
-        </w:tc>
-      </w:tr>
-      <w:tr>
-        <w:tc>
-          <w:tcPr>
-            <w:tcW w:w="1458" w:type="dxa"/>
-          </w:tcPr>
-          <w:p>
-            <w:pPr>
-              <w:spacing w:after="0" w:line="240" w:lineRule="auto"/>
-              <w:jc w:val="left"/>
-            </w:pPr>
-            <w:r>
-              <w:t>DO_min</w:t>
-            </w:r>
-          </w:p>
-        </w:tc>
-        <w:tc>
-          <w:tcPr>
-            <w:tcW w:w="1350" w:type="dxa"/>
-          </w:tcPr>
-          <w:p>
-            <w:pPr>
-              <w:spacing w:after="0" w:line="240" w:lineRule="auto"/>
-              <w:jc w:val="left"/>
-            </w:pPr>
-            <w:r>
-              <w:t>decimal(5,2)</w:t>
-            </w:r>
-          </w:p>
-        </w:tc>
-        <w:tc>
-          <w:tcPr>
-            <w:tcW w:w="1656" w:type="dxa"/>
-          </w:tcPr>
-          <w:p>
-            <w:pPr>
-              <w:spacing w:after="0" w:line="240" w:lineRule="auto"/>
-              <w:jc w:val="left"/>
-            </w:pPr>
-            <w:r>
-              <w:t>Optional</w:t>
-            </w:r>
-          </w:p>
-        </w:tc>
-        <w:tc>
-          <w:tcPr>
-            <w:tcW w:w="1656" w:type="dxa"/>
-          </w:tcPr>
-          <w:p>
-            <w:pPr>
-              <w:spacing w:after="0" w:line="240" w:lineRule="auto"/>
-              <w:jc w:val="left"/>
-            </w:pPr>
-            <w:r>
-              <w:t>5</w:t>
-            </w:r>
-          </w:p>
-        </w:tc>
-        <w:tc>
-          <w:tcPr>
-            <w:tcW w:w="2808" w:type="dxa"/>
-          </w:tcPr>
-          <w:p>
-            <w:pPr>
-              <w:spacing w:after="0" w:line="240" w:lineRule="auto"/>
-              <w:jc w:val="left"/>
-            </w:pPr>
-            <w:r>
-              <w:t>Minimum dissolved oxygen in mg/L for the calendar day.</w:t>
-            </w:r>
-          </w:p>
-        </w:tc>
-      </w:tr>
-      <w:tr>
-        <w:tc>
-          <w:tcPr>
-            <w:tcW w:w="1458" w:type="dxa"/>
-          </w:tcPr>
-          <w:p>
-            <w:pPr>
-              <w:spacing w:after="0" w:line="240" w:lineRule="auto"/>
-              <w:jc w:val="left"/>
-            </w:pPr>
-            <w:r>
-              <w:t>DO_max</w:t>
-            </w:r>
-          </w:p>
-        </w:tc>
-        <w:tc>
-          <w:tcPr>
-            <w:tcW w:w="1350" w:type="dxa"/>
-          </w:tcPr>
-          <w:p>
-            <w:pPr>
-              <w:spacing w:after="0" w:line="240" w:lineRule="auto"/>
-              <w:jc w:val="left"/>
-            </w:pPr>
-            <w:r>
-              <w:t>decimal(5,2)</w:t>
-            </w:r>
-          </w:p>
-        </w:tc>
-        <w:tc>
-          <w:tcPr>
-            <w:tcW w:w="1656" w:type="dxa"/>
-          </w:tcPr>
-          <w:p>
-            <w:pPr>
-              <w:spacing w:after="0" w:line="240" w:lineRule="auto"/>
-              <w:jc w:val="left"/>
-            </w:pPr>
-            <w:r>
-              <w:t>Optional</w:t>
-            </w:r>
-          </w:p>
-        </w:tc>
-        <w:tc>
-          <w:tcPr>
-            <w:tcW w:w="1656" w:type="dxa"/>
-          </w:tcPr>
-          <w:p>
-            <w:pPr>
-              <w:spacing w:after="0" w:line="240" w:lineRule="auto"/>
-              <w:jc w:val="left"/>
-            </w:pPr>
-            <w:r>
-              <w:t>6</w:t>
-            </w:r>
-          </w:p>
-        </w:tc>
-        <w:tc>
-          <w:tcPr>
-            <w:tcW w:w="2808" w:type="dxa"/>
-          </w:tcPr>
-          <w:p>
-            <w:pPr>
-              <w:spacing w:after="0" w:line="240" w:lineRule="auto"/>
-              <w:jc w:val="left"/>
-            </w:pPr>
-            <w:r>
-              <w:t>Maximum dissolved oxygen in mg/L for the calendar day.</w:t>
-            </w:r>
-          </w:p>
-        </w:tc>
-      </w:tr>
-      <w:tr>
-        <w:tc>
-          <w:tcPr>
-            <w:tcW w:w="1458" w:type="dxa"/>
-          </w:tcPr>
-          <w:p>
-            <w:pPr>
-              <w:spacing w:after="0" w:line="240" w:lineRule="auto"/>
-              <w:jc w:val="left"/>
-            </w:pPr>
-            <w:r>
-              <w:t>DO_avg</w:t>
-            </w:r>
-          </w:p>
-        </w:tc>
-        <w:tc>
-          <w:tcPr>
-            <w:tcW w:w="1350" w:type="dxa"/>
-          </w:tcPr>
-          <w:p>
-            <w:pPr>
-              <w:spacing w:after="0" w:line="240" w:lineRule="auto"/>
-              <w:jc w:val="left"/>
-            </w:pPr>
-            <w:r>
-              <w:t>decimal(5,2)</w:t>
-            </w:r>
-          </w:p>
-        </w:tc>
-        <w:tc>
-          <w:tcPr>
-            <w:tcW w:w="1656" w:type="dxa"/>
-          </w:tcPr>
-          <w:p>
-            <w:pPr>
-              <w:spacing w:after="0" w:line="240" w:lineRule="auto"/>
-              <w:jc w:val="left"/>
-            </w:pPr>
-            <w:r>
-              <w:t>Optional</w:t>
-            </w:r>
-          </w:p>
-        </w:tc>
-        <w:tc>
-          <w:tcPr>
-            <w:tcW w:w="1656" w:type="dxa"/>
-          </w:tcPr>
-          <w:p>
-            <w:pPr>
-              <w:spacing w:after="0" w:line="240" w:lineRule="auto"/>
-              <w:jc w:val="left"/>
-            </w:pPr>
-            <w:r>
-              <w:t>5</w:t>
-            </w:r>
-          </w:p>
-        </w:tc>
-        <w:tc>
-          <w:tcPr>
-            <w:tcW w:w="2808" w:type="dxa"/>
-          </w:tcPr>
-          <w:p>
-            <w:pPr>
-              <w:spacing w:after="0" w:line="240" w:lineRule="auto"/>
-              <w:jc w:val="left"/>
-            </w:pPr>
-            <w:r>
-              <w:t>Mean dissolved oxygen in mg/L for the calendar day.</w:t>
-            </w:r>
-          </w:p>
-        </w:tc>
-      </w:tr>
-      <w:tr>
-        <w:tc>
-          <w:tcPr>
-            <w:tcW w:w="1458" w:type="dxa"/>
-          </w:tcPr>
-          <w:p>
-            <w:pPr>
-              <w:spacing w:after="0" w:line="240" w:lineRule="auto"/>
-              <w:jc w:val="left"/>
-            </w:pPr>
-            <w:r>
-              <w:t>DO_count</w:t>
-            </w:r>
-          </w:p>
-        </w:tc>
-        <w:tc>
-          <w:tcPr>
-            <w:tcW w:w="1350" w:type="dxa"/>
-          </w:tcPr>
-          <w:p>
-            <w:pPr>
-              <w:spacing w:after="0" w:line="240" w:lineRule="auto"/>
-              <w:jc w:val="left"/>
-            </w:pPr>
-            <w:r>
-              <w:t>int</w:t>
-            </w:r>
-          </w:p>
-        </w:tc>
-        <w:tc>
-          <w:tcPr>
-            <w:tcW w:w="1656" w:type="dxa"/>
-          </w:tcPr>
-          <w:p>
-            <w:pPr>
-              <w:spacing w:after="0" w:line="240" w:lineRule="auto"/>
-              <w:jc w:val="left"/>
-            </w:pPr>
-            <w:r>
-              <w:t>Optional</w:t>
-            </w:r>
-          </w:p>
-        </w:tc>
-        <w:tc>
-          <w:tcPr>
-            <w:tcW w:w="1656" w:type="dxa"/>
-          </w:tcPr>
-          <w:p>
-            <w:pPr>
-              <w:spacing w:after="0" w:line="240" w:lineRule="auto"/>
-              <w:jc w:val="left"/>
-            </w:pPr>
-            <w:r>
-              <w:t>0</w:t>
-            </w:r>
-          </w:p>
-        </w:tc>
-        <w:tc>
-          <w:tcPr>
-            <w:tcW w:w="2808" w:type="dxa"/>
-          </w:tcPr>
-          <w:p>
-            <w:pPr>
-              <w:spacing w:after="0" w:line="240" w:lineRule="auto"/>
-              <w:jc w:val="left"/>
-            </w:pPr>
-            <w:r>
-              <w:t>Number of history entries contributing to the sum and mean.</w:t>
-            </w:r>
-          </w:p>
-        </w:tc>
-      </w:tr>
-      <w:tr>
-        <w:tc>
-          <w:tcPr>
-            <w:tcW w:w="1458" w:type="dxa"/>
-          </w:tcPr>
-          <w:p>
-            <w:pPr>
-              <w:spacing w:after="0" w:line="240" w:lineRule="auto"/>
-              <w:jc w:val="left"/>
-            </w:pPr>
-            <w:r>
-              <w:t>DO_sum</w:t>
-            </w:r>
-          </w:p>
-        </w:tc>
-        <w:tc>
-          <w:tcPr>
-            <w:tcW w:w="1350" w:type="dxa"/>
-          </w:tcPr>
-          <w:p>
-            <w:pPr>
-              <w:spacing w:after="0" w:line="240" w:lineRule="auto"/>
-              <w:jc w:val="left"/>
-            </w:pPr>
-            <w:r>
-              <w:t>decimal(8,2)</w:t>
-            </w:r>
-          </w:p>
-        </w:tc>
-        <w:tc>
-          <w:tcPr>
-            <w:tcW w:w="1656" w:type="dxa"/>
-          </w:tcPr>
-          <w:p>
-            <w:pPr>
-              <w:spacing w:after="0" w:line="240" w:lineRule="auto"/>
-              <w:jc w:val="left"/>
-            </w:pPr>
-            <w:r>
-              <w:t>Optional</w:t>
-            </w:r>
-          </w:p>
-        </w:tc>
-        <w:tc>
-          <w:tcPr>
-            <w:tcW w:w="1656" w:type="dxa"/>
-          </w:tcPr>
-          <w:p>
-            <w:pPr>
-              <w:spacing w:after="0" w:line="240" w:lineRule="auto"/>
-              <w:jc w:val="left"/>
-            </w:pPr>
-            <w:r>
-              <w:t>0.00</w:t>
-            </w:r>
-          </w:p>
-        </w:tc>
-        <w:tc>
-          <w:tcPr>
-            <w:tcW w:w="2808" w:type="dxa"/>
-          </w:tcPr>
-          <w:p>
-            <w:pPr>
-              <w:spacing w:after="0" w:line="240" w:lineRule="auto"/>
-              <w:jc w:val="left"/>
-            </w:pPr>
-            <w:r>
-              <w:t>Sum of per-window average values; combined with count to recompute the overall mean.</w:t>
-            </w:r>
-          </w:p>
-        </w:tc>
-      </w:tr>
-      <w:tr>
-        <w:tc>
-          <w:tcPr>
-            <w:tcW w:w="1458" w:type="dxa"/>
-          </w:tcPr>
-          <w:p>
-            <w:pPr>
-              <w:spacing w:after="0" w:line="240" w:lineRule="auto"/>
-              <w:jc w:val="left"/>
-            </w:pPr>
-            <w:r>
-              <w:t>turbidity_mi</w:t>
-            </w:r>
-            <w:r>
-              <w:lastRenderedPageBreak/>
-              <w:t>n</w:t>
-            </w:r>
-          </w:p>
-        </w:tc>
-        <w:tc>
-          <w:tcPr>
-            <w:tcW w:w="1350" w:type="dxa"/>
-          </w:tcPr>
-          <w:p>
-            <w:pPr>
-              <w:spacing w:after="0" w:line="240" w:lineRule="auto"/>
-              <w:jc w:val="left"/>
-            </w:pPr>
-            <w:r>
-              <w:lastRenderedPageBreak/>
-              <w:t>decimal(8,</w:t>
-            </w:r>
-            <w:r>
-              <w:lastRenderedPageBreak/>
-              <w:t>2)</w:t>
-            </w:r>
-          </w:p>
-        </w:tc>
-        <w:tc>
-          <w:tcPr>
-            <w:tcW w:w="1656" w:type="dxa"/>
-          </w:tcPr>
-          <w:p>
-            <w:pPr>
-              <w:spacing w:after="0" w:line="240" w:lineRule="auto"/>
-              <w:jc w:val="left"/>
-            </w:pPr>
-            <w:r>
-              <w:lastRenderedPageBreak/>
-              <w:t>Optional</w:t>
-            </w:r>
-          </w:p>
-        </w:tc>
-        <w:tc>
-          <w:tcPr>
-            <w:tcW w:w="1656" w:type="dxa"/>
-          </w:tcPr>
-          <w:p>
-            <w:pPr>
-              <w:spacing w:after="0" w:line="240" w:lineRule="auto"/>
-              <w:jc w:val="left"/>
-            </w:pPr>
-            <w:r>
-              <w:t>20</w:t>
-            </w:r>
-          </w:p>
-        </w:tc>
-        <w:tc>
-          <w:tcPr>
-            <w:tcW w:w="2808" w:type="dxa"/>
-          </w:tcPr>
-          <w:p>
-            <w:pPr>
-              <w:spacing w:after="0" w:line="240" w:lineRule="auto"/>
-              <w:jc w:val="left"/>
-            </w:pPr>
-            <w:r>
-              <w:t xml:space="preserve">Minimum turbidity in NTU </w:t>
-            </w:r>
-            <w:r>
-              <w:lastRenderedPageBreak/>
-              <w:t>for the calendar day.</w:t>
-            </w:r>
-          </w:p>
-        </w:tc>
-      </w:tr>
-      <w:tr>
-        <w:tc>
-          <w:tcPr>
-            <w:tcW w:w="1458" w:type="dxa"/>
-          </w:tcPr>
-          <w:p>
-            <w:pPr>
-              <w:spacing w:after="0" w:line="240" w:lineRule="auto"/>
-              <w:jc w:val="left"/>
-            </w:pPr>
-            <w:r>
-              <w:lastRenderedPageBreak/>
-              <w:t>turbidity_max</w:t>
-            </w:r>
-          </w:p>
-        </w:tc>
-        <w:tc>
-          <w:tcPr>
-            <w:tcW w:w="1350" w:type="dxa"/>
-          </w:tcPr>
-          <w:p>
-            <w:pPr>
-              <w:spacing w:after="0" w:line="240" w:lineRule="auto"/>
-              <w:jc w:val="left"/>
-            </w:pPr>
-            <w:r>
-              <w:t>decimal(8,2)</w:t>
-            </w:r>
-          </w:p>
-        </w:tc>
-        <w:tc>
-          <w:tcPr>
-            <w:tcW w:w="1656" w:type="dxa"/>
-          </w:tcPr>
-          <w:p>
-            <w:pPr>
-              <w:spacing w:after="0" w:line="240" w:lineRule="auto"/>
-              <w:jc w:val="left"/>
-            </w:pPr>
-            <w:r>
-              <w:t>Optional</w:t>
-            </w:r>
-          </w:p>
-        </w:tc>
-        <w:tc>
-          <w:tcPr>
-            <w:tcW w:w="1656" w:type="dxa"/>
-          </w:tcPr>
-          <w:p>
-            <w:pPr>
-              <w:spacing w:after="0" w:line="240" w:lineRule="auto"/>
-              <w:jc w:val="left"/>
-            </w:pPr>
-            <w:r>
-              <w:t>21</w:t>
-            </w:r>
-          </w:p>
-        </w:tc>
-        <w:tc>
-          <w:tcPr>
-            <w:tcW w:w="2808" w:type="dxa"/>
-          </w:tcPr>
-          <w:p>
-            <w:pPr>
-              <w:spacing w:after="0" w:line="240" w:lineRule="auto"/>
-              <w:jc w:val="left"/>
-            </w:pPr>
-            <w:r>
-              <w:t>Maximum turbidity in NTU for the calendar day.</w:t>
-            </w:r>
-          </w:p>
-        </w:tc>
-      </w:tr>
-      <w:tr>
-        <w:tc>
-          <w:tcPr>
-            <w:tcW w:w="1458" w:type="dxa"/>
-          </w:tcPr>
-          <w:p>
-            <w:pPr>
-              <w:spacing w:after="0" w:line="240" w:lineRule="auto"/>
-              <w:jc w:val="left"/>
-            </w:pPr>
-            <w:r>
-              <w:t>turbidity_avg</w:t>
-            </w:r>
-          </w:p>
-        </w:tc>
-        <w:tc>
-          <w:tcPr>
-            <w:tcW w:w="1350" w:type="dxa"/>
-          </w:tcPr>
-          <w:p>
-            <w:pPr>
-              <w:spacing w:after="0" w:line="240" w:lineRule="auto"/>
-              <w:jc w:val="left"/>
-            </w:pPr>
-            <w:r>
-              <w:t>decimal(8,2)</w:t>
-            </w:r>
-          </w:p>
-        </w:tc>
-        <w:tc>
-          <w:tcPr>
-            <w:tcW w:w="1656" w:type="dxa"/>
-          </w:tcPr>
-          <w:p>
-            <w:pPr>
-              <w:spacing w:after="0" w:line="240" w:lineRule="auto"/>
-              <w:jc w:val="left"/>
-            </w:pPr>
-            <w:r>
-              <w:t>Optional</w:t>
-            </w:r>
-          </w:p>
-        </w:tc>
-        <w:tc>
-          <w:tcPr>
-            <w:tcW w:w="1656" w:type="dxa"/>
-          </w:tcPr>
-          <w:p>
-            <w:pPr>
-              <w:spacing w:after="0" w:line="240" w:lineRule="auto"/>
-              <w:jc w:val="left"/>
-            </w:pPr>
-            <w:r>
-              <w:t>20</w:t>
-            </w:r>
-          </w:p>
-        </w:tc>
-        <w:tc>
-          <w:tcPr>
-            <w:tcW w:w="2808" w:type="dxa"/>
-          </w:tcPr>
-          <w:p>
-            <w:pPr>
-              <w:spacing w:after="0" w:line="240" w:lineRule="auto"/>
-              <w:jc w:val="left"/>
-            </w:pPr>
-            <w:r>
-              <w:t>Mean turbidity in NTU for the calendar day.</w:t>
-            </w:r>
-          </w:p>
-        </w:tc>
-      </w:tr>
-      <w:tr>
-        <w:tc>
-          <w:tcPr>
-            <w:tcW w:w="1458" w:type="dxa"/>
-          </w:tcPr>
-          <w:p>
-            <w:pPr>
-              <w:spacing w:after="0" w:line="240" w:lineRule="auto"/>
-              <w:jc w:val="left"/>
-            </w:pPr>
-            <w:r>
-              <w:t>turbidity_count</w:t>
-            </w:r>
-          </w:p>
-        </w:tc>
-        <w:tc>
-          <w:tcPr>
-            <w:tcW w:w="1350" w:type="dxa"/>
-          </w:tcPr>
-          <w:p>
-            <w:pPr>
-              <w:spacing w:after="0" w:line="240" w:lineRule="auto"/>
-              <w:jc w:val="left"/>
-            </w:pPr>
-            <w:r>
-              <w:t>int</w:t>
-            </w:r>
-          </w:p>
-        </w:tc>
-        <w:tc>
-          <w:tcPr>
-            <w:tcW w:w="1656" w:type="dxa"/>
-          </w:tcPr>
-          <w:p>
-            <w:pPr>
-              <w:spacing w:after="0" w:line="240" w:lineRule="auto"/>
-              <w:jc w:val="left"/>
-            </w:pPr>
-            <w:r>
-              <w:t>Optional</w:t>
-            </w:r>
-          </w:p>
-        </w:tc>
-        <w:tc>
-          <w:tcPr>
-            <w:tcW w:w="1656" w:type="dxa"/>
-          </w:tcPr>
-          <w:p>
-            <w:pPr>
-              <w:spacing w:after="0" w:line="240" w:lineRule="auto"/>
-              <w:jc w:val="left"/>
-            </w:pPr>
-            <w:r>
-              <w:t>0</w:t>
-            </w:r>
-          </w:p>
-        </w:tc>
-        <w:tc>
-          <w:tcPr>
-            <w:tcW w:w="2808" w:type="dxa"/>
-          </w:tcPr>
-          <w:p>
-            <w:pPr>
-              <w:spacing w:after="0" w:line="240" w:lineRule="auto"/>
-              <w:jc w:val="left"/>
-            </w:pPr>
-            <w:r>
-              <w:t>Number of history entries contributing to the sum and mean.</w:t>
-            </w:r>
-          </w:p>
-        </w:tc>
-      </w:tr>
-      <w:tr>
-        <w:tc>
-          <w:tcPr>
-            <w:tcW w:w="1458" w:type="dxa"/>
-          </w:tcPr>
-          <w:p>
-            <w:pPr>
-              <w:spacing w:after="0" w:line="240" w:lineRule="auto"/>
-              <w:jc w:val="left"/>
-            </w:pPr>
-            <w:r>
-              <w:t>turbidity_sum</w:t>
-            </w:r>
-          </w:p>
-        </w:tc>
-        <w:tc>
-          <w:tcPr>
-            <w:tcW w:w="1350" w:type="dxa"/>
-          </w:tcPr>
-          <w:p>
-            <w:pPr>
-              <w:spacing w:after="0" w:line="240" w:lineRule="auto"/>
-              <w:jc w:val="left"/>
-            </w:pPr>
-            <w:r>
-              <w:t>decimal(12,2)</w:t>
-            </w:r>
-          </w:p>
-        </w:tc>
-        <w:tc>
-          <w:tcPr>
-            <w:tcW w:w="1656" w:type="dxa"/>
-          </w:tcPr>
-          <w:p>
-            <w:pPr>
-              <w:spacing w:after="0" w:line="240" w:lineRule="auto"/>
-              <w:jc w:val="left"/>
-            </w:pPr>
-            <w:r>
-              <w:t>Optional</w:t>
-            </w:r>
-          </w:p>
-        </w:tc>
-        <w:tc>
-          <w:tcPr>
-            <w:tcW w:w="1656" w:type="dxa"/>
-          </w:tcPr>
-          <w:p>
-            <w:pPr>
-              <w:spacing w:after="0" w:line="240" w:lineRule="auto"/>
-              <w:jc w:val="left"/>
-            </w:pPr>
-            <w:r>
-              <w:t>0.00</w:t>
-            </w:r>
-          </w:p>
-        </w:tc>
-        <w:tc>
-          <w:tcPr>
-            <w:tcW w:w="2808" w:type="dxa"/>
-          </w:tcPr>
-          <w:p>
-            <w:pPr>
-              <w:spacing w:after="0" w:line="240" w:lineRule="auto"/>
-              <w:jc w:val="left"/>
-            </w:pPr>
-            <w:r>
-              <w:t>Sum of per-window average values; combined with count to recompute the overall mean.</w:t>
-            </w:r>
-          </w:p>
-        </w:tc>
-      </w:tr>
-      <w:tr>
-        <w:tc>
-          <w:tcPr>
-            <w:tcW w:w="1458" w:type="dxa"/>
-          </w:tcPr>
-          <w:p>
-            <w:pPr>
-              <w:spacing w:after="0" w:line="240" w:lineRule="auto"/>
-              <w:jc w:val="left"/>
-            </w:pPr>
-            <w:r>
-              <w:t>waterLevel_min</w:t>
-            </w:r>
-          </w:p>
-        </w:tc>
-        <w:tc>
-          <w:tcPr>
-            <w:tcW w:w="1350" w:type="dxa"/>
-          </w:tcPr>
-          <w:p>
-            <w:pPr>
-              <w:spacing w:after="0" w:line="240" w:lineRule="auto"/>
-              <w:jc w:val="left"/>
-            </w:pPr>
-            <w:r>
-              <w:t>decimal(6,2)</w:t>
-            </w:r>
-          </w:p>
-        </w:tc>
-        <w:tc>
-          <w:tcPr>
-            <w:tcW w:w="1656" w:type="dxa"/>
-          </w:tcPr>
-          <w:p>
-            <w:pPr>
-              <w:spacing w:after="0" w:line="240" w:lineRule="auto"/>
-              <w:jc w:val="left"/>
-            </w:pPr>
-            <w:r>
-              <w:t>Optional</w:t>
-            </w:r>
-          </w:p>
-        </w:tc>
-        <w:tc>
-          <w:tcPr>
-            <w:tcW w:w="1656" w:type="dxa"/>
-          </w:tcPr>
-          <w:p>
-            <w:pPr>
-              <w:spacing w:after="0" w:line="240" w:lineRule="auto"/>
-              <w:jc w:val="left"/>
-            </w:pPr>
-            <w:r>
-              <w:t>18.00</w:t>
-            </w:r>
-          </w:p>
-        </w:tc>
-        <w:tc>
-          <w:tcPr>
-            <w:tcW w:w="2808" w:type="dxa"/>
-          </w:tcPr>
-          <w:p>
-            <w:pPr>
-              <w:spacing w:after="0" w:line="240" w:lineRule="auto"/>
-              <w:jc w:val="left"/>
-            </w:pPr>
-            <w:r>
-              <w:t>Minimum water depth in cm for the calendar day.</w:t>
-            </w:r>
-          </w:p>
-        </w:tc>
-      </w:tr>
-      <w:tr>
-        <w:tc>
-          <w:tcPr>
-            <w:tcW w:w="1458" w:type="dxa"/>
-          </w:tcPr>
-          <w:p>
-            <w:pPr>
-              <w:spacing w:after="0" w:line="240" w:lineRule="auto"/>
-              <w:jc w:val="left"/>
-            </w:pPr>
-            <w:r>
-              <w:t>waterLevel_max</w:t>
-            </w:r>
-          </w:p>
-        </w:tc>
-        <w:tc>
-          <w:tcPr>
-            <w:tcW w:w="1350" w:type="dxa"/>
-          </w:tcPr>
-          <w:p>
-            <w:pPr>
-              <w:spacing w:after="0" w:line="240" w:lineRule="auto"/>
-              <w:jc w:val="left"/>
-            </w:pPr>
-            <w:r>
-              <w:t>decimal(6,2)</w:t>
-            </w:r>
-          </w:p>
-        </w:tc>
-        <w:tc>
-          <w:tcPr>
-            <w:tcW w:w="1656" w:type="dxa"/>
-          </w:tcPr>
-          <w:p>
-            <w:pPr>
-              <w:spacing w:after="0" w:line="240" w:lineRule="auto"/>
-              <w:jc w:val="left"/>
-            </w:pPr>
-            <w:r>
-              <w:t>Optional</w:t>
-            </w:r>
-          </w:p>
-        </w:tc>
-        <w:tc>
-          <w:tcPr>
-            <w:tcW w:w="1656" w:type="dxa"/>
-          </w:tcPr>
-          <w:p>
-            <w:pPr>
-              <w:spacing w:after="0" w:line="240" w:lineRule="auto"/>
-              <w:jc w:val="left"/>
-            </w:pPr>
-            <w:r>
-              <w:t>18.00</w:t>
-            </w:r>
-          </w:p>
-        </w:tc>
-        <w:tc>
-          <w:tcPr>
-            <w:tcW w:w="2808" w:type="dxa"/>
-          </w:tcPr>
-          <w:p>
-            <w:pPr>
-              <w:spacing w:after="0" w:line="240" w:lineRule="auto"/>
-              <w:jc w:val="left"/>
-            </w:pPr>
-            <w:r>
-              <w:t>Maximum water depth in cm for the calendar day.</w:t>
-            </w:r>
-          </w:p>
-        </w:tc>
-      </w:tr>
-      <w:tr>
-        <w:tc>
-          <w:tcPr>
-            <w:tcW w:w="1458" w:type="dxa"/>
-          </w:tcPr>
-          <w:p>
-            <w:pPr>
-              <w:spacing w:after="0" w:line="240" w:lineRule="auto"/>
-              <w:jc w:val="left"/>
-            </w:pPr>
-            <w:r>
-              <w:t>waterLevel_avg</w:t>
-            </w:r>
-          </w:p>
-        </w:tc>
-        <w:tc>
-          <w:tcPr>
-            <w:tcW w:w="1350" w:type="dxa"/>
-          </w:tcPr>
-          <w:p>
-            <w:pPr>
-              <w:spacing w:after="0" w:line="240" w:lineRule="auto"/>
-              <w:jc w:val="left"/>
-            </w:pPr>
-            <w:r>
-              <w:t>decimal(6,2)</w:t>
-            </w:r>
-          </w:p>
-        </w:tc>
-        <w:tc>
-          <w:tcPr>
-            <w:tcW w:w="1656" w:type="dxa"/>
-          </w:tcPr>
-          <w:p>
-            <w:pPr>
-              <w:spacing w:after="0" w:line="240" w:lineRule="auto"/>
-              <w:jc w:val="left"/>
-            </w:pPr>
-            <w:r>
-              <w:t>Optional</w:t>
-            </w:r>
-          </w:p>
-        </w:tc>
-        <w:tc>
-          <w:tcPr>
-            <w:tcW w:w="1656" w:type="dxa"/>
-          </w:tcPr>
-          <w:p>
-            <w:pPr>
-              <w:spacing w:after="0" w:line="240" w:lineRule="auto"/>
-              <w:jc w:val="left"/>
-            </w:pPr>
-            <w:r>
-              <w:t>18.00</w:t>
-            </w:r>
-          </w:p>
-        </w:tc>
-        <w:tc>
-          <w:tcPr>
-            <w:tcW w:w="2808" w:type="dxa"/>
-          </w:tcPr>
-          <w:p>
-            <w:pPr>
-              <w:spacing w:after="0" w:line="240" w:lineRule="auto"/>
-              <w:jc w:val="left"/>
-            </w:pPr>
-            <w:r>
-              <w:t>Mean water depth in cm for the calendar day.</w:t>
-            </w:r>
-          </w:p>
-        </w:tc>
-      </w:tr>
-      <w:tr>
-        <w:tc>
-          <w:tcPr>
-            <w:tcW w:w="1458" w:type="dxa"/>
-          </w:tcPr>
-          <w:p>
-            <w:pPr>
-              <w:spacing w:after="0" w:line="240" w:lineRule="auto"/>
-              <w:jc w:val="left"/>
-            </w:pPr>
-            <w:r>
-              <w:t>waterLevel_count</w:t>
-            </w:r>
-          </w:p>
-        </w:tc>
-        <w:tc>
-          <w:tcPr>
-            <w:tcW w:w="1350" w:type="dxa"/>
-          </w:tcPr>
-          <w:p>
-            <w:pPr>
-              <w:spacing w:after="0" w:line="240" w:lineRule="auto"/>
-              <w:jc w:val="left"/>
-            </w:pPr>
-            <w:r>
-              <w:t>int</w:t>
-            </w:r>
-          </w:p>
-        </w:tc>
-        <w:tc>
-          <w:tcPr>
-            <w:tcW w:w="1656" w:type="dxa"/>
-          </w:tcPr>
-          <w:p>
-            <w:pPr>
-              <w:spacing w:after="0" w:line="240" w:lineRule="auto"/>
-              <w:jc w:val="left"/>
-            </w:pPr>
-            <w:r>
-              <w:t>Optional</w:t>
-            </w:r>
-          </w:p>
-        </w:tc>
-        <w:tc>
-          <w:tcPr>
-            <w:tcW w:w="1656" w:type="dxa"/>
-          </w:tcPr>
-          <w:p>
-            <w:pPr>
-              <w:spacing w:after="0" w:line="240" w:lineRule="auto"/>
-              <w:jc w:val="left"/>
-            </w:pPr>
-            <w:r>
-              <w:t>0</w:t>
-            </w:r>
-          </w:p>
-        </w:tc>
-        <w:tc>
-          <w:tcPr>
-            <w:tcW w:w="2808" w:type="dxa"/>
-          </w:tcPr>
-          <w:p>
-            <w:pPr>
-              <w:spacing w:after="0" w:line="240" w:lineRule="auto"/>
-              <w:jc w:val="left"/>
-            </w:pPr>
-            <w:r>
-              <w:t>Number of history entries contributing to the sum and mean.</w:t>
-            </w:r>
-          </w:p>
-        </w:tc>
-      </w:tr>
-      <w:tr>
-        <w:tc>
-          <w:tcPr>
-            <w:tcW w:w="1458" w:type="dxa"/>
-          </w:tcPr>
-          <w:p>
-            <w:pPr>
-              <w:spacing w:after="0" w:line="240" w:lineRule="auto"/>
-              <w:jc w:val="left"/>
-            </w:pPr>
-            <w:r>
-              <w:t>waterLevel_sum</w:t>
-            </w:r>
-          </w:p>
-        </w:tc>
-        <w:tc>
-          <w:tcPr>
-            <w:tcW w:w="1350" w:type="dxa"/>
-          </w:tcPr>
-          <w:p>
-            <w:pPr>
-              <w:spacing w:after="0" w:line="240" w:lineRule="auto"/>
-              <w:jc w:val="left"/>
-            </w:pPr>
-            <w:r>
-              <w:t>decimal(10,2)</w:t>
-            </w:r>
-          </w:p>
-        </w:tc>
-        <w:tc>
-          <w:tcPr>
-            <w:tcW w:w="1656" w:type="dxa"/>
-          </w:tcPr>
-          <w:p>
-            <w:pPr>
-              <w:spacing w:after="0" w:line="240" w:lineRule="auto"/>
-              <w:jc w:val="left"/>
-            </w:pPr>
-            <w:r>
-              <w:t>Optional</w:t>
-            </w:r>
-          </w:p>
-        </w:tc>
-        <w:tc>
-          <w:tcPr>
-            <w:tcW w:w="1656" w:type="dxa"/>
-          </w:tcPr>
-          <w:p>
-            <w:pPr>
-              <w:spacing w:after="0" w:line="240" w:lineRule="auto"/>
-              <w:jc w:val="left"/>
-            </w:pPr>
-            <w:r>
-              <w:t>0.00</w:t>
-            </w:r>
-          </w:p>
-        </w:tc>
-        <w:tc>
-          <w:tcPr>
-            <w:tcW w:w="2808" w:type="dxa"/>
-          </w:tcPr>
-          <w:p>
-            <w:pPr>
-              <w:spacing w:after="0" w:line="240" w:lineRule="auto"/>
-              <w:jc w:val="left"/>
-            </w:pPr>
-            <w:r>
-              <w:t>Sum of per-window average values; combined with count to recompute the overall mean.</w:t>
-            </w:r>
-          </w:p>
-        </w:tc>
-      </w:tr>
-      <w:tr>
-        <w:tc>
-          <w:tcPr>
-            <w:tcW w:w="1458" w:type="dxa"/>
-          </w:tcPr>
-          <w:p>
-            <w:pPr>
-              <w:spacing w:after="0" w:line="240" w:lineRule="auto"/>
-              <w:jc w:val="left"/>
-            </w:pPr>
-            <w:r>
-              <w:t>summary_version</w:t>
-            </w:r>
-          </w:p>
-        </w:tc>
-        <w:tc>
-          <w:tcPr>
-            <w:tcW w:w="1350" w:type="dxa"/>
-          </w:tcPr>
-          <w:p>
-            <w:pPr>
-              <w:spacing w:after="0" w:line="240" w:lineRule="auto"/>
-              <w:jc w:val="left"/>
-            </w:pPr>
-            <w:r>
-              <w:t>int</w:t>
-            </w:r>
-          </w:p>
-        </w:tc>
-        <w:tc>
-          <w:tcPr>
-            <w:tcW w:w="1656" w:type="dxa"/>
-          </w:tcPr>
-          <w:p>
-            <w:pPr>
-              <w:spacing w:after="0" w:line="240" w:lineRule="auto"/>
-              <w:jc w:val="left"/>
-            </w:pPr>
-            <w:r>
-              <w:t>NOT NULL; DEFAULT 1</w:t>
-            </w:r>
-          </w:p>
-        </w:tc>
-        <w:tc>
-          <w:tcPr>
-            <w:tcW w:w="1656" w:type="dxa"/>
-          </w:tcPr>
-          <w:p>
-            <w:pPr>
-              <w:spacing w:after="0" w:line="240" w:lineRule="auto"/>
-              <w:jc w:val="left"/>
-            </w:pPr>
-            <w:r>
-              <w:t>1</w:t>
-            </w:r>
-          </w:p>
-        </w:tc>
-        <w:tc>
-          <w:tcPr>
-            <w:tcW w:w="2808" w:type="dxa"/>
-          </w:tcPr>
-          <w:p>
-            <w:pPr>
-              <w:spacing w:after="0" w:line="240" w:lineRule="auto"/>
-              <w:jc w:val="left"/>
-            </w:pPr>
-            <w:r>
-              <w:t>Version of the daily summary document layout; currently 1.</w:t>
-            </w:r>
-          </w:p>
-        </w:tc>
-      </w:tr>
-      <w:tr>
-        <w:tc>
-          <w:tcPr>
-            <w:tcW w:w="1458" w:type="dxa"/>
-          </w:tcPr>
-          <w:p>
-            <w:pPr>
-              <w:spacing w:after="0" w:line="240" w:lineRule="auto"/>
-              <w:jc w:val="left"/>
-            </w:pPr>
-            <w:r>
-              <w:t>summary_sanitized</w:t>
-            </w:r>
-          </w:p>
-        </w:tc>
-        <w:tc>
-          <w:tcPr>
-            <w:tcW w:w="1350" w:type="dxa"/>
-          </w:tcPr>
-          <w:p>
-            <w:pPr>
-              <w:spacing w:after="0" w:line="240" w:lineRule="auto"/>
-              <w:jc w:val="left"/>
-            </w:pPr>
-            <w:r>
-              <w:t>boolean</w:t>
-            </w:r>
-          </w:p>
-        </w:tc>
-        <w:tc>
-          <w:tcPr>
-            <w:tcW w:w="1656" w:type="dxa"/>
-          </w:tcPr>
-          <w:p>
-            <w:pPr>
-              <w:spacing w:after="0" w:line="240" w:lineRule="auto"/>
-              <w:jc w:val="left"/>
-            </w:pPr>
-            <w:r>
-              <w:t>NOT NULL; DEFAULT false</w:t>
-            </w:r>
-          </w:p>
-        </w:tc>
-        <w:tc>
-          <w:tcPr>
-            <w:tcW w:w="1656" w:type="dxa"/>
-          </w:tcPr>
-          <w:p>
-            <w:pPr>
-              <w:spacing w:after="0" w:line="240" w:lineRule="auto"/>
-              <w:jc w:val="left"/>
-            </w:pPr>
-            <w:r>
-              <w:t>true | false</w:t>
-            </w:r>
-          </w:p>
-        </w:tc>
-        <w:tc>
-          <w:tcPr>
-            <w:tcW w:w="2808" w:type="dxa"/>
-          </w:tcPr>
-          <w:p>
-            <w:pPr>
-              <w:spacing w:after="0" w:line="240" w:lineRule="auto"/>
-              <w:jc w:val="left"/>
-            </w:pPr>
-            <w:r>
-              <w:t>Whether impossible legacy values were cleaned when the summary was rebuilt.</w:t>
-            </w:r>
-          </w:p>
-        </w:tc>
-      </w:tr>
-      <w:tr>
-        <w:tc>
-          <w:tcPr>
-            <w:tcW w:w="1458" w:type="dxa"/>
-          </w:tcPr>
-          <w:p>
-            <w:pPr>
-              <w:spacing w:after="0" w:line="240" w:lineRule="auto"/>
-              <w:jc w:val="left"/>
-            </w:pPr>
-            <w:r>
-              <w:t>summary_complete</w:t>
-            </w:r>
-          </w:p>
-        </w:tc>
-        <w:tc>
-          <w:tcPr>
-            <w:tcW w:w="1350" w:type="dxa"/>
-          </w:tcPr>
-          <w:p>
-            <w:pPr>
-              <w:spacing w:after="0" w:line="240" w:lineRule="auto"/>
-              <w:jc w:val="left"/>
-            </w:pPr>
-            <w:r>
-              <w:t>boolean</w:t>
-            </w:r>
-          </w:p>
-        </w:tc>
-        <w:tc>
-          <w:tcPr>
-            <w:tcW w:w="1656" w:type="dxa"/>
-          </w:tcPr>
-          <w:p>
-            <w:pPr>
-              <w:spacing w:after="0" w:line="240" w:lineRule="auto"/>
-              <w:jc w:val="left"/>
-            </w:pPr>
-            <w:r>
-              <w:t>NOT NULL; DEFAULT false</w:t>
-            </w:r>
-          </w:p>
-        </w:tc>
-        <w:tc>
-          <w:tcPr>
-            <w:tcW w:w="1656" w:type="dxa"/>
-          </w:tcPr>
-          <w:p>
-            <w:pPr>
-              <w:spacing w:after="0" w:line="240" w:lineRule="auto"/>
-              <w:jc w:val="left"/>
-            </w:pPr>
-            <w:r>
-              <w:t>true | false</w:t>
-            </w:r>
-          </w:p>
-        </w:tc>
-        <w:tc>
-          <w:tcPr>
-            <w:tcW w:w="2808" w:type="dxa"/>
-          </w:tcPr>
-          <w:p>
-            <w:pPr>
-              <w:spacing w:after="0" w:line="240" w:lineRule="auto"/>
-              <w:jc w:val="left"/>
-            </w:pPr>
-            <w:r>
-              <w:t>Whether all raw entries for the day were included in the summary.</w:t>
-            </w:r>
-          </w:p>
-        </w:tc>
-      </w:tr>
-      <w:tr>
-        <w:tc>
-          <w:tcPr>
-            <w:tcW w:w="1458" w:type="dxa"/>
-          </w:tcPr>
-          <w:p>
-            <w:pPr>
-              <w:spacing w:after="0" w:line="240" w:lineRule="auto"/>
-              <w:jc w:val="left"/>
-            </w:pPr>
-            <w:r>
-              <w:t>processed_entry_ids</w:t>
-            </w:r>
-          </w:p>
-        </w:tc>
-        <w:tc>
-          <w:tcPr>
-            <w:tcW w:w="1350" w:type="dxa"/>
-          </w:tcPr>
-          <w:p>
-            <w:pPr>
-              <w:spacing w:after="0" w:line="240" w:lineRule="auto"/>
-              <w:jc w:val="left"/>
-            </w:pPr>
-            <w:r>
-              <w:t>array (of string)</w:t>
-            </w:r>
-          </w:p>
-        </w:tc>
-        <w:tc>
-          <w:tcPr>
-            <w:tcW w:w="1656" w:type="dxa"/>
-          </w:tcPr>
-          <w:p>
-            <w:pPr>
-              <w:spacing w:after="0" w:line="240" w:lineRule="auto"/>
-              <w:jc w:val="left"/>
-            </w:pPr>
-            <w:r>
-              <w:t>NOT NULL</w:t>
-            </w:r>
-          </w:p>
-        </w:tc>
-        <w:tc>
-          <w:tcPr>
-            <w:tcW w:w="1656" w:type="dxa"/>
-          </w:tcPr>
-          <w:p>
-            <w:pPr>
-              <w:spacing w:after="0" w:line="240" w:lineRule="auto"/>
-              <w:jc w:val="left"/>
-            </w:pPr>
-            <w:r>
-              <w:t>[entry_doc_id]</w:t>
-            </w:r>
-          </w:p>
-        </w:tc>
-        <w:tc>
-          <w:tcPr>
-            <w:tcW w:w="2808" w:type="dxa"/>
-          </w:tcPr>
-          <w:p>
-            <w:pPr>
-              <w:spacing w:after="0" w:line="240" w:lineRule="auto"/>
-              <w:jc w:val="left"/>
-            </w:pPr>
-            <w:r>
-              <w:t>Document IDs of raw entries already folded into this summary (idempotent rebuilds).</w:t>
-            </w:r>
-          </w:p>
-        </w:tc>
-      </w:tr>
-      <w:tr>
-        <w:tc>
-          <w:tcPr>
-            <w:tcW w:w="1458" w:type="dxa"/>
-          </w:tcPr>
-          <w:p>
-            <w:pPr>
-              <w:spacing w:after="0" w:line="240" w:lineRule="auto"/>
-              <w:jc w:val="left"/>
-            </w:pPr>
-            <w:r>
-              <w:t>updated_at</w:t>
-            </w:r>
-          </w:p>
-        </w:tc>
-        <w:tc>
-          <w:tcPr>
-            <w:tcW w:w="1350" w:type="dxa"/>
-          </w:tcPr>
-          <w:p>
-            <w:pPr>
-              <w:spacing w:after="0" w:line="240" w:lineRule="auto"/>
-              <w:jc w:val="left"/>
-            </w:pPr>
-            <w:r>
-              <w:t>timestamp</w:t>
-            </w:r>
-          </w:p>
-        </w:tc>
-        <w:tc>
-          <w:tcPr>
-            <w:tcW w:w="1656" w:type="dxa"/>
-          </w:tcPr>
-          <w:p>
-            <w:pPr>
-              <w:spacing w:after="0" w:line="240" w:lineRule="auto"/>
-              <w:jc w:val="left"/>
-            </w:pPr>
-            <w:r>
-              <w:t>Optional</w:t>
-            </w:r>
-          </w:p>
-        </w:tc>
-        <w:tc>
-          <w:tcPr>
-            <w:tcW w:w="1656" w:type="dxa"/>
-          </w:tcPr>
-          <w:p>
-            <w:pPr>
-              <w:spacing w:after="0" w:line="240" w:lineRule="auto"/>
-              <w:jc w:val="left"/>
-            </w:pPr>
-            <w:r>
-              <w:t>2026-09-06 08:00:00</w:t>
-            </w:r>
-          </w:p>
-        </w:tc>
-        <w:tc>
-          <w:tcPr>
-            <w:tcW w:w="2808" w:type="dxa"/>
-          </w:tcPr>
-          <w:p>
-            <w:pPr>
-              <w:spacing w:after="0" w:line="240" w:lineRule="auto"/>
-              <w:jc w:val="left"/>
-            </w:pPr>
-            <w:r>
-              <w:t>Date and time this record was last updated.</w:t>
-            </w:r>
-          </w:p>
-        </w:tc>
-      </w:tr>
-    </w:tbl>
-    <w:p/>
-    <w:p>
-      <w:pPr>
-        <w:keepNext/>
-        <w:jc w:val="center"/>
-      </w:pPr>
-      <w:r>
-        <w:t>Table 10</w:t>
+        <w:t>Table 9</w:t>
       </w:r>
     </w:p>
     <w:p>
@@ -9768,7 +6846,10 @@
         <w:jc w:val="center"/>
       </w:pPr>
       <w:r>
-        <w:t>Table 11</w:t>
+        <w:rPr>
+          <w:rFonts w:ascii="Arial" w:hAnsi="Arial" w:eastAsia="Arial"/>
+        </w:rPr>
+        <w:t>Table 10</w:t>
       </w:r>
     </w:p>
     <w:p>
@@ -10332,7 +7413,10 @@
         <w:jc w:val="center"/>
       </w:pPr>
       <w:r>
-        <w:t>Table 12</w:t>
+        <w:rPr>
+          <w:rFonts w:ascii="Arial" w:hAnsi="Arial" w:eastAsia="Arial"/>
+        </w:rPr>
+        <w:t>Table 11</w:t>
       </w:r>
     </w:p>
     <w:p>
@@ -11180,7 +8264,10 @@
         <w:jc w:val="center"/>
       </w:pPr>
       <w:r>
-        <w:t>Table 13</w:t>
+        <w:rPr>
+          <w:rFonts w:ascii="Arial" w:hAnsi="Arial" w:eastAsia="Arial"/>
+        </w:rPr>
+        <w:t>Table 12</w:t>
       </w:r>
     </w:p>
     <w:p>
@@ -12243,7 +9330,10 @@
         <w:jc w:val="center"/>
       </w:pPr>
       <w:r>
-        <w:t>Table 14</w:t>
+        <w:rPr>
+          <w:rFonts w:ascii="Arial" w:hAnsi="Arial" w:eastAsia="Arial"/>
+        </w:rPr>
+        <w:t>Table 13</w:t>
       </w:r>
     </w:p>
     <w:p>
@@ -12586,7 +9676,10 @@
         <w:jc w:val="center"/>
       </w:pPr>
       <w:r>
-        <w:t>Table 15</w:t>
+        <w:rPr>
+          <w:rFonts w:ascii="Arial" w:hAnsi="Arial" w:eastAsia="Arial"/>
+        </w:rPr>
+        <w:t>Table 14</w:t>
       </w:r>
     </w:p>
     <w:p>
@@ -13304,7 +10397,10 @@
         <w:jc w:val="center"/>
       </w:pPr>
       <w:r>
-        <w:t>Table 16</w:t>
+        <w:rPr>
+          <w:rFonts w:ascii="Arial" w:hAnsi="Arial" w:eastAsia="Arial"/>
+        </w:rPr>
+        <w:t>Table 15</w:t>
       </w:r>
     </w:p>
     <w:p>
@@ -14732,7 +11828,10 @@
         <w:jc w:val="center"/>
       </w:pPr>
       <w:r>
-        <w:t>Table 17</w:t>
+        <w:rPr>
+          <w:rFonts w:ascii="Arial" w:hAnsi="Arial" w:eastAsia="Arial"/>
+        </w:rPr>
+        <w:t>Table 16</w:t>
       </w:r>
     </w:p>
     <w:p>
@@ -16674,7 +13773,10 @@
         <w:jc w:val="center"/>
       </w:pPr>
       <w:r>
-        <w:t>Table 18</w:t>
+        <w:rPr>
+          <w:rFonts w:ascii="Arial" w:hAnsi="Arial" w:eastAsia="Arial"/>
+        </w:rPr>
+        <w:t>Table 17</w:t>
       </w:r>
     </w:p>
     <w:p>
@@ -17460,7 +14562,10 @@
         <w:jc w:val="center"/>
       </w:pPr>
       <w:r>
-        <w:t>Table 19</w:t>
+        <w:rPr>
+          <w:rFonts w:ascii="Arial" w:hAnsi="Arial" w:eastAsia="Arial"/>
+        </w:rPr>
+        <w:t>Table 18</w:t>
       </w:r>
     </w:p>
     <w:p>
@@ -18955,7 +16060,10 @@
         <w:jc w:val="center"/>
       </w:pPr>
       <w:r>
-        <w:t>Table 20</w:t>
+        <w:rPr>
+          <w:rFonts w:ascii="Arial" w:hAnsi="Arial" w:eastAsia="Arial"/>
+        </w:rPr>
+        <w:t>Table 19</w:t>
       </w:r>
     </w:p>
     <w:p>
@@ -20028,7 +17136,10 @@
         <w:jc w:val="center"/>
       </w:pPr>
       <w:r>
-        <w:t>Table 21</w:t>
+        <w:rPr>
+          <w:rFonts w:ascii="Arial" w:hAnsi="Arial" w:eastAsia="Arial"/>
+        </w:rPr>
+        <w:t>Table 20</w:t>
       </w:r>
     </w:p>
     <w:p>
@@ -20588,7 +17699,10 @@
         <w:jc w:val="center"/>
       </w:pPr>
       <w:r>
-        <w:t>Table 22</w:t>
+        <w:rPr>
+          <w:rFonts w:ascii="Arial" w:hAnsi="Arial" w:eastAsia="Arial"/>
+        </w:rPr>
+        <w:t>Table 21</w:t>
       </w:r>
     </w:p>
     <w:p>

</xml_diff>

<commit_message>
Fix sampling catch-up windows and feeding schedule auth fallback
</commit_message>
<xml_diff>
--- a/docs/Deliverables/Data Dictionary.docx
+++ b/docs/Deliverables/Data Dictionary.docx
@@ -748,7 +748,7 @@
         <w:rPr>
           <w:b/>
         </w:rPr>
-        <w:t>notification_settings Table</w:t>
+        <w:t>tanks Table</w:t>
       </w:r>
     </w:p>
     <w:tbl>
@@ -866,7 +866,7 @@
               <w:jc w:val="left"/>
             </w:pPr>
             <w:r>
-              <w:t>uid</w:t>
+              <w:t>tank_id</w:t>
             </w:r>
           </w:p>
         </w:tc>
@@ -894,51 +894,195 @@
               <w:jc w:val="left"/>
             </w:pPr>
             <w:r>
-              <w:t>PRIMARY KEY; FOREIGN KEY; NOT NULL</w:t>
-            </w:r>
-          </w:p>
-        </w:tc>
-        <w:tc>
-          <w:tcPr>
-            <w:tcW w:w="1656" w:type="dxa"/>
-          </w:tcPr>
-          <w:p>
-            <w:pPr>
-              <w:spacing w:after="0" w:line="240" w:lineRule="auto"/>
-              <w:jc w:val="left"/>
-            </w:pPr>
-            <w:r>
-              <w:t>uid_001</w:t>
-            </w:r>
-          </w:p>
-        </w:tc>
-        <w:tc>
-          <w:tcPr>
-            <w:tcW w:w="2808" w:type="dxa"/>
-          </w:tcPr>
-          <w:p>
-            <w:pPr>
-              <w:spacing w:after="0" w:line="240" w:lineRule="auto"/>
-              <w:jc w:val="left"/>
-            </w:pPr>
-            <w:r>
-              <w:t>Unique identifier of the associated user account.</w:t>
-            </w:r>
-          </w:p>
-        </w:tc>
-      </w:tr>
-      <w:tr>
-        <w:tc>
-          <w:tcPr>
-            <w:tcW w:w="1458" w:type="dxa"/>
-          </w:tcPr>
-          <w:p>
-            <w:pPr>
-              <w:spacing w:after="0" w:line="240" w:lineRule="auto"/>
-              <w:jc w:val="left"/>
-            </w:pPr>
-            <w:r>
-              <w:t>sound</w:t>
+              <w:t>PRIMARY KEY; NOT NULL</w:t>
+            </w:r>
+          </w:p>
+        </w:tc>
+        <w:tc>
+          <w:tcPr>
+            <w:tcW w:w="1656" w:type="dxa"/>
+          </w:tcPr>
+          <w:p>
+            <w:pPr>
+              <w:spacing w:after="0" w:line="240" w:lineRule="auto"/>
+              <w:jc w:val="left"/>
+            </w:pPr>
+            <w:r>
+              <w:t>tank_001</w:t>
+            </w:r>
+          </w:p>
+        </w:tc>
+        <w:tc>
+          <w:tcPr>
+            <w:tcW w:w="2808" w:type="dxa"/>
+          </w:tcPr>
+          <w:p>
+            <w:pPr>
+              <w:spacing w:after="0" w:line="240" w:lineRule="auto"/>
+              <w:jc w:val="left"/>
+            </w:pPr>
+            <w:r>
+              <w:t>Identifier of the tank record.</w:t>
+            </w:r>
+          </w:p>
+        </w:tc>
+      </w:tr>
+      <w:tr>
+        <w:tc>
+          <w:tcPr>
+            <w:tcW w:w="1458" w:type="dxa"/>
+          </w:tcPr>
+          <w:p>
+            <w:pPr>
+              <w:spacing w:after="0" w:line="240" w:lineRule="auto"/>
+              <w:jc w:val="left"/>
+            </w:pPr>
+            <w:r>
+              <w:t>owner_uid</w:t>
+            </w:r>
+          </w:p>
+        </w:tc>
+        <w:tc>
+          <w:tcPr>
+            <w:tcW w:w="1350" w:type="dxa"/>
+          </w:tcPr>
+          <w:p>
+            <w:pPr>
+              <w:spacing w:after="0" w:line="240" w:lineRule="auto"/>
+              <w:jc w:val="left"/>
+            </w:pPr>
+            <w:r>
+              <w:t>varchar</w:t>
+            </w:r>
+          </w:p>
+        </w:tc>
+        <w:tc>
+          <w:tcPr>
+            <w:tcW w:w="1656" w:type="dxa"/>
+          </w:tcPr>
+          <w:p>
+            <w:pPr>
+              <w:spacing w:after="0" w:line="240" w:lineRule="auto"/>
+              <w:jc w:val="left"/>
+            </w:pPr>
+            <w:r>
+              <w:t>FOREIGN KEY; NOT NULL; UNIQUE</w:t>
+            </w:r>
+          </w:p>
+        </w:tc>
+        <w:tc>
+          <w:tcPr>
+            <w:tcW w:w="1656" w:type="dxa"/>
+          </w:tcPr>
+          <w:p>
+            <w:pPr>
+              <w:spacing w:after="0" w:line="240" w:lineRule="auto"/>
+              <w:jc w:val="left"/>
+            </w:pPr>
+            <w:r>
+              <w:t>owner_uid_001</w:t>
+            </w:r>
+          </w:p>
+        </w:tc>
+        <w:tc>
+          <w:tcPr>
+            <w:tcW w:w="2808" w:type="dxa"/>
+          </w:tcPr>
+          <w:p>
+            <w:pPr>
+              <w:spacing w:after="0" w:line="240" w:lineRule="auto"/>
+              <w:jc w:val="left"/>
+            </w:pPr>
+            <w:r>
+              <w:t>UID of the owner responsible for the tank.</w:t>
+            </w:r>
+          </w:p>
+        </w:tc>
+      </w:tr>
+      <w:tr>
+        <w:tc>
+          <w:tcPr>
+            <w:tcW w:w="1458" w:type="dxa"/>
+          </w:tcPr>
+          <w:p>
+            <w:pPr>
+              <w:spacing w:after="0" w:line="240" w:lineRule="auto"/>
+              <w:jc w:val="left"/>
+            </w:pPr>
+            <w:r>
+              <w:t>current_batch_id</w:t>
+            </w:r>
+          </w:p>
+        </w:tc>
+        <w:tc>
+          <w:tcPr>
+            <w:tcW w:w="1350" w:type="dxa"/>
+          </w:tcPr>
+          <w:p>
+            <w:pPr>
+              <w:spacing w:after="0" w:line="240" w:lineRule="auto"/>
+              <w:jc w:val="left"/>
+            </w:pPr>
+            <w:r>
+              <w:t>varchar</w:t>
+            </w:r>
+          </w:p>
+        </w:tc>
+        <w:tc>
+          <w:tcPr>
+            <w:tcW w:w="1656" w:type="dxa"/>
+          </w:tcPr>
+          <w:p>
+            <w:pPr>
+              <w:spacing w:after="0" w:line="240" w:lineRule="auto"/>
+              <w:jc w:val="left"/>
+            </w:pPr>
+            <w:r>
+              <w:t>Optional</w:t>
+            </w:r>
+          </w:p>
+        </w:tc>
+        <w:tc>
+          <w:tcPr>
+            <w:tcW w:w="1656" w:type="dxa"/>
+          </w:tcPr>
+          <w:p>
+            <w:pPr>
+              <w:spacing w:after="0" w:line="240" w:lineRule="auto"/>
+              <w:jc w:val="left"/>
+            </w:pPr>
+            <w:r>
+              <w:t>batch_001</w:t>
+            </w:r>
+          </w:p>
+        </w:tc>
+        <w:tc>
+          <w:tcPr>
+            <w:tcW w:w="2808" w:type="dxa"/>
+          </w:tcPr>
+          <w:p>
+            <w:pPr>
+              <w:spacing w:after="0" w:line="240" w:lineRule="auto"/>
+              <w:jc w:val="left"/>
+            </w:pPr>
+            <w:r>
+              <w:t>ID of the currently selected batch document under tanks/{tankId}/batches (tank pointer).</w:t>
+            </w:r>
+          </w:p>
+        </w:tc>
+      </w:tr>
+      <w:tr>
+        <w:tc>
+          <w:tcPr>
+            <w:tcW w:w="1458" w:type="dxa"/>
+          </w:tcPr>
+          <w:p>
+            <w:pPr>
+              <w:spacing w:after="0" w:line="240" w:lineRule="auto"/>
+              <w:jc w:val="left"/>
+            </w:pPr>
+            <w:r>
+              <w:t>is_initialized</w:t>
             </w:r>
           </w:p>
         </w:tc>
@@ -966,7 +1110,7 @@
               <w:jc w:val="left"/>
             </w:pPr>
             <w:r>
-              <w:t>NOT NULL; DEFAULT true</w:t>
+              <w:t>NOT NULL; DEFAULT false</w:t>
             </w:r>
           </w:p>
         </w:tc>
@@ -994,456 +1138,23 @@
               <w:jc w:val="left"/>
             </w:pPr>
             <w:r>
-              <w:t>Enables notification sound where permitted by the device.</w:t>
-            </w:r>
-          </w:p>
-        </w:tc>
-      </w:tr>
-      <w:tr>
-        <w:tc>
-          <w:tcPr>
-            <w:tcW w:w="1458" w:type="dxa"/>
-          </w:tcPr>
-          <w:p>
-            <w:pPr>
-              <w:spacing w:after="0" w:line="240" w:lineRule="auto"/>
-              <w:jc w:val="left"/>
-            </w:pPr>
-            <w:r>
-              <w:t>vibration</w:t>
-            </w:r>
-          </w:p>
-        </w:tc>
-        <w:tc>
-          <w:tcPr>
-            <w:tcW w:w="1350" w:type="dxa"/>
-          </w:tcPr>
-          <w:p>
-            <w:pPr>
-              <w:spacing w:after="0" w:line="240" w:lineRule="auto"/>
-              <w:jc w:val="left"/>
-            </w:pPr>
-            <w:r>
-              <w:t>boolean</w:t>
-            </w:r>
-          </w:p>
-        </w:tc>
-        <w:tc>
-          <w:tcPr>
-            <w:tcW w:w="1656" w:type="dxa"/>
-          </w:tcPr>
-          <w:p>
-            <w:pPr>
-              <w:spacing w:after="0" w:line="240" w:lineRule="auto"/>
-              <w:jc w:val="left"/>
-            </w:pPr>
-            <w:r>
-              <w:t>NOT NULL; DEFAULT true</w:t>
-            </w:r>
-          </w:p>
-        </w:tc>
-        <w:tc>
-          <w:tcPr>
-            <w:tcW w:w="1656" w:type="dxa"/>
-          </w:tcPr>
-          <w:p>
-            <w:pPr>
-              <w:spacing w:after="0" w:line="240" w:lineRule="auto"/>
-              <w:jc w:val="left"/>
-            </w:pPr>
-            <w:r>
-              <w:t>true | false</w:t>
-            </w:r>
-          </w:p>
-        </w:tc>
-        <w:tc>
-          <w:tcPr>
-            <w:tcW w:w="2808" w:type="dxa"/>
-          </w:tcPr>
-          <w:p>
-            <w:pPr>
-              <w:spacing w:after="0" w:line="240" w:lineRule="auto"/>
-              <w:jc w:val="left"/>
-            </w:pPr>
-            <w:r>
-              <w:t>Enables vibration where permitted by the device.</w:t>
-            </w:r>
-          </w:p>
-        </w:tc>
-      </w:tr>
-      <w:tr>
-        <w:tc>
-          <w:tcPr>
-            <w:tcW w:w="1458" w:type="dxa"/>
-          </w:tcPr>
-          <w:p>
-            <w:pPr>
-              <w:spacing w:after="0" w:line="240" w:lineRule="auto"/>
-              <w:jc w:val="left"/>
-            </w:pPr>
-            <w:r>
-              <w:t>critical</w:t>
-            </w:r>
-          </w:p>
-        </w:tc>
-        <w:tc>
-          <w:tcPr>
-            <w:tcW w:w="1350" w:type="dxa"/>
-          </w:tcPr>
-          <w:p>
-            <w:pPr>
-              <w:spacing w:after="0" w:line="240" w:lineRule="auto"/>
-              <w:jc w:val="left"/>
-            </w:pPr>
-            <w:r>
-              <w:t>boolean</w:t>
-            </w:r>
-          </w:p>
-        </w:tc>
-        <w:tc>
-          <w:tcPr>
-            <w:tcW w:w="1656" w:type="dxa"/>
-          </w:tcPr>
-          <w:p>
-            <w:pPr>
-              <w:spacing w:after="0" w:line="240" w:lineRule="auto"/>
-              <w:jc w:val="left"/>
-            </w:pPr>
-            <w:r>
-              <w:t>NOT NULL; DEFAULT true</w:t>
-            </w:r>
-          </w:p>
-        </w:tc>
-        <w:tc>
-          <w:tcPr>
-            <w:tcW w:w="1656" w:type="dxa"/>
-          </w:tcPr>
-          <w:p>
-            <w:pPr>
-              <w:spacing w:after="0" w:line="240" w:lineRule="auto"/>
-              <w:jc w:val="left"/>
-            </w:pPr>
-            <w:r>
-              <w:t>true | false</w:t>
-            </w:r>
-          </w:p>
-        </w:tc>
-        <w:tc>
-          <w:tcPr>
-            <w:tcW w:w="2808" w:type="dxa"/>
-          </w:tcPr>
-          <w:p>
-            <w:pPr>
-              <w:spacing w:after="0" w:line="240" w:lineRule="auto"/>
-              <w:jc w:val="left"/>
-            </w:pPr>
-            <w:r>
-              <w:t>Enables critical water-quality notifications.</w:t>
-            </w:r>
-          </w:p>
-        </w:tc>
-      </w:tr>
-      <w:tr>
-        <w:tc>
-          <w:tcPr>
-            <w:tcW w:w="1458" w:type="dxa"/>
-          </w:tcPr>
-          <w:p>
-            <w:pPr>
-              <w:spacing w:after="0" w:line="240" w:lineRule="auto"/>
-              <w:jc w:val="left"/>
-            </w:pPr>
-            <w:r>
-              <w:t>warning</w:t>
-            </w:r>
-          </w:p>
-        </w:tc>
-        <w:tc>
-          <w:tcPr>
-            <w:tcW w:w="1350" w:type="dxa"/>
-          </w:tcPr>
-          <w:p>
-            <w:pPr>
-              <w:spacing w:after="0" w:line="240" w:lineRule="auto"/>
-              <w:jc w:val="left"/>
-            </w:pPr>
-            <w:r>
-              <w:t>boolean</w:t>
-            </w:r>
-          </w:p>
-        </w:tc>
-        <w:tc>
-          <w:tcPr>
-            <w:tcW w:w="1656" w:type="dxa"/>
-          </w:tcPr>
-          <w:p>
-            <w:pPr>
-              <w:spacing w:after="0" w:line="240" w:lineRule="auto"/>
-              <w:jc w:val="left"/>
-            </w:pPr>
-            <w:r>
-              <w:t>NOT NULL; DEFAULT true</w:t>
-            </w:r>
-          </w:p>
-        </w:tc>
-        <w:tc>
-          <w:tcPr>
-            <w:tcW w:w="1656" w:type="dxa"/>
-          </w:tcPr>
-          <w:p>
-            <w:pPr>
-              <w:spacing w:after="0" w:line="240" w:lineRule="auto"/>
-              <w:jc w:val="left"/>
-            </w:pPr>
-            <w:r>
-              <w:t>true | false</w:t>
-            </w:r>
-          </w:p>
-        </w:tc>
-        <w:tc>
-          <w:tcPr>
-            <w:tcW w:w="2808" w:type="dxa"/>
-          </w:tcPr>
-          <w:p>
-            <w:pPr>
-              <w:spacing w:after="0" w:line="240" w:lineRule="auto"/>
-              <w:jc w:val="left"/>
-            </w:pPr>
-            <w:r>
-              <w:t>Enables warning-level water-quality notifications.</w:t>
-            </w:r>
-          </w:p>
-        </w:tc>
-      </w:tr>
-      <w:tr>
-        <w:tc>
-          <w:tcPr>
-            <w:tcW w:w="1458" w:type="dxa"/>
-          </w:tcPr>
-          <w:p>
-            <w:pPr>
-              <w:spacing w:after="0" w:line="240" w:lineRule="auto"/>
-              <w:jc w:val="left"/>
-            </w:pPr>
-            <w:r>
-              <w:lastRenderedPageBreak/>
-              <w:t>feeding</w:t>
-            </w:r>
-          </w:p>
-        </w:tc>
-        <w:tc>
-          <w:tcPr>
-            <w:tcW w:w="1350" w:type="dxa"/>
-          </w:tcPr>
-          <w:p>
-            <w:pPr>
-              <w:spacing w:after="0" w:line="240" w:lineRule="auto"/>
-              <w:jc w:val="left"/>
-            </w:pPr>
-            <w:r>
-              <w:t>boolean</w:t>
-            </w:r>
-          </w:p>
-        </w:tc>
-        <w:tc>
-          <w:tcPr>
-            <w:tcW w:w="1656" w:type="dxa"/>
-          </w:tcPr>
-          <w:p>
-            <w:pPr>
-              <w:spacing w:after="0" w:line="240" w:lineRule="auto"/>
-              <w:jc w:val="left"/>
-            </w:pPr>
-            <w:r>
-              <w:t>NOT NULL; DEFAULT true</w:t>
-            </w:r>
-          </w:p>
-        </w:tc>
-        <w:tc>
-          <w:tcPr>
-            <w:tcW w:w="1656" w:type="dxa"/>
-          </w:tcPr>
-          <w:p>
-            <w:pPr>
-              <w:spacing w:after="0" w:line="240" w:lineRule="auto"/>
-              <w:jc w:val="left"/>
-            </w:pPr>
-            <w:r>
-              <w:t>true | false</w:t>
-            </w:r>
-          </w:p>
-        </w:tc>
-        <w:tc>
-          <w:tcPr>
-            <w:tcW w:w="2808" w:type="dxa"/>
-          </w:tcPr>
-          <w:p>
-            <w:pPr>
-              <w:spacing w:after="0" w:line="240" w:lineRule="auto"/>
-              <w:jc w:val="left"/>
-            </w:pPr>
-            <w:r>
-              <w:t>Enables feeding reminders and completed/skipped feeding results.</w:t>
-            </w:r>
-          </w:p>
-        </w:tc>
-      </w:tr>
-      <w:tr>
-        <w:tc>
-          <w:tcPr>
-            <w:tcW w:w="1458" w:type="dxa"/>
-          </w:tcPr>
-          <w:p>
-            <w:pPr>
-              <w:spacing w:after="0" w:line="240" w:lineRule="auto"/>
-              <w:jc w:val="left"/>
-            </w:pPr>
-            <w:r>
-              <w:t>sampling</w:t>
-            </w:r>
-          </w:p>
-        </w:tc>
-        <w:tc>
-          <w:tcPr>
-            <w:tcW w:w="1350" w:type="dxa"/>
-          </w:tcPr>
-          <w:p>
-            <w:pPr>
-              <w:spacing w:after="0" w:line="240" w:lineRule="auto"/>
-              <w:jc w:val="left"/>
-            </w:pPr>
-            <w:r>
-              <w:t>boolean</w:t>
-            </w:r>
-          </w:p>
-        </w:tc>
-        <w:tc>
-          <w:tcPr>
-            <w:tcW w:w="1656" w:type="dxa"/>
-          </w:tcPr>
-          <w:p>
-            <w:pPr>
-              <w:spacing w:after="0" w:line="240" w:lineRule="auto"/>
-              <w:jc w:val="left"/>
-            </w:pPr>
-            <w:r>
-              <w:t>NOT NULL; DEFAULT true</w:t>
-            </w:r>
-          </w:p>
-        </w:tc>
-        <w:tc>
-          <w:tcPr>
-            <w:tcW w:w="1656" w:type="dxa"/>
-          </w:tcPr>
-          <w:p>
-            <w:pPr>
-              <w:spacing w:after="0" w:line="240" w:lineRule="auto"/>
-              <w:jc w:val="left"/>
-            </w:pPr>
-            <w:r>
-              <w:t>true | false</w:t>
-            </w:r>
-          </w:p>
-        </w:tc>
-        <w:tc>
-          <w:tcPr>
-            <w:tcW w:w="2808" w:type="dxa"/>
-          </w:tcPr>
-          <w:p>
-            <w:pPr>
-              <w:spacing w:after="0" w:line="240" w:lineRule="auto"/>
-              <w:jc w:val="left"/>
-            </w:pPr>
-            <w:r>
-              <w:t>Enables tank sampling reminders.</w:t>
-            </w:r>
-          </w:p>
-        </w:tc>
-      </w:tr>
-      <w:tr>
-        <w:tc>
-          <w:tcPr>
-            <w:tcW w:w="1458" w:type="dxa"/>
-          </w:tcPr>
-          <w:p>
-            <w:pPr>
-              <w:spacing w:after="0" w:line="240" w:lineRule="auto"/>
-              <w:jc w:val="left"/>
-            </w:pPr>
-            <w:r>
-              <w:t>operational</w:t>
-            </w:r>
-          </w:p>
-        </w:tc>
-        <w:tc>
-          <w:tcPr>
-            <w:tcW w:w="1350" w:type="dxa"/>
-          </w:tcPr>
-          <w:p>
-            <w:pPr>
-              <w:spacing w:after="0" w:line="240" w:lineRule="auto"/>
-              <w:jc w:val="left"/>
-            </w:pPr>
-            <w:r>
-              <w:t>boolean</w:t>
-            </w:r>
-          </w:p>
-        </w:tc>
-        <w:tc>
-          <w:tcPr>
-            <w:tcW w:w="1656" w:type="dxa"/>
-          </w:tcPr>
-          <w:p>
-            <w:pPr>
-              <w:spacing w:after="0" w:line="240" w:lineRule="auto"/>
-              <w:jc w:val="left"/>
-            </w:pPr>
-            <w:r>
-              <w:t>NOT NULL; DEFAULT true</w:t>
-            </w:r>
-          </w:p>
-        </w:tc>
-        <w:tc>
-          <w:tcPr>
-            <w:tcW w:w="1656" w:type="dxa"/>
-          </w:tcPr>
-          <w:p>
-            <w:pPr>
-              <w:spacing w:after="0" w:line="240" w:lineRule="auto"/>
-              <w:jc w:val="left"/>
-            </w:pPr>
-            <w:r>
-              <w:t>true | false</w:t>
-            </w:r>
-          </w:p>
-        </w:tc>
-        <w:tc>
-          <w:tcPr>
-            <w:tcW w:w="2808" w:type="dxa"/>
-          </w:tcPr>
-          <w:p>
-            <w:pPr>
-              <w:spacing w:after="0" w:line="240" w:lineRule="auto"/>
-              <w:jc w:val="left"/>
-            </w:pPr>
-            <w:r>
-              <w:t>Enables actuator, device, and sensor-recovery updates.</w:t>
-            </w:r>
-          </w:p>
-        </w:tc>
-      </w:tr>
-      <w:tr>
-        <w:tc>
-          <w:tcPr>
-            <w:tcW w:w="1458" w:type="dxa"/>
-          </w:tcPr>
-          <w:p>
-            <w:pPr>
-              <w:spacing w:after="0" w:line="240" w:lineRule="auto"/>
-              <w:jc w:val="left"/>
-            </w:pPr>
-            <w:r>
-              <w:t>updated_at</w:t>
+              <w:t>True once a grow-out batch has been initialized for the tank.</w:t>
+            </w:r>
+          </w:p>
+        </w:tc>
+      </w:tr>
+      <w:tr>
+        <w:tc>
+          <w:tcPr>
+            <w:tcW w:w="1458" w:type="dxa"/>
+          </w:tcPr>
+          <w:p>
+            <w:pPr>
+              <w:spacing w:after="0" w:line="240" w:lineRule="auto"/>
+              <w:jc w:val="left"/>
+            </w:pPr>
+            <w:r>
+              <w:t>created_at</w:t>
             </w:r>
           </w:p>
         </w:tc>
@@ -1471,7 +1182,7 @@
               <w:jc w:val="left"/>
             </w:pPr>
             <w:r>
-              <w:t>Optional</w:t>
+              <w:t>NOT NULL</w:t>
             </w:r>
           </w:p>
         </w:tc>
@@ -1499,7 +1210,7 @@
               <w:jc w:val="left"/>
             </w:pPr>
             <w:r>
-              <w:t>Date and time this record was last updated.</w:t>
+              <w:t>Date and time this record was created.</w:t>
             </w:r>
           </w:p>
         </w:tc>
@@ -1527,7 +1238,7 @@
         <w:rPr>
           <w:b/>
         </w:rPr>
-        <w:t>tanks Table</w:t>
+        <w:t>notification_settings Table</w:t>
       </w:r>
     </w:p>
     <w:tbl>
@@ -1645,7 +1356,7 @@
               <w:jc w:val="left"/>
             </w:pPr>
             <w:r>
-              <w:t>tank_id</w:t>
+              <w:t>uid</w:t>
             </w:r>
           </w:p>
         </w:tc>
@@ -1673,137 +1384,570 @@
               <w:jc w:val="left"/>
             </w:pPr>
             <w:r>
-              <w:t>PRIMARY KEY; NOT NULL</w:t>
-            </w:r>
-          </w:p>
-        </w:tc>
-        <w:tc>
-          <w:tcPr>
-            <w:tcW w:w="1656" w:type="dxa"/>
-          </w:tcPr>
-          <w:p>
-            <w:pPr>
-              <w:spacing w:after="0" w:line="240" w:lineRule="auto"/>
-              <w:jc w:val="left"/>
-            </w:pPr>
-            <w:r>
-              <w:t>tank_001</w:t>
-            </w:r>
-          </w:p>
-        </w:tc>
-        <w:tc>
-          <w:tcPr>
-            <w:tcW w:w="2808" w:type="dxa"/>
-          </w:tcPr>
-          <w:p>
-            <w:pPr>
-              <w:spacing w:after="0" w:line="240" w:lineRule="auto"/>
-              <w:jc w:val="left"/>
-            </w:pPr>
-            <w:r>
-              <w:t>Identifier of the tank record.</w:t>
-            </w:r>
-          </w:p>
-        </w:tc>
-      </w:tr>
-      <w:tr>
-        <w:tc>
-          <w:tcPr>
-            <w:tcW w:w="1458" w:type="dxa"/>
-          </w:tcPr>
-          <w:p>
-            <w:pPr>
-              <w:spacing w:after="0" w:line="240" w:lineRule="auto"/>
-              <w:jc w:val="left"/>
-            </w:pPr>
-            <w:r>
-              <w:t>owner_uid</w:t>
-            </w:r>
-          </w:p>
-        </w:tc>
-        <w:tc>
-          <w:tcPr>
-            <w:tcW w:w="1350" w:type="dxa"/>
-          </w:tcPr>
-          <w:p>
-            <w:pPr>
-              <w:spacing w:after="0" w:line="240" w:lineRule="auto"/>
-              <w:jc w:val="left"/>
-            </w:pPr>
-            <w:r>
-              <w:t>varchar</w:t>
-            </w:r>
-          </w:p>
-        </w:tc>
-        <w:tc>
-          <w:tcPr>
-            <w:tcW w:w="1656" w:type="dxa"/>
-          </w:tcPr>
-          <w:p>
-            <w:pPr>
-              <w:spacing w:after="0" w:line="240" w:lineRule="auto"/>
-              <w:jc w:val="left"/>
-            </w:pPr>
-            <w:r>
-              <w:t>FOREIGN KEY; NOT NULL; UNIQUE</w:t>
-            </w:r>
-          </w:p>
-        </w:tc>
-        <w:tc>
-          <w:tcPr>
-            <w:tcW w:w="1656" w:type="dxa"/>
-          </w:tcPr>
-          <w:p>
-            <w:pPr>
-              <w:spacing w:after="0" w:line="240" w:lineRule="auto"/>
-              <w:jc w:val="left"/>
-            </w:pPr>
-            <w:r>
-              <w:t>owner_uid_001</w:t>
-            </w:r>
-          </w:p>
-        </w:tc>
-        <w:tc>
-          <w:tcPr>
-            <w:tcW w:w="2808" w:type="dxa"/>
-          </w:tcPr>
-          <w:p>
-            <w:pPr>
-              <w:spacing w:after="0" w:line="240" w:lineRule="auto"/>
-              <w:jc w:val="left"/>
-            </w:pPr>
-            <w:r>
-              <w:t>UID of the owner responsible for the tank.</w:t>
-            </w:r>
-          </w:p>
-        </w:tc>
-      </w:tr>
-      <w:tr>
-        <w:tc>
-          <w:tcPr>
-            <w:tcW w:w="1458" w:type="dxa"/>
-          </w:tcPr>
-          <w:p>
-            <w:pPr>
-              <w:spacing w:after="0" w:line="240" w:lineRule="auto"/>
-              <w:jc w:val="left"/>
-            </w:pPr>
-            <w:r>
-              <w:t>current_batch_id</w:t>
-            </w:r>
-          </w:p>
-        </w:tc>
-        <w:tc>
-          <w:tcPr>
-            <w:tcW w:w="1350" w:type="dxa"/>
-          </w:tcPr>
-          <w:p>
-            <w:pPr>
-              <w:spacing w:after="0" w:line="240" w:lineRule="auto"/>
-              <w:jc w:val="left"/>
-            </w:pPr>
-            <w:r>
-              <w:t>varchar</w:t>
+              <w:t>PRIMARY KEY; FOREIGN KEY; NOT NULL</w:t>
+            </w:r>
+          </w:p>
+        </w:tc>
+        <w:tc>
+          <w:tcPr>
+            <w:tcW w:w="1656" w:type="dxa"/>
+          </w:tcPr>
+          <w:p>
+            <w:pPr>
+              <w:spacing w:after="0" w:line="240" w:lineRule="auto"/>
+              <w:jc w:val="left"/>
+            </w:pPr>
+            <w:r>
+              <w:t>uid_001</w:t>
+            </w:r>
+          </w:p>
+        </w:tc>
+        <w:tc>
+          <w:tcPr>
+            <w:tcW w:w="2808" w:type="dxa"/>
+          </w:tcPr>
+          <w:p>
+            <w:pPr>
+              <w:spacing w:after="0" w:line="240" w:lineRule="auto"/>
+              <w:jc w:val="left"/>
+            </w:pPr>
+            <w:r>
+              <w:t>Unique identifier of the associated user account.</w:t>
+            </w:r>
+          </w:p>
+        </w:tc>
+      </w:tr>
+      <w:tr>
+        <w:tc>
+          <w:tcPr>
+            <w:tcW w:w="1458" w:type="dxa"/>
+          </w:tcPr>
+          <w:p>
+            <w:pPr>
+              <w:spacing w:after="0" w:line="240" w:lineRule="auto"/>
+              <w:jc w:val="left"/>
+            </w:pPr>
+            <w:r>
+              <w:t>sound</w:t>
+            </w:r>
+          </w:p>
+        </w:tc>
+        <w:tc>
+          <w:tcPr>
+            <w:tcW w:w="1350" w:type="dxa"/>
+          </w:tcPr>
+          <w:p>
+            <w:pPr>
+              <w:spacing w:after="0" w:line="240" w:lineRule="auto"/>
+              <w:jc w:val="left"/>
+            </w:pPr>
+            <w:r>
+              <w:t>boolean</w:t>
+            </w:r>
+          </w:p>
+        </w:tc>
+        <w:tc>
+          <w:tcPr>
+            <w:tcW w:w="1656" w:type="dxa"/>
+          </w:tcPr>
+          <w:p>
+            <w:pPr>
+              <w:spacing w:after="0" w:line="240" w:lineRule="auto"/>
+              <w:jc w:val="left"/>
+            </w:pPr>
+            <w:r>
+              <w:t>NOT NULL; DEFAULT true</w:t>
+            </w:r>
+          </w:p>
+        </w:tc>
+        <w:tc>
+          <w:tcPr>
+            <w:tcW w:w="1656" w:type="dxa"/>
+          </w:tcPr>
+          <w:p>
+            <w:pPr>
+              <w:spacing w:after="0" w:line="240" w:lineRule="auto"/>
+              <w:jc w:val="left"/>
+            </w:pPr>
+            <w:r>
+              <w:t>true | false</w:t>
+            </w:r>
+          </w:p>
+        </w:tc>
+        <w:tc>
+          <w:tcPr>
+            <w:tcW w:w="2808" w:type="dxa"/>
+          </w:tcPr>
+          <w:p>
+            <w:pPr>
+              <w:spacing w:after="0" w:line="240" w:lineRule="auto"/>
+              <w:jc w:val="left"/>
+            </w:pPr>
+            <w:r>
+              <w:t>Enables notification sound where permitted by the device.</w:t>
+            </w:r>
+          </w:p>
+        </w:tc>
+      </w:tr>
+      <w:tr>
+        <w:tc>
+          <w:tcPr>
+            <w:tcW w:w="1458" w:type="dxa"/>
+          </w:tcPr>
+          <w:p>
+            <w:pPr>
+              <w:spacing w:after="0" w:line="240" w:lineRule="auto"/>
+              <w:jc w:val="left"/>
+            </w:pPr>
+            <w:r>
+              <w:t>vibration</w:t>
+            </w:r>
+          </w:p>
+        </w:tc>
+        <w:tc>
+          <w:tcPr>
+            <w:tcW w:w="1350" w:type="dxa"/>
+          </w:tcPr>
+          <w:p>
+            <w:pPr>
+              <w:spacing w:after="0" w:line="240" w:lineRule="auto"/>
+              <w:jc w:val="left"/>
+            </w:pPr>
+            <w:r>
+              <w:t>boolean</w:t>
+            </w:r>
+          </w:p>
+        </w:tc>
+        <w:tc>
+          <w:tcPr>
+            <w:tcW w:w="1656" w:type="dxa"/>
+          </w:tcPr>
+          <w:p>
+            <w:pPr>
+              <w:spacing w:after="0" w:line="240" w:lineRule="auto"/>
+              <w:jc w:val="left"/>
+            </w:pPr>
+            <w:r>
+              <w:t>NOT NULL; DEFAULT true</w:t>
+            </w:r>
+          </w:p>
+        </w:tc>
+        <w:tc>
+          <w:tcPr>
+            <w:tcW w:w="1656" w:type="dxa"/>
+          </w:tcPr>
+          <w:p>
+            <w:pPr>
+              <w:spacing w:after="0" w:line="240" w:lineRule="auto"/>
+              <w:jc w:val="left"/>
+            </w:pPr>
+            <w:r>
+              <w:t>true | false</w:t>
+            </w:r>
+          </w:p>
+        </w:tc>
+        <w:tc>
+          <w:tcPr>
+            <w:tcW w:w="2808" w:type="dxa"/>
+          </w:tcPr>
+          <w:p>
+            <w:pPr>
+              <w:spacing w:after="0" w:line="240" w:lineRule="auto"/>
+              <w:jc w:val="left"/>
+            </w:pPr>
+            <w:r>
+              <w:t>Enables vibration where permitted by the device.</w:t>
+            </w:r>
+          </w:p>
+        </w:tc>
+      </w:tr>
+      <w:tr>
+        <w:tc>
+          <w:tcPr>
+            <w:tcW w:w="1458" w:type="dxa"/>
+          </w:tcPr>
+          <w:p>
+            <w:pPr>
+              <w:spacing w:after="0" w:line="240" w:lineRule="auto"/>
+              <w:jc w:val="left"/>
+            </w:pPr>
+            <w:r>
+              <w:t>critical</w:t>
+            </w:r>
+          </w:p>
+        </w:tc>
+        <w:tc>
+          <w:tcPr>
+            <w:tcW w:w="1350" w:type="dxa"/>
+          </w:tcPr>
+          <w:p>
+            <w:pPr>
+              <w:spacing w:after="0" w:line="240" w:lineRule="auto"/>
+              <w:jc w:val="left"/>
+            </w:pPr>
+            <w:r>
+              <w:t>boolean</w:t>
+            </w:r>
+          </w:p>
+        </w:tc>
+        <w:tc>
+          <w:tcPr>
+            <w:tcW w:w="1656" w:type="dxa"/>
+          </w:tcPr>
+          <w:p>
+            <w:pPr>
+              <w:spacing w:after="0" w:line="240" w:lineRule="auto"/>
+              <w:jc w:val="left"/>
+            </w:pPr>
+            <w:r>
+              <w:t>NOT NULL; DEFAULT true</w:t>
+            </w:r>
+          </w:p>
+        </w:tc>
+        <w:tc>
+          <w:tcPr>
+            <w:tcW w:w="1656" w:type="dxa"/>
+          </w:tcPr>
+          <w:p>
+            <w:pPr>
+              <w:spacing w:after="0" w:line="240" w:lineRule="auto"/>
+              <w:jc w:val="left"/>
+            </w:pPr>
+            <w:r>
+              <w:t>true | false</w:t>
+            </w:r>
+          </w:p>
+        </w:tc>
+        <w:tc>
+          <w:tcPr>
+            <w:tcW w:w="2808" w:type="dxa"/>
+          </w:tcPr>
+          <w:p>
+            <w:pPr>
+              <w:spacing w:after="0" w:line="240" w:lineRule="auto"/>
+              <w:jc w:val="left"/>
+            </w:pPr>
+            <w:r>
+              <w:t>Enables critical water-quality notifications.</w:t>
+            </w:r>
+          </w:p>
+        </w:tc>
+      </w:tr>
+      <w:tr>
+        <w:tc>
+          <w:tcPr>
+            <w:tcW w:w="1458" w:type="dxa"/>
+          </w:tcPr>
+          <w:p>
+            <w:pPr>
+              <w:spacing w:after="0" w:line="240" w:lineRule="auto"/>
+              <w:jc w:val="left"/>
+            </w:pPr>
+            <w:r>
+              <w:t>warning</w:t>
+            </w:r>
+          </w:p>
+        </w:tc>
+        <w:tc>
+          <w:tcPr>
+            <w:tcW w:w="1350" w:type="dxa"/>
+          </w:tcPr>
+          <w:p>
+            <w:pPr>
+              <w:spacing w:after="0" w:line="240" w:lineRule="auto"/>
+              <w:jc w:val="left"/>
+            </w:pPr>
+            <w:r>
+              <w:t>boolean</w:t>
+            </w:r>
+          </w:p>
+        </w:tc>
+        <w:tc>
+          <w:tcPr>
+            <w:tcW w:w="1656" w:type="dxa"/>
+          </w:tcPr>
+          <w:p>
+            <w:pPr>
+              <w:spacing w:after="0" w:line="240" w:lineRule="auto"/>
+              <w:jc w:val="left"/>
+            </w:pPr>
+            <w:r>
+              <w:t>NOT NULL; DEFAULT true</w:t>
+            </w:r>
+          </w:p>
+        </w:tc>
+        <w:tc>
+          <w:tcPr>
+            <w:tcW w:w="1656" w:type="dxa"/>
+          </w:tcPr>
+          <w:p>
+            <w:pPr>
+              <w:spacing w:after="0" w:line="240" w:lineRule="auto"/>
+              <w:jc w:val="left"/>
+            </w:pPr>
+            <w:r>
+              <w:t>true | false</w:t>
+            </w:r>
+          </w:p>
+        </w:tc>
+        <w:tc>
+          <w:tcPr>
+            <w:tcW w:w="2808" w:type="dxa"/>
+          </w:tcPr>
+          <w:p>
+            <w:pPr>
+              <w:spacing w:after="0" w:line="240" w:lineRule="auto"/>
+              <w:jc w:val="left"/>
+            </w:pPr>
+            <w:r>
+              <w:t>Enables warning-level water-quality notifications.</w:t>
+            </w:r>
+          </w:p>
+        </w:tc>
+      </w:tr>
+      <w:tr>
+        <w:tc>
+          <w:tcPr>
+            <w:tcW w:w="1458" w:type="dxa"/>
+          </w:tcPr>
+          <w:p>
+            <w:pPr>
+              <w:spacing w:after="0" w:line="240" w:lineRule="auto"/>
+              <w:jc w:val="left"/>
+            </w:pPr>
+            <w:r>
+              <w:lastRenderedPageBreak/>
+              <w:t>feeding</w:t>
+            </w:r>
+          </w:p>
+        </w:tc>
+        <w:tc>
+          <w:tcPr>
+            <w:tcW w:w="1350" w:type="dxa"/>
+          </w:tcPr>
+          <w:p>
+            <w:pPr>
+              <w:spacing w:after="0" w:line="240" w:lineRule="auto"/>
+              <w:jc w:val="left"/>
+            </w:pPr>
+            <w:r>
+              <w:t>boolean</w:t>
+            </w:r>
+          </w:p>
+        </w:tc>
+        <w:tc>
+          <w:tcPr>
+            <w:tcW w:w="1656" w:type="dxa"/>
+          </w:tcPr>
+          <w:p>
+            <w:pPr>
+              <w:spacing w:after="0" w:line="240" w:lineRule="auto"/>
+              <w:jc w:val="left"/>
+            </w:pPr>
+            <w:r>
+              <w:t>NOT NULL; DEFAULT true</w:t>
+            </w:r>
+          </w:p>
+        </w:tc>
+        <w:tc>
+          <w:tcPr>
+            <w:tcW w:w="1656" w:type="dxa"/>
+          </w:tcPr>
+          <w:p>
+            <w:pPr>
+              <w:spacing w:after="0" w:line="240" w:lineRule="auto"/>
+              <w:jc w:val="left"/>
+            </w:pPr>
+            <w:r>
+              <w:t>true | false</w:t>
+            </w:r>
+          </w:p>
+        </w:tc>
+        <w:tc>
+          <w:tcPr>
+            <w:tcW w:w="2808" w:type="dxa"/>
+          </w:tcPr>
+          <w:p>
+            <w:pPr>
+              <w:spacing w:after="0" w:line="240" w:lineRule="auto"/>
+              <w:jc w:val="left"/>
+            </w:pPr>
+            <w:r>
+              <w:t>Enables feeding reminders and completed/skipped feeding results.</w:t>
+            </w:r>
+          </w:p>
+        </w:tc>
+      </w:tr>
+      <w:tr>
+        <w:tc>
+          <w:tcPr>
+            <w:tcW w:w="1458" w:type="dxa"/>
+          </w:tcPr>
+          <w:p>
+            <w:pPr>
+              <w:spacing w:after="0" w:line="240" w:lineRule="auto"/>
+              <w:jc w:val="left"/>
+            </w:pPr>
+            <w:r>
+              <w:t>sampling</w:t>
+            </w:r>
+          </w:p>
+        </w:tc>
+        <w:tc>
+          <w:tcPr>
+            <w:tcW w:w="1350" w:type="dxa"/>
+          </w:tcPr>
+          <w:p>
+            <w:pPr>
+              <w:spacing w:after="0" w:line="240" w:lineRule="auto"/>
+              <w:jc w:val="left"/>
+            </w:pPr>
+            <w:r>
+              <w:t>boolean</w:t>
+            </w:r>
+          </w:p>
+        </w:tc>
+        <w:tc>
+          <w:tcPr>
+            <w:tcW w:w="1656" w:type="dxa"/>
+          </w:tcPr>
+          <w:p>
+            <w:pPr>
+              <w:spacing w:after="0" w:line="240" w:lineRule="auto"/>
+              <w:jc w:val="left"/>
+            </w:pPr>
+            <w:r>
+              <w:t>NOT NULL; DEFAULT true</w:t>
+            </w:r>
+          </w:p>
+        </w:tc>
+        <w:tc>
+          <w:tcPr>
+            <w:tcW w:w="1656" w:type="dxa"/>
+          </w:tcPr>
+          <w:p>
+            <w:pPr>
+              <w:spacing w:after="0" w:line="240" w:lineRule="auto"/>
+              <w:jc w:val="left"/>
+            </w:pPr>
+            <w:r>
+              <w:t>true | false</w:t>
+            </w:r>
+          </w:p>
+        </w:tc>
+        <w:tc>
+          <w:tcPr>
+            <w:tcW w:w="2808" w:type="dxa"/>
+          </w:tcPr>
+          <w:p>
+            <w:pPr>
+              <w:spacing w:after="0" w:line="240" w:lineRule="auto"/>
+              <w:jc w:val="left"/>
+            </w:pPr>
+            <w:r>
+              <w:t>Enables tank sampling reminders.</w:t>
+            </w:r>
+          </w:p>
+        </w:tc>
+      </w:tr>
+      <w:tr>
+        <w:tc>
+          <w:tcPr>
+            <w:tcW w:w="1458" w:type="dxa"/>
+          </w:tcPr>
+          <w:p>
+            <w:pPr>
+              <w:spacing w:after="0" w:line="240" w:lineRule="auto"/>
+              <w:jc w:val="left"/>
+            </w:pPr>
+            <w:r>
+              <w:t>operational</w:t>
+            </w:r>
+          </w:p>
+        </w:tc>
+        <w:tc>
+          <w:tcPr>
+            <w:tcW w:w="1350" w:type="dxa"/>
+          </w:tcPr>
+          <w:p>
+            <w:pPr>
+              <w:spacing w:after="0" w:line="240" w:lineRule="auto"/>
+              <w:jc w:val="left"/>
+            </w:pPr>
+            <w:r>
+              <w:t>boolean</w:t>
+            </w:r>
+          </w:p>
+        </w:tc>
+        <w:tc>
+          <w:tcPr>
+            <w:tcW w:w="1656" w:type="dxa"/>
+          </w:tcPr>
+          <w:p>
+            <w:pPr>
+              <w:spacing w:after="0" w:line="240" w:lineRule="auto"/>
+              <w:jc w:val="left"/>
+            </w:pPr>
+            <w:r>
+              <w:t>NOT NULL; DEFAULT true</w:t>
+            </w:r>
+          </w:p>
+        </w:tc>
+        <w:tc>
+          <w:tcPr>
+            <w:tcW w:w="1656" w:type="dxa"/>
+          </w:tcPr>
+          <w:p>
+            <w:pPr>
+              <w:spacing w:after="0" w:line="240" w:lineRule="auto"/>
+              <w:jc w:val="left"/>
+            </w:pPr>
+            <w:r>
+              <w:t>true | false</w:t>
+            </w:r>
+          </w:p>
+        </w:tc>
+        <w:tc>
+          <w:tcPr>
+            <w:tcW w:w="2808" w:type="dxa"/>
+          </w:tcPr>
+          <w:p>
+            <w:pPr>
+              <w:spacing w:after="0" w:line="240" w:lineRule="auto"/>
+              <w:jc w:val="left"/>
+            </w:pPr>
+            <w:r>
+              <w:t>Enables actuator, device, and sensor-recovery updates.</w:t>
+            </w:r>
+          </w:p>
+        </w:tc>
+      </w:tr>
+      <w:tr>
+        <w:tc>
+          <w:tcPr>
+            <w:tcW w:w="1458" w:type="dxa"/>
+          </w:tcPr>
+          <w:p>
+            <w:pPr>
+              <w:spacing w:after="0" w:line="240" w:lineRule="auto"/>
+              <w:jc w:val="left"/>
+            </w:pPr>
+            <w:r>
+              <w:t>updated_at</w:t>
+            </w:r>
+          </w:p>
+        </w:tc>
+        <w:tc>
+          <w:tcPr>
+            <w:tcW w:w="1350" w:type="dxa"/>
+          </w:tcPr>
+          <w:p>
+            <w:pPr>
+              <w:spacing w:after="0" w:line="240" w:lineRule="auto"/>
+              <w:jc w:val="left"/>
+            </w:pPr>
+            <w:r>
+              <w:t>timestamp</w:t>
             </w:r>
           </w:p>
         </w:tc>
@@ -1831,150 +1975,6 @@
               <w:jc w:val="left"/>
             </w:pPr>
             <w:r>
-              <w:t>batch_001</w:t>
-            </w:r>
-          </w:p>
-        </w:tc>
-        <w:tc>
-          <w:tcPr>
-            <w:tcW w:w="2808" w:type="dxa"/>
-          </w:tcPr>
-          <w:p>
-            <w:pPr>
-              <w:spacing w:after="0" w:line="240" w:lineRule="auto"/>
-              <w:jc w:val="left"/>
-            </w:pPr>
-            <w:r>
-              <w:t>ID of the currently selected batch document under tanks/{tankId}/batches (tank pointer).</w:t>
-            </w:r>
-          </w:p>
-        </w:tc>
-      </w:tr>
-      <w:tr>
-        <w:tc>
-          <w:tcPr>
-            <w:tcW w:w="1458" w:type="dxa"/>
-          </w:tcPr>
-          <w:p>
-            <w:pPr>
-              <w:spacing w:after="0" w:line="240" w:lineRule="auto"/>
-              <w:jc w:val="left"/>
-            </w:pPr>
-            <w:r>
-              <w:t>is_initialized</w:t>
-            </w:r>
-          </w:p>
-        </w:tc>
-        <w:tc>
-          <w:tcPr>
-            <w:tcW w:w="1350" w:type="dxa"/>
-          </w:tcPr>
-          <w:p>
-            <w:pPr>
-              <w:spacing w:after="0" w:line="240" w:lineRule="auto"/>
-              <w:jc w:val="left"/>
-            </w:pPr>
-            <w:r>
-              <w:t>boolean</w:t>
-            </w:r>
-          </w:p>
-        </w:tc>
-        <w:tc>
-          <w:tcPr>
-            <w:tcW w:w="1656" w:type="dxa"/>
-          </w:tcPr>
-          <w:p>
-            <w:pPr>
-              <w:spacing w:after="0" w:line="240" w:lineRule="auto"/>
-              <w:jc w:val="left"/>
-            </w:pPr>
-            <w:r>
-              <w:t>NOT NULL; DEFAULT false</w:t>
-            </w:r>
-          </w:p>
-        </w:tc>
-        <w:tc>
-          <w:tcPr>
-            <w:tcW w:w="1656" w:type="dxa"/>
-          </w:tcPr>
-          <w:p>
-            <w:pPr>
-              <w:spacing w:after="0" w:line="240" w:lineRule="auto"/>
-              <w:jc w:val="left"/>
-            </w:pPr>
-            <w:r>
-              <w:t>true | false</w:t>
-            </w:r>
-          </w:p>
-        </w:tc>
-        <w:tc>
-          <w:tcPr>
-            <w:tcW w:w="2808" w:type="dxa"/>
-          </w:tcPr>
-          <w:p>
-            <w:pPr>
-              <w:spacing w:after="0" w:line="240" w:lineRule="auto"/>
-              <w:jc w:val="left"/>
-            </w:pPr>
-            <w:r>
-              <w:t>True once a grow-out batch has been initialized for the tank.</w:t>
-            </w:r>
-          </w:p>
-        </w:tc>
-      </w:tr>
-      <w:tr>
-        <w:tc>
-          <w:tcPr>
-            <w:tcW w:w="1458" w:type="dxa"/>
-          </w:tcPr>
-          <w:p>
-            <w:pPr>
-              <w:spacing w:after="0" w:line="240" w:lineRule="auto"/>
-              <w:jc w:val="left"/>
-            </w:pPr>
-            <w:r>
-              <w:t>created_at</w:t>
-            </w:r>
-          </w:p>
-        </w:tc>
-        <w:tc>
-          <w:tcPr>
-            <w:tcW w:w="1350" w:type="dxa"/>
-          </w:tcPr>
-          <w:p>
-            <w:pPr>
-              <w:spacing w:after="0" w:line="240" w:lineRule="auto"/>
-              <w:jc w:val="left"/>
-            </w:pPr>
-            <w:r>
-              <w:t>timestamp</w:t>
-            </w:r>
-          </w:p>
-        </w:tc>
-        <w:tc>
-          <w:tcPr>
-            <w:tcW w:w="1656" w:type="dxa"/>
-          </w:tcPr>
-          <w:p>
-            <w:pPr>
-              <w:spacing w:after="0" w:line="240" w:lineRule="auto"/>
-              <w:jc w:val="left"/>
-            </w:pPr>
-            <w:r>
-              <w:t>NOT NULL</w:t>
-            </w:r>
-          </w:p>
-        </w:tc>
-        <w:tc>
-          <w:tcPr>
-            <w:tcW w:w="1656" w:type="dxa"/>
-          </w:tcPr>
-          <w:p>
-            <w:pPr>
-              <w:spacing w:after="0" w:line="240" w:lineRule="auto"/>
-              <w:jc w:val="left"/>
-            </w:pPr>
-            <w:r>
               <w:t>2026-09-06 08:00:00</w:t>
             </w:r>
           </w:p>
@@ -1989,7 +1989,7 @@
               <w:jc w:val="left"/>
             </w:pPr>
             <w:r>
-              <w:t>Date and time this record was created.</w:t>
+              <w:t>Date and time this record was last updated.</w:t>
             </w:r>
           </w:p>
         </w:tc>
@@ -2006,6 +2006,640 @@
           <w:rFonts w:ascii="Arial" w:hAnsi="Arial" w:eastAsia="Arial"/>
         </w:rPr>
         <w:t>Table 4</w:t>
+      </w:r>
+    </w:p>
+    <w:p>
+      <w:pPr>
+        <w:keepNext/>
+        <w:jc w:val="center"/>
+      </w:pPr>
+      <w:r>
+        <w:rPr>
+          <w:b/>
+        </w:rPr>
+        <w:t>notifications Table</w:t>
+      </w:r>
+    </w:p>
+    <w:tbl>
+      <w:tblPr>
+        <w:tblStyle w:val="TableGrid"/>
+        <w:tblW w:w="8928" w:type="dxa"/>
+        <w:tblLayout w:type="fixed"/>
+        <w:tblLook w:val="04A0" w:firstRow="1" w:lastRow="0" w:firstColumn="1" w:lastColumn="0" w:noHBand="0" w:noVBand="1"/>
+      </w:tblPr>
+      <w:tblGrid>
+        <w:gridCol w:w="1458"/>
+        <w:gridCol w:w="1350"/>
+        <w:gridCol w:w="1656"/>
+        <w:gridCol w:w="1656"/>
+        <w:gridCol w:w="2808"/>
+      </w:tblGrid>
+      <w:tr>
+        <w:trPr>
+          <w:tblHeader/>
+        </w:trPr>
+        <w:tc>
+          <w:tcPr>
+            <w:tcW w:w="1458" w:type="dxa"/>
+          </w:tcPr>
+          <w:p>
+            <w:pPr>
+              <w:spacing w:after="0" w:line="240" w:lineRule="auto"/>
+              <w:jc w:val="left"/>
+            </w:pPr>
+            <w:r>
+              <w:rPr>
+                <w:b/>
+              </w:rPr>
+              <w:t>Field Name</w:t>
+            </w:r>
+          </w:p>
+        </w:tc>
+        <w:tc>
+          <w:tcPr>
+            <w:tcW w:w="1350" w:type="dxa"/>
+          </w:tcPr>
+          <w:p>
+            <w:pPr>
+              <w:spacing w:after="0" w:line="240" w:lineRule="auto"/>
+              <w:jc w:val="left"/>
+            </w:pPr>
+            <w:r>
+              <w:rPr>
+                <w:b/>
+              </w:rPr>
+              <w:t>Data Type</w:t>
+            </w:r>
+          </w:p>
+        </w:tc>
+        <w:tc>
+          <w:tcPr>
+            <w:tcW w:w="1656" w:type="dxa"/>
+          </w:tcPr>
+          <w:p>
+            <w:pPr>
+              <w:spacing w:after="0" w:line="240" w:lineRule="auto"/>
+              <w:jc w:val="left"/>
+            </w:pPr>
+            <w:r>
+              <w:rPr>
+                <w:b/>
+              </w:rPr>
+              <w:t>Constraint</w:t>
+            </w:r>
+          </w:p>
+        </w:tc>
+        <w:tc>
+          <w:tcPr>
+            <w:tcW w:w="1656" w:type="dxa"/>
+          </w:tcPr>
+          <w:p>
+            <w:pPr>
+              <w:spacing w:after="0" w:line="240" w:lineRule="auto"/>
+              <w:jc w:val="left"/>
+            </w:pPr>
+            <w:r>
+              <w:rPr>
+                <w:b/>
+              </w:rPr>
+              <w:t>Format</w:t>
+            </w:r>
+          </w:p>
+        </w:tc>
+        <w:tc>
+          <w:tcPr>
+            <w:tcW w:w="2808" w:type="dxa"/>
+          </w:tcPr>
+          <w:p>
+            <w:pPr>
+              <w:spacing w:after="0" w:line="240" w:lineRule="auto"/>
+              <w:jc w:val="left"/>
+            </w:pPr>
+            <w:r>
+              <w:rPr>
+                <w:b/>
+              </w:rPr>
+              <w:t>Description</w:t>
+            </w:r>
+          </w:p>
+        </w:tc>
+      </w:tr>
+      <w:tr>
+        <w:tc>
+          <w:tcPr>
+            <w:tcW w:w="1458" w:type="dxa"/>
+          </w:tcPr>
+          <w:p>
+            <w:pPr>
+              <w:spacing w:after="0" w:line="240" w:lineRule="auto"/>
+              <w:jc w:val="left"/>
+            </w:pPr>
+            <w:r>
+              <w:t>notification_id</w:t>
+            </w:r>
+          </w:p>
+        </w:tc>
+        <w:tc>
+          <w:tcPr>
+            <w:tcW w:w="1350" w:type="dxa"/>
+          </w:tcPr>
+          <w:p>
+            <w:pPr>
+              <w:spacing w:after="0" w:line="240" w:lineRule="auto"/>
+              <w:jc w:val="left"/>
+            </w:pPr>
+            <w:r>
+              <w:t>varchar</w:t>
+            </w:r>
+          </w:p>
+        </w:tc>
+        <w:tc>
+          <w:tcPr>
+            <w:tcW w:w="1656" w:type="dxa"/>
+          </w:tcPr>
+          <w:p>
+            <w:pPr>
+              <w:spacing w:after="0" w:line="240" w:lineRule="auto"/>
+              <w:jc w:val="left"/>
+            </w:pPr>
+            <w:r>
+              <w:t>PRIMARY KEY; NOT NULL</w:t>
+            </w:r>
+          </w:p>
+        </w:tc>
+        <w:tc>
+          <w:tcPr>
+            <w:tcW w:w="1656" w:type="dxa"/>
+          </w:tcPr>
+          <w:p>
+            <w:pPr>
+              <w:spacing w:after="0" w:line="240" w:lineRule="auto"/>
+              <w:jc w:val="left"/>
+            </w:pPr>
+            <w:r>
+              <w:t>notification_001</w:t>
+            </w:r>
+          </w:p>
+        </w:tc>
+        <w:tc>
+          <w:tcPr>
+            <w:tcW w:w="2808" w:type="dxa"/>
+          </w:tcPr>
+          <w:p>
+            <w:pPr>
+              <w:spacing w:after="0" w:line="240" w:lineRule="auto"/>
+              <w:jc w:val="left"/>
+            </w:pPr>
+            <w:r>
+              <w:t>Identifier of the notification record.</w:t>
+            </w:r>
+          </w:p>
+        </w:tc>
+      </w:tr>
+      <w:tr>
+        <w:tc>
+          <w:tcPr>
+            <w:tcW w:w="1458" w:type="dxa"/>
+          </w:tcPr>
+          <w:p>
+            <w:pPr>
+              <w:spacing w:after="0" w:line="240" w:lineRule="auto"/>
+              <w:jc w:val="left"/>
+            </w:pPr>
+            <w:r>
+              <w:t>uid</w:t>
+            </w:r>
+          </w:p>
+        </w:tc>
+        <w:tc>
+          <w:tcPr>
+            <w:tcW w:w="1350" w:type="dxa"/>
+          </w:tcPr>
+          <w:p>
+            <w:pPr>
+              <w:spacing w:after="0" w:line="240" w:lineRule="auto"/>
+              <w:jc w:val="left"/>
+            </w:pPr>
+            <w:r>
+              <w:t>varchar</w:t>
+            </w:r>
+          </w:p>
+        </w:tc>
+        <w:tc>
+          <w:tcPr>
+            <w:tcW w:w="1656" w:type="dxa"/>
+          </w:tcPr>
+          <w:p>
+            <w:pPr>
+              <w:spacing w:after="0" w:line="240" w:lineRule="auto"/>
+              <w:jc w:val="left"/>
+            </w:pPr>
+            <w:r>
+              <w:t>FOREIGN KEY; NOT NULL</w:t>
+            </w:r>
+          </w:p>
+        </w:tc>
+        <w:tc>
+          <w:tcPr>
+            <w:tcW w:w="1656" w:type="dxa"/>
+          </w:tcPr>
+          <w:p>
+            <w:pPr>
+              <w:spacing w:after="0" w:line="240" w:lineRule="auto"/>
+              <w:jc w:val="left"/>
+            </w:pPr>
+            <w:r>
+              <w:t>uid_001</w:t>
+            </w:r>
+          </w:p>
+        </w:tc>
+        <w:tc>
+          <w:tcPr>
+            <w:tcW w:w="2808" w:type="dxa"/>
+          </w:tcPr>
+          <w:p>
+            <w:pPr>
+              <w:spacing w:after="0" w:line="240" w:lineRule="auto"/>
+              <w:jc w:val="left"/>
+            </w:pPr>
+            <w:r>
+              <w:t>Unique identifier of the associated user account.</w:t>
+            </w:r>
+          </w:p>
+        </w:tc>
+      </w:tr>
+      <w:tr>
+        <w:tc>
+          <w:tcPr>
+            <w:tcW w:w="1458" w:type="dxa"/>
+          </w:tcPr>
+          <w:p>
+            <w:pPr>
+              <w:spacing w:after="0" w:line="240" w:lineRule="auto"/>
+              <w:jc w:val="left"/>
+            </w:pPr>
+            <w:r>
+              <w:t>notif_type</w:t>
+            </w:r>
+          </w:p>
+        </w:tc>
+        <w:tc>
+          <w:tcPr>
+            <w:tcW w:w="1350" w:type="dxa"/>
+          </w:tcPr>
+          <w:p>
+            <w:pPr>
+              <w:spacing w:after="0" w:line="240" w:lineRule="auto"/>
+              <w:jc w:val="left"/>
+            </w:pPr>
+            <w:r>
+              <w:t>varchar</w:t>
+            </w:r>
+          </w:p>
+        </w:tc>
+        <w:tc>
+          <w:tcPr>
+            <w:tcW w:w="1656" w:type="dxa"/>
+          </w:tcPr>
+          <w:p>
+            <w:pPr>
+              <w:spacing w:after="0" w:line="240" w:lineRule="auto"/>
+              <w:jc w:val="left"/>
+            </w:pPr>
+            <w:r>
+              <w:t>NOT NULL</w:t>
+            </w:r>
+          </w:p>
+        </w:tc>
+        <w:tc>
+          <w:tcPr>
+            <w:tcW w:w="1656" w:type="dxa"/>
+          </w:tcPr>
+          <w:p>
+            <w:pPr>
+              <w:spacing w:after="0" w:line="240" w:lineRule="auto"/>
+              <w:jc w:val="left"/>
+            </w:pPr>
+            <w:r>
+              <w:t>critical | warning | reminder | operational</w:t>
+            </w:r>
+          </w:p>
+        </w:tc>
+        <w:tc>
+          <w:tcPr>
+            <w:tcW w:w="2808" w:type="dxa"/>
+          </w:tcPr>
+          <w:p>
+            <w:pPr>
+              <w:spacing w:after="0" w:line="240" w:lineRule="auto"/>
+              <w:jc w:val="left"/>
+            </w:pPr>
+            <w:r>
+              <w:t>Notification category used for grouping and preference checks (Firestore field name: notif_type).</w:t>
+            </w:r>
+          </w:p>
+        </w:tc>
+      </w:tr>
+      <w:tr>
+        <w:tc>
+          <w:tcPr>
+            <w:tcW w:w="1458" w:type="dxa"/>
+          </w:tcPr>
+          <w:p>
+            <w:pPr>
+              <w:spacing w:after="0" w:line="240" w:lineRule="auto"/>
+              <w:jc w:val="left"/>
+            </w:pPr>
+            <w:r>
+              <w:t>title</w:t>
+            </w:r>
+          </w:p>
+        </w:tc>
+        <w:tc>
+          <w:tcPr>
+            <w:tcW w:w="1350" w:type="dxa"/>
+          </w:tcPr>
+          <w:p>
+            <w:pPr>
+              <w:spacing w:after="0" w:line="240" w:lineRule="auto"/>
+              <w:jc w:val="left"/>
+            </w:pPr>
+            <w:r>
+              <w:t>varchar</w:t>
+            </w:r>
+          </w:p>
+        </w:tc>
+        <w:tc>
+          <w:tcPr>
+            <w:tcW w:w="1656" w:type="dxa"/>
+          </w:tcPr>
+          <w:p>
+            <w:pPr>
+              <w:spacing w:after="0" w:line="240" w:lineRule="auto"/>
+              <w:jc w:val="left"/>
+            </w:pPr>
+            <w:r>
+              <w:t>NOT NULL</w:t>
+            </w:r>
+          </w:p>
+        </w:tc>
+        <w:tc>
+          <w:tcPr>
+            <w:tcW w:w="1656" w:type="dxa"/>
+          </w:tcPr>
+          <w:p>
+            <w:pPr>
+              <w:spacing w:after="0" w:line="240" w:lineRule="auto"/>
+              <w:jc w:val="left"/>
+            </w:pPr>
+            <w:r>
+              <w:t>Low feed level</w:t>
+            </w:r>
+          </w:p>
+        </w:tc>
+        <w:tc>
+          <w:tcPr>
+            <w:tcW w:w="2808" w:type="dxa"/>
+          </w:tcPr>
+          <w:p>
+            <w:pPr>
+              <w:spacing w:after="0" w:line="240" w:lineRule="auto"/>
+              <w:jc w:val="left"/>
+            </w:pPr>
+            <w:r>
+              <w:t>Short notification heading.</w:t>
+            </w:r>
+          </w:p>
+        </w:tc>
+      </w:tr>
+      <w:tr>
+        <w:tc>
+          <w:tcPr>
+            <w:tcW w:w="1458" w:type="dxa"/>
+          </w:tcPr>
+          <w:p>
+            <w:pPr>
+              <w:spacing w:after="0" w:line="240" w:lineRule="auto"/>
+              <w:jc w:val="left"/>
+            </w:pPr>
+            <w:r>
+              <w:t>body</w:t>
+            </w:r>
+          </w:p>
+        </w:tc>
+        <w:tc>
+          <w:tcPr>
+            <w:tcW w:w="1350" w:type="dxa"/>
+          </w:tcPr>
+          <w:p>
+            <w:pPr>
+              <w:spacing w:after="0" w:line="240" w:lineRule="auto"/>
+              <w:jc w:val="left"/>
+            </w:pPr>
+            <w:r>
+              <w:t>text</w:t>
+            </w:r>
+          </w:p>
+        </w:tc>
+        <w:tc>
+          <w:tcPr>
+            <w:tcW w:w="1656" w:type="dxa"/>
+          </w:tcPr>
+          <w:p>
+            <w:pPr>
+              <w:spacing w:after="0" w:line="240" w:lineRule="auto"/>
+              <w:jc w:val="left"/>
+            </w:pPr>
+            <w:r>
+              <w:t>NOT NULL</w:t>
+            </w:r>
+          </w:p>
+        </w:tc>
+        <w:tc>
+          <w:tcPr>
+            <w:tcW w:w="1656" w:type="dxa"/>
+          </w:tcPr>
+          <w:p>
+            <w:pPr>
+              <w:spacing w:after="0" w:line="240" w:lineRule="auto"/>
+              <w:jc w:val="left"/>
+            </w:pPr>
+            <w:r>
+              <w:t>Feed level is at 18%.</w:t>
+            </w:r>
+          </w:p>
+        </w:tc>
+        <w:tc>
+          <w:tcPr>
+            <w:tcW w:w="2808" w:type="dxa"/>
+          </w:tcPr>
+          <w:p>
+            <w:pPr>
+              <w:spacing w:after="0" w:line="240" w:lineRule="auto"/>
+              <w:jc w:val="left"/>
+            </w:pPr>
+            <w:r>
+              <w:t>Detailed notification message.</w:t>
+            </w:r>
+          </w:p>
+        </w:tc>
+      </w:tr>
+      <w:tr>
+        <w:tc>
+          <w:tcPr>
+            <w:tcW w:w="1458" w:type="dxa"/>
+          </w:tcPr>
+          <w:p>
+            <w:pPr>
+              <w:spacing w:after="0" w:line="240" w:lineRule="auto"/>
+              <w:jc w:val="left"/>
+            </w:pPr>
+            <w:r>
+              <w:t>is_read</w:t>
+            </w:r>
+          </w:p>
+        </w:tc>
+        <w:tc>
+          <w:tcPr>
+            <w:tcW w:w="1350" w:type="dxa"/>
+          </w:tcPr>
+          <w:p>
+            <w:pPr>
+              <w:spacing w:after="0" w:line="240" w:lineRule="auto"/>
+              <w:jc w:val="left"/>
+            </w:pPr>
+            <w:r>
+              <w:t>boolean</w:t>
+            </w:r>
+          </w:p>
+        </w:tc>
+        <w:tc>
+          <w:tcPr>
+            <w:tcW w:w="1656" w:type="dxa"/>
+          </w:tcPr>
+          <w:p>
+            <w:pPr>
+              <w:spacing w:after="0" w:line="240" w:lineRule="auto"/>
+              <w:jc w:val="left"/>
+            </w:pPr>
+            <w:r>
+              <w:t>NOT NULL; DEFAULT false</w:t>
+            </w:r>
+          </w:p>
+        </w:tc>
+        <w:tc>
+          <w:tcPr>
+            <w:tcW w:w="1656" w:type="dxa"/>
+          </w:tcPr>
+          <w:p>
+            <w:pPr>
+              <w:spacing w:after="0" w:line="240" w:lineRule="auto"/>
+              <w:jc w:val="left"/>
+            </w:pPr>
+            <w:r>
+              <w:t>true | false</w:t>
+            </w:r>
+          </w:p>
+        </w:tc>
+        <w:tc>
+          <w:tcPr>
+            <w:tcW w:w="2808" w:type="dxa"/>
+          </w:tcPr>
+          <w:p>
+            <w:pPr>
+              <w:spacing w:after="0" w:line="240" w:lineRule="auto"/>
+              <w:jc w:val="left"/>
+            </w:pPr>
+            <w:r>
+              <w:t>Whether the user opened or marked the notification as read.</w:t>
+            </w:r>
+          </w:p>
+        </w:tc>
+      </w:tr>
+      <w:tr>
+        <w:tc>
+          <w:tcPr>
+            <w:tcW w:w="1458" w:type="dxa"/>
+          </w:tcPr>
+          <w:p>
+            <w:pPr>
+              <w:spacing w:after="0" w:line="240" w:lineRule="auto"/>
+              <w:jc w:val="left"/>
+            </w:pPr>
+            <w:r>
+              <w:t>created_at</w:t>
+            </w:r>
+          </w:p>
+        </w:tc>
+        <w:tc>
+          <w:tcPr>
+            <w:tcW w:w="1350" w:type="dxa"/>
+          </w:tcPr>
+          <w:p>
+            <w:pPr>
+              <w:spacing w:after="0" w:line="240" w:lineRule="auto"/>
+              <w:jc w:val="left"/>
+            </w:pPr>
+            <w:r>
+              <w:t>timestamp</w:t>
+            </w:r>
+          </w:p>
+        </w:tc>
+        <w:tc>
+          <w:tcPr>
+            <w:tcW w:w="1656" w:type="dxa"/>
+          </w:tcPr>
+          <w:p>
+            <w:pPr>
+              <w:spacing w:after="0" w:line="240" w:lineRule="auto"/>
+              <w:jc w:val="left"/>
+            </w:pPr>
+            <w:r>
+              <w:t>NOT NULL</w:t>
+            </w:r>
+          </w:p>
+        </w:tc>
+        <w:tc>
+          <w:tcPr>
+            <w:tcW w:w="1656" w:type="dxa"/>
+          </w:tcPr>
+          <w:p>
+            <w:pPr>
+              <w:spacing w:after="0" w:line="240" w:lineRule="auto"/>
+              <w:jc w:val="left"/>
+            </w:pPr>
+            <w:r>
+              <w:t>2026-09-06 08:00:00</w:t>
+            </w:r>
+          </w:p>
+        </w:tc>
+        <w:tc>
+          <w:tcPr>
+            <w:tcW w:w="2808" w:type="dxa"/>
+          </w:tcPr>
+          <w:p>
+            <w:pPr>
+              <w:spacing w:after="0" w:line="240" w:lineRule="auto"/>
+              <w:jc w:val="left"/>
+            </w:pPr>
+            <w:r>
+              <w:t>Date and time this record was created.</w:t>
+            </w:r>
+          </w:p>
+        </w:tc>
+      </w:tr>
+    </w:tbl>
+    <w:p/>
+    <w:p>
+      <w:pPr>
+        <w:keepNext/>
+        <w:jc w:val="center"/>
+      </w:pPr>
+      <w:r>
+        <w:rPr>
+          <w:rFonts w:ascii="Arial" w:hAnsi="Arial" w:eastAsia="Arial"/>
+        </w:rPr>
+        <w:t>Table 5</w:t>
       </w:r>
     </w:p>
     <w:p>
@@ -2480,640 +3114,6 @@
             </w:pPr>
             <w:r>
               <w:t>Time the assignment became effective.</w:t>
-            </w:r>
-          </w:p>
-        </w:tc>
-      </w:tr>
-    </w:tbl>
-    <w:p/>
-    <w:p>
-      <w:pPr>
-        <w:keepNext/>
-        <w:jc w:val="center"/>
-      </w:pPr>
-      <w:r>
-        <w:rPr>
-          <w:rFonts w:ascii="Arial" w:hAnsi="Arial" w:eastAsia="Arial"/>
-        </w:rPr>
-        <w:t>Table 5</w:t>
-      </w:r>
-    </w:p>
-    <w:p>
-      <w:pPr>
-        <w:keepNext/>
-        <w:jc w:val="center"/>
-      </w:pPr>
-      <w:r>
-        <w:rPr>
-          <w:b/>
-        </w:rPr>
-        <w:t>notifications Table</w:t>
-      </w:r>
-    </w:p>
-    <w:tbl>
-      <w:tblPr>
-        <w:tblStyle w:val="TableGrid"/>
-        <w:tblW w:w="8928" w:type="dxa"/>
-        <w:tblLayout w:type="fixed"/>
-        <w:tblLook w:val="04A0" w:firstRow="1" w:lastRow="0" w:firstColumn="1" w:lastColumn="0" w:noHBand="0" w:noVBand="1"/>
-      </w:tblPr>
-      <w:tblGrid>
-        <w:gridCol w:w="1458"/>
-        <w:gridCol w:w="1350"/>
-        <w:gridCol w:w="1656"/>
-        <w:gridCol w:w="1656"/>
-        <w:gridCol w:w="2808"/>
-      </w:tblGrid>
-      <w:tr>
-        <w:trPr>
-          <w:tblHeader/>
-        </w:trPr>
-        <w:tc>
-          <w:tcPr>
-            <w:tcW w:w="1458" w:type="dxa"/>
-          </w:tcPr>
-          <w:p>
-            <w:pPr>
-              <w:spacing w:after="0" w:line="240" w:lineRule="auto"/>
-              <w:jc w:val="left"/>
-            </w:pPr>
-            <w:r>
-              <w:rPr>
-                <w:b/>
-              </w:rPr>
-              <w:t>Field Name</w:t>
-            </w:r>
-          </w:p>
-        </w:tc>
-        <w:tc>
-          <w:tcPr>
-            <w:tcW w:w="1350" w:type="dxa"/>
-          </w:tcPr>
-          <w:p>
-            <w:pPr>
-              <w:spacing w:after="0" w:line="240" w:lineRule="auto"/>
-              <w:jc w:val="left"/>
-            </w:pPr>
-            <w:r>
-              <w:rPr>
-                <w:b/>
-              </w:rPr>
-              <w:t>Data Type</w:t>
-            </w:r>
-          </w:p>
-        </w:tc>
-        <w:tc>
-          <w:tcPr>
-            <w:tcW w:w="1656" w:type="dxa"/>
-          </w:tcPr>
-          <w:p>
-            <w:pPr>
-              <w:spacing w:after="0" w:line="240" w:lineRule="auto"/>
-              <w:jc w:val="left"/>
-            </w:pPr>
-            <w:r>
-              <w:rPr>
-                <w:b/>
-              </w:rPr>
-              <w:t>Constraint</w:t>
-            </w:r>
-          </w:p>
-        </w:tc>
-        <w:tc>
-          <w:tcPr>
-            <w:tcW w:w="1656" w:type="dxa"/>
-          </w:tcPr>
-          <w:p>
-            <w:pPr>
-              <w:spacing w:after="0" w:line="240" w:lineRule="auto"/>
-              <w:jc w:val="left"/>
-            </w:pPr>
-            <w:r>
-              <w:rPr>
-                <w:b/>
-              </w:rPr>
-              <w:t>Format</w:t>
-            </w:r>
-          </w:p>
-        </w:tc>
-        <w:tc>
-          <w:tcPr>
-            <w:tcW w:w="2808" w:type="dxa"/>
-          </w:tcPr>
-          <w:p>
-            <w:pPr>
-              <w:spacing w:after="0" w:line="240" w:lineRule="auto"/>
-              <w:jc w:val="left"/>
-            </w:pPr>
-            <w:r>
-              <w:rPr>
-                <w:b/>
-              </w:rPr>
-              <w:t>Description</w:t>
-            </w:r>
-          </w:p>
-        </w:tc>
-      </w:tr>
-      <w:tr>
-        <w:tc>
-          <w:tcPr>
-            <w:tcW w:w="1458" w:type="dxa"/>
-          </w:tcPr>
-          <w:p>
-            <w:pPr>
-              <w:spacing w:after="0" w:line="240" w:lineRule="auto"/>
-              <w:jc w:val="left"/>
-            </w:pPr>
-            <w:r>
-              <w:t>notification_id</w:t>
-            </w:r>
-          </w:p>
-        </w:tc>
-        <w:tc>
-          <w:tcPr>
-            <w:tcW w:w="1350" w:type="dxa"/>
-          </w:tcPr>
-          <w:p>
-            <w:pPr>
-              <w:spacing w:after="0" w:line="240" w:lineRule="auto"/>
-              <w:jc w:val="left"/>
-            </w:pPr>
-            <w:r>
-              <w:t>varchar</w:t>
-            </w:r>
-          </w:p>
-        </w:tc>
-        <w:tc>
-          <w:tcPr>
-            <w:tcW w:w="1656" w:type="dxa"/>
-          </w:tcPr>
-          <w:p>
-            <w:pPr>
-              <w:spacing w:after="0" w:line="240" w:lineRule="auto"/>
-              <w:jc w:val="left"/>
-            </w:pPr>
-            <w:r>
-              <w:t>PRIMARY KEY; NOT NULL</w:t>
-            </w:r>
-          </w:p>
-        </w:tc>
-        <w:tc>
-          <w:tcPr>
-            <w:tcW w:w="1656" w:type="dxa"/>
-          </w:tcPr>
-          <w:p>
-            <w:pPr>
-              <w:spacing w:after="0" w:line="240" w:lineRule="auto"/>
-              <w:jc w:val="left"/>
-            </w:pPr>
-            <w:r>
-              <w:t>notification_001</w:t>
-            </w:r>
-          </w:p>
-        </w:tc>
-        <w:tc>
-          <w:tcPr>
-            <w:tcW w:w="2808" w:type="dxa"/>
-          </w:tcPr>
-          <w:p>
-            <w:pPr>
-              <w:spacing w:after="0" w:line="240" w:lineRule="auto"/>
-              <w:jc w:val="left"/>
-            </w:pPr>
-            <w:r>
-              <w:t>Identifier of the notification record.</w:t>
-            </w:r>
-          </w:p>
-        </w:tc>
-      </w:tr>
-      <w:tr>
-        <w:tc>
-          <w:tcPr>
-            <w:tcW w:w="1458" w:type="dxa"/>
-          </w:tcPr>
-          <w:p>
-            <w:pPr>
-              <w:spacing w:after="0" w:line="240" w:lineRule="auto"/>
-              <w:jc w:val="left"/>
-            </w:pPr>
-            <w:r>
-              <w:t>uid</w:t>
-            </w:r>
-          </w:p>
-        </w:tc>
-        <w:tc>
-          <w:tcPr>
-            <w:tcW w:w="1350" w:type="dxa"/>
-          </w:tcPr>
-          <w:p>
-            <w:pPr>
-              <w:spacing w:after="0" w:line="240" w:lineRule="auto"/>
-              <w:jc w:val="left"/>
-            </w:pPr>
-            <w:r>
-              <w:t>varchar</w:t>
-            </w:r>
-          </w:p>
-        </w:tc>
-        <w:tc>
-          <w:tcPr>
-            <w:tcW w:w="1656" w:type="dxa"/>
-          </w:tcPr>
-          <w:p>
-            <w:pPr>
-              <w:spacing w:after="0" w:line="240" w:lineRule="auto"/>
-              <w:jc w:val="left"/>
-            </w:pPr>
-            <w:r>
-              <w:t>FOREIGN KEY; NOT NULL</w:t>
-            </w:r>
-          </w:p>
-        </w:tc>
-        <w:tc>
-          <w:tcPr>
-            <w:tcW w:w="1656" w:type="dxa"/>
-          </w:tcPr>
-          <w:p>
-            <w:pPr>
-              <w:spacing w:after="0" w:line="240" w:lineRule="auto"/>
-              <w:jc w:val="left"/>
-            </w:pPr>
-            <w:r>
-              <w:t>uid_001</w:t>
-            </w:r>
-          </w:p>
-        </w:tc>
-        <w:tc>
-          <w:tcPr>
-            <w:tcW w:w="2808" w:type="dxa"/>
-          </w:tcPr>
-          <w:p>
-            <w:pPr>
-              <w:spacing w:after="0" w:line="240" w:lineRule="auto"/>
-              <w:jc w:val="left"/>
-            </w:pPr>
-            <w:r>
-              <w:t>Unique identifier of the associated user account.</w:t>
-            </w:r>
-          </w:p>
-        </w:tc>
-      </w:tr>
-      <w:tr>
-        <w:tc>
-          <w:tcPr>
-            <w:tcW w:w="1458" w:type="dxa"/>
-          </w:tcPr>
-          <w:p>
-            <w:pPr>
-              <w:spacing w:after="0" w:line="240" w:lineRule="auto"/>
-              <w:jc w:val="left"/>
-            </w:pPr>
-            <w:r>
-              <w:t>notif_type</w:t>
-            </w:r>
-          </w:p>
-        </w:tc>
-        <w:tc>
-          <w:tcPr>
-            <w:tcW w:w="1350" w:type="dxa"/>
-          </w:tcPr>
-          <w:p>
-            <w:pPr>
-              <w:spacing w:after="0" w:line="240" w:lineRule="auto"/>
-              <w:jc w:val="left"/>
-            </w:pPr>
-            <w:r>
-              <w:t>varchar</w:t>
-            </w:r>
-          </w:p>
-        </w:tc>
-        <w:tc>
-          <w:tcPr>
-            <w:tcW w:w="1656" w:type="dxa"/>
-          </w:tcPr>
-          <w:p>
-            <w:pPr>
-              <w:spacing w:after="0" w:line="240" w:lineRule="auto"/>
-              <w:jc w:val="left"/>
-            </w:pPr>
-            <w:r>
-              <w:t>NOT NULL</w:t>
-            </w:r>
-          </w:p>
-        </w:tc>
-        <w:tc>
-          <w:tcPr>
-            <w:tcW w:w="1656" w:type="dxa"/>
-          </w:tcPr>
-          <w:p>
-            <w:pPr>
-              <w:spacing w:after="0" w:line="240" w:lineRule="auto"/>
-              <w:jc w:val="left"/>
-            </w:pPr>
-            <w:r>
-              <w:t>critical | warning | reminder | operational</w:t>
-            </w:r>
-          </w:p>
-        </w:tc>
-        <w:tc>
-          <w:tcPr>
-            <w:tcW w:w="2808" w:type="dxa"/>
-          </w:tcPr>
-          <w:p>
-            <w:pPr>
-              <w:spacing w:after="0" w:line="240" w:lineRule="auto"/>
-              <w:jc w:val="left"/>
-            </w:pPr>
-            <w:r>
-              <w:t>Notification category used for grouping and preference checks (Firestore field name: notif_type).</w:t>
-            </w:r>
-          </w:p>
-        </w:tc>
-      </w:tr>
-      <w:tr>
-        <w:tc>
-          <w:tcPr>
-            <w:tcW w:w="1458" w:type="dxa"/>
-          </w:tcPr>
-          <w:p>
-            <w:pPr>
-              <w:spacing w:after="0" w:line="240" w:lineRule="auto"/>
-              <w:jc w:val="left"/>
-            </w:pPr>
-            <w:r>
-              <w:t>title</w:t>
-            </w:r>
-          </w:p>
-        </w:tc>
-        <w:tc>
-          <w:tcPr>
-            <w:tcW w:w="1350" w:type="dxa"/>
-          </w:tcPr>
-          <w:p>
-            <w:pPr>
-              <w:spacing w:after="0" w:line="240" w:lineRule="auto"/>
-              <w:jc w:val="left"/>
-            </w:pPr>
-            <w:r>
-              <w:t>varchar</w:t>
-            </w:r>
-          </w:p>
-        </w:tc>
-        <w:tc>
-          <w:tcPr>
-            <w:tcW w:w="1656" w:type="dxa"/>
-          </w:tcPr>
-          <w:p>
-            <w:pPr>
-              <w:spacing w:after="0" w:line="240" w:lineRule="auto"/>
-              <w:jc w:val="left"/>
-            </w:pPr>
-            <w:r>
-              <w:t>NOT NULL</w:t>
-            </w:r>
-          </w:p>
-        </w:tc>
-        <w:tc>
-          <w:tcPr>
-            <w:tcW w:w="1656" w:type="dxa"/>
-          </w:tcPr>
-          <w:p>
-            <w:pPr>
-              <w:spacing w:after="0" w:line="240" w:lineRule="auto"/>
-              <w:jc w:val="left"/>
-            </w:pPr>
-            <w:r>
-              <w:t>Low feed level</w:t>
-            </w:r>
-          </w:p>
-        </w:tc>
-        <w:tc>
-          <w:tcPr>
-            <w:tcW w:w="2808" w:type="dxa"/>
-          </w:tcPr>
-          <w:p>
-            <w:pPr>
-              <w:spacing w:after="0" w:line="240" w:lineRule="auto"/>
-              <w:jc w:val="left"/>
-            </w:pPr>
-            <w:r>
-              <w:t>Short notification heading.</w:t>
-            </w:r>
-          </w:p>
-        </w:tc>
-      </w:tr>
-      <w:tr>
-        <w:tc>
-          <w:tcPr>
-            <w:tcW w:w="1458" w:type="dxa"/>
-          </w:tcPr>
-          <w:p>
-            <w:pPr>
-              <w:spacing w:after="0" w:line="240" w:lineRule="auto"/>
-              <w:jc w:val="left"/>
-            </w:pPr>
-            <w:r>
-              <w:t>body</w:t>
-            </w:r>
-          </w:p>
-        </w:tc>
-        <w:tc>
-          <w:tcPr>
-            <w:tcW w:w="1350" w:type="dxa"/>
-          </w:tcPr>
-          <w:p>
-            <w:pPr>
-              <w:spacing w:after="0" w:line="240" w:lineRule="auto"/>
-              <w:jc w:val="left"/>
-            </w:pPr>
-            <w:r>
-              <w:t>text</w:t>
-            </w:r>
-          </w:p>
-        </w:tc>
-        <w:tc>
-          <w:tcPr>
-            <w:tcW w:w="1656" w:type="dxa"/>
-          </w:tcPr>
-          <w:p>
-            <w:pPr>
-              <w:spacing w:after="0" w:line="240" w:lineRule="auto"/>
-              <w:jc w:val="left"/>
-            </w:pPr>
-            <w:r>
-              <w:t>NOT NULL</w:t>
-            </w:r>
-          </w:p>
-        </w:tc>
-        <w:tc>
-          <w:tcPr>
-            <w:tcW w:w="1656" w:type="dxa"/>
-          </w:tcPr>
-          <w:p>
-            <w:pPr>
-              <w:spacing w:after="0" w:line="240" w:lineRule="auto"/>
-              <w:jc w:val="left"/>
-            </w:pPr>
-            <w:r>
-              <w:t>Feed level is at 18%.</w:t>
-            </w:r>
-          </w:p>
-        </w:tc>
-        <w:tc>
-          <w:tcPr>
-            <w:tcW w:w="2808" w:type="dxa"/>
-          </w:tcPr>
-          <w:p>
-            <w:pPr>
-              <w:spacing w:after="0" w:line="240" w:lineRule="auto"/>
-              <w:jc w:val="left"/>
-            </w:pPr>
-            <w:r>
-              <w:t>Detailed notification message.</w:t>
-            </w:r>
-          </w:p>
-        </w:tc>
-      </w:tr>
-      <w:tr>
-        <w:tc>
-          <w:tcPr>
-            <w:tcW w:w="1458" w:type="dxa"/>
-          </w:tcPr>
-          <w:p>
-            <w:pPr>
-              <w:spacing w:after="0" w:line="240" w:lineRule="auto"/>
-              <w:jc w:val="left"/>
-            </w:pPr>
-            <w:r>
-              <w:t>is_read</w:t>
-            </w:r>
-          </w:p>
-        </w:tc>
-        <w:tc>
-          <w:tcPr>
-            <w:tcW w:w="1350" w:type="dxa"/>
-          </w:tcPr>
-          <w:p>
-            <w:pPr>
-              <w:spacing w:after="0" w:line="240" w:lineRule="auto"/>
-              <w:jc w:val="left"/>
-            </w:pPr>
-            <w:r>
-              <w:t>boolean</w:t>
-            </w:r>
-          </w:p>
-        </w:tc>
-        <w:tc>
-          <w:tcPr>
-            <w:tcW w:w="1656" w:type="dxa"/>
-          </w:tcPr>
-          <w:p>
-            <w:pPr>
-              <w:spacing w:after="0" w:line="240" w:lineRule="auto"/>
-              <w:jc w:val="left"/>
-            </w:pPr>
-            <w:r>
-              <w:t>NOT NULL; DEFAULT false</w:t>
-            </w:r>
-          </w:p>
-        </w:tc>
-        <w:tc>
-          <w:tcPr>
-            <w:tcW w:w="1656" w:type="dxa"/>
-          </w:tcPr>
-          <w:p>
-            <w:pPr>
-              <w:spacing w:after="0" w:line="240" w:lineRule="auto"/>
-              <w:jc w:val="left"/>
-            </w:pPr>
-            <w:r>
-              <w:t>true | false</w:t>
-            </w:r>
-          </w:p>
-        </w:tc>
-        <w:tc>
-          <w:tcPr>
-            <w:tcW w:w="2808" w:type="dxa"/>
-          </w:tcPr>
-          <w:p>
-            <w:pPr>
-              <w:spacing w:after="0" w:line="240" w:lineRule="auto"/>
-              <w:jc w:val="left"/>
-            </w:pPr>
-            <w:r>
-              <w:t>Whether the user opened or marked the notification as read.</w:t>
-            </w:r>
-          </w:p>
-        </w:tc>
-      </w:tr>
-      <w:tr>
-        <w:tc>
-          <w:tcPr>
-            <w:tcW w:w="1458" w:type="dxa"/>
-          </w:tcPr>
-          <w:p>
-            <w:pPr>
-              <w:spacing w:after="0" w:line="240" w:lineRule="auto"/>
-              <w:jc w:val="left"/>
-            </w:pPr>
-            <w:r>
-              <w:t>created_at</w:t>
-            </w:r>
-          </w:p>
-        </w:tc>
-        <w:tc>
-          <w:tcPr>
-            <w:tcW w:w="1350" w:type="dxa"/>
-          </w:tcPr>
-          <w:p>
-            <w:pPr>
-              <w:spacing w:after="0" w:line="240" w:lineRule="auto"/>
-              <w:jc w:val="left"/>
-            </w:pPr>
-            <w:r>
-              <w:t>timestamp</w:t>
-            </w:r>
-          </w:p>
-        </w:tc>
-        <w:tc>
-          <w:tcPr>
-            <w:tcW w:w="1656" w:type="dxa"/>
-          </w:tcPr>
-          <w:p>
-            <w:pPr>
-              <w:spacing w:after="0" w:line="240" w:lineRule="auto"/>
-              <w:jc w:val="left"/>
-            </w:pPr>
-            <w:r>
-              <w:t>NOT NULL</w:t>
-            </w:r>
-          </w:p>
-        </w:tc>
-        <w:tc>
-          <w:tcPr>
-            <w:tcW w:w="1656" w:type="dxa"/>
-          </w:tcPr>
-          <w:p>
-            <w:pPr>
-              <w:spacing w:after="0" w:line="240" w:lineRule="auto"/>
-              <w:jc w:val="left"/>
-            </w:pPr>
-            <w:r>
-              <w:t>2026-09-06 08:00:00</w:t>
-            </w:r>
-          </w:p>
-        </w:tc>
-        <w:tc>
-          <w:tcPr>
-            <w:tcW w:w="2808" w:type="dxa"/>
-          </w:tcPr>
-          <w:p>
-            <w:pPr>
-              <w:spacing w:after="0" w:line="240" w:lineRule="auto"/>
-              <w:jc w:val="left"/>
-            </w:pPr>
-            <w:r>
-              <w:t>Date and time this record was created.</w:t>
             </w:r>
           </w:p>
         </w:tc>
@@ -4040,78 +4040,6 @@
               <w:jc w:val="left"/>
             </w:pPr>
             <w:r>
-              <w:t>date_key</w:t>
-            </w:r>
-          </w:p>
-        </w:tc>
-        <w:tc>
-          <w:tcPr>
-            <w:tcW w:w="1350" w:type="dxa"/>
-          </w:tcPr>
-          <w:p>
-            <w:pPr>
-              <w:spacing w:after="0" w:line="240" w:lineRule="auto"/>
-              <w:jc w:val="left"/>
-            </w:pPr>
-            <w:r>
-              <w:t>varchar</w:t>
-            </w:r>
-          </w:p>
-        </w:tc>
-        <w:tc>
-          <w:tcPr>
-            <w:tcW w:w="1656" w:type="dxa"/>
-          </w:tcPr>
-          <w:p>
-            <w:pPr>
-              <w:spacing w:after="0" w:line="240" w:lineRule="auto"/>
-              <w:jc w:val="left"/>
-            </w:pPr>
-            <w:r>
-              <w:t>NOT NULL</w:t>
-            </w:r>
-          </w:p>
-        </w:tc>
-        <w:tc>
-          <w:tcPr>
-            <w:tcW w:w="1656" w:type="dxa"/>
-          </w:tcPr>
-          <w:p>
-            <w:pPr>
-              <w:spacing w:after="0" w:line="240" w:lineRule="auto"/>
-              <w:jc w:val="left"/>
-            </w:pPr>
-            <w:r>
-              <w:t>2026-09-06</w:t>
-            </w:r>
-          </w:p>
-        </w:tc>
-        <w:tc>
-          <w:tcPr>
-            <w:tcW w:w="2808" w:type="dxa"/>
-          </w:tcPr>
-          <w:p>
-            <w:pPr>
-              <w:spacing w:after="0" w:line="240" w:lineRule="auto"/>
-              <w:jc w:val="left"/>
-            </w:pPr>
-            <w:r>
-              <w:t>Calendar key represented by this daily record.</w:t>
-            </w:r>
-          </w:p>
-        </w:tc>
-      </w:tr>
-      <w:tr>
-        <w:tc>
-          <w:tcPr>
-            <w:tcW w:w="1458" w:type="dxa"/>
-          </w:tcPr>
-          <w:p>
-            <w:pPr>
-              <w:spacing w:after="0" w:line="240" w:lineRule="auto"/>
-              <w:jc w:val="left"/>
-            </w:pPr>
-            <w:r>
               <w:t>temp_min</w:t>
             </w:r>
           </w:p>
@@ -6349,7 +6277,6 @@
       </w:tr>
     </w:tbl>
     <w:p/>
-    <w:p/>
     <w:p>
       <w:pPr>
         <w:keepNext/>
@@ -12161,12 +12088,9 @@
             <w:tcW w:w="2808" w:type="dxa"/>
           </w:tcPr>
           <w:p>
-            <w:pPr>
-              <w:spacing w:after="0" w:line="240" w:lineRule="auto"/>
-              <w:jc w:val="left"/>
-            </w:pPr>
-            <w:r>
-              <w:t>Identifier of the detection record.</w:t>
+            <w:r/>
+            <w:r>
+              <w:t>Document ID of the detection record ("current" live alias or YYYYMMDDTHHMMSS history ID); not a stored field.</w:t>
             </w:r>
           </w:p>
         </w:tc>
@@ -12435,26 +12359,20 @@
             <w:tcW w:w="1656" w:type="dxa"/>
           </w:tcPr>
           <w:p>
-            <w:pPr>
-              <w:spacing w:after="0" w:line="240" w:lineRule="auto"/>
-              <w:jc w:val="left"/>
-            </w:pPr>
-            <w:r>
-              <w:t>model</w:t>
-            </w:r>
-          </w:p>
-        </w:tc>
-        <w:tc>
-          <w:tcPr>
-            <w:tcW w:w="2808" w:type="dxa"/>
-          </w:tcPr>
-          <w:p>
-            <w:pPr>
-              <w:spacing w:after="0" w:line="240" w:lineRule="auto"/>
-              <w:jc w:val="left"/>
-            </w:pPr>
-            <w:r>
-              <w:t>Model version or explanation of why a model result was unavailable.</w:t>
+            <w:r/>
+            <w:r>
+              <w:t>WQAD model | Model unavailable | Insufficient data | Stale sensor history</w:t>
+            </w:r>
+          </w:p>
+        </w:tc>
+        <w:tc>
+          <w:tcPr>
+            <w:tcW w:w="2808" w:type="dxa"/>
+          </w:tcPr>
+          <w:p>
+            <w:r/>
+            <w:r>
+              <w:t>Detection origin: model result, or the reason a model result was unavailable.</w:t>
             </w:r>
           </w:p>
         </w:tc>
@@ -12542,7 +12460,7 @@
               <w:jc w:val="left"/>
             </w:pPr>
             <w:r>
-              <w:t>model_version</w:t>
+              <w:t>training_data_origin</w:t>
             </w:r>
           </w:p>
         </w:tc>
@@ -12584,37 +12502,37 @@
               <w:jc w:val="left"/>
             </w:pPr>
             <w:r>
-              <w:t>example_model_v1</w:t>
-            </w:r>
-          </w:p>
-        </w:tc>
-        <w:tc>
-          <w:tcPr>
-            <w:tcW w:w="2808" w:type="dxa"/>
-          </w:tcPr>
-          <w:p>
-            <w:pPr>
-              <w:spacing w:after="0" w:line="240" w:lineRule="auto"/>
-              <w:jc w:val="left"/>
-            </w:pPr>
-            <w:r>
-              <w:t>Version embedded in the deployed model artifact.</w:t>
-            </w:r>
-          </w:p>
-        </w:tc>
-      </w:tr>
-      <w:tr>
-        <w:tc>
-          <w:tcPr>
-            <w:tcW w:w="1458" w:type="dxa"/>
-          </w:tcPr>
-          <w:p>
-            <w:pPr>
-              <w:spacing w:after="0" w:line="240" w:lineRule="auto"/>
-              <w:jc w:val="left"/>
-            </w:pPr>
-            <w:r>
-              <w:t>training_data_origin</w:t>
+              <w:t>synthetic bootstrap</w:t>
+            </w:r>
+          </w:p>
+        </w:tc>
+        <w:tc>
+          <w:tcPr>
+            <w:tcW w:w="2808" w:type="dxa"/>
+          </w:tcPr>
+          <w:p>
+            <w:pPr>
+              <w:spacing w:after="0" w:line="240" w:lineRule="auto"/>
+              <w:jc w:val="left"/>
+            </w:pPr>
+            <w:r>
+              <w:t>Origin of model-training records, such as synthetic bootstrap or actual tank history.</w:t>
+            </w:r>
+          </w:p>
+        </w:tc>
+      </w:tr>
+      <w:tr>
+        <w:tc>
+          <w:tcPr>
+            <w:tcW w:w="1458" w:type="dxa"/>
+          </w:tcPr>
+          <w:p>
+            <w:pPr>
+              <w:spacing w:after="0" w:line="240" w:lineRule="auto"/>
+              <w:jc w:val="left"/>
+            </w:pPr>
+            <w:r>
+              <w:t>training_label_origin</w:t>
             </w:r>
           </w:p>
         </w:tc>
@@ -12656,37 +12574,181 @@
               <w:jc w:val="left"/>
             </w:pPr>
             <w:r>
-              <w:t>synthetic bootstrap</w:t>
-            </w:r>
-          </w:p>
-        </w:tc>
-        <w:tc>
-          <w:tcPr>
-            <w:tcW w:w="2808" w:type="dxa"/>
-          </w:tcPr>
-          <w:p>
-            <w:pPr>
-              <w:spacing w:after="0" w:line="240" w:lineRule="auto"/>
-              <w:jc w:val="left"/>
-            </w:pPr>
-            <w:r>
-              <w:t>Origin of model-training records, such as synthetic bootstrap or actual tank history.</w:t>
-            </w:r>
-          </w:p>
-        </w:tc>
-      </w:tr>
-      <w:tr>
-        <w:tc>
-          <w:tcPr>
-            <w:tcW w:w="1458" w:type="dxa"/>
-          </w:tcPr>
-          <w:p>
-            <w:pPr>
-              <w:spacing w:after="0" w:line="240" w:lineRule="auto"/>
-              <w:jc w:val="left"/>
-            </w:pPr>
-            <w:r>
-              <w:t>training_label_origin</w:t>
+              <w:t>none_unsupervised</w:t>
+            </w:r>
+          </w:p>
+        </w:tc>
+        <w:tc>
+          <w:tcPr>
+            <w:tcW w:w="2808" w:type="dxa"/>
+          </w:tcPr>
+          <w:p>
+            <w:pPr>
+              <w:spacing w:after="0" w:line="240" w:lineRule="auto"/>
+              <w:jc w:val="left"/>
+            </w:pPr>
+            <w:r>
+              <w:t>Unsupervised model; no threshold-derived training labels are used.</w:t>
+            </w:r>
+          </w:p>
+        </w:tc>
+      </w:tr>
+      <w:tr>
+        <w:tc>
+          <w:tcPr>
+            <w:tcW w:w="1458" w:type="dxa"/>
+          </w:tcPr>
+          <w:p>
+            <w:pPr>
+              <w:spacing w:after="0" w:line="240" w:lineRule="auto"/>
+              <w:jc w:val="left"/>
+            </w:pPr>
+            <w:r>
+              <w:t>model_feature_count</w:t>
+            </w:r>
+          </w:p>
+        </w:tc>
+        <w:tc>
+          <w:tcPr>
+            <w:tcW w:w="1350" w:type="dxa"/>
+          </w:tcPr>
+          <w:p>
+            <w:pPr>
+              <w:spacing w:after="0" w:line="240" w:lineRule="auto"/>
+              <w:jc w:val="left"/>
+            </w:pPr>
+            <w:r>
+              <w:t>int</w:t>
+            </w:r>
+          </w:p>
+        </w:tc>
+        <w:tc>
+          <w:tcPr>
+            <w:tcW w:w="1656" w:type="dxa"/>
+          </w:tcPr>
+          <w:p>
+            <w:pPr>
+              <w:spacing w:after="0" w:line="240" w:lineRule="auto"/>
+              <w:jc w:val="left"/>
+            </w:pPr>
+            <w:r>
+              <w:t>Optional</w:t>
+            </w:r>
+          </w:p>
+        </w:tc>
+        <w:tc>
+          <w:tcPr>
+            <w:tcW w:w="1656" w:type="dxa"/>
+          </w:tcPr>
+          <w:p>
+            <w:pPr>
+              <w:spacing w:after="0" w:line="240" w:lineRule="auto"/>
+              <w:jc w:val="left"/>
+            </w:pPr>
+            <w:r>
+              <w:t>1</w:t>
+            </w:r>
+          </w:p>
+        </w:tc>
+        <w:tc>
+          <w:tcPr>
+            <w:tcW w:w="2808" w:type="dxa"/>
+          </w:tcPr>
+          <w:p>
+            <w:pPr>
+              <w:spacing w:after="0" w:line="240" w:lineRule="auto"/>
+              <w:jc w:val="left"/>
+            </w:pPr>
+            <w:r>
+              <w:t>Number of engineered model inputs.</w:t>
+            </w:r>
+          </w:p>
+        </w:tc>
+      </w:tr>
+      <w:tr>
+        <w:tc>
+          <w:tcPr>
+            <w:tcW w:w="1458" w:type="dxa"/>
+          </w:tcPr>
+          <w:p>
+            <w:pPr>
+              <w:spacing w:after="0" w:line="240" w:lineRule="auto"/>
+              <w:jc w:val="left"/>
+            </w:pPr>
+            <w:r>
+              <w:t>analysis_window_minutes</w:t>
+            </w:r>
+          </w:p>
+        </w:tc>
+        <w:tc>
+          <w:tcPr>
+            <w:tcW w:w="1350" w:type="dxa"/>
+          </w:tcPr>
+          <w:p>
+            <w:pPr>
+              <w:spacing w:after="0" w:line="240" w:lineRule="auto"/>
+              <w:jc w:val="left"/>
+            </w:pPr>
+            <w:r>
+              <w:t>int</w:t>
+            </w:r>
+          </w:p>
+        </w:tc>
+        <w:tc>
+          <w:tcPr>
+            <w:tcW w:w="1656" w:type="dxa"/>
+          </w:tcPr>
+          <w:p>
+            <w:pPr>
+              <w:spacing w:after="0" w:line="240" w:lineRule="auto"/>
+              <w:jc w:val="left"/>
+            </w:pPr>
+            <w:r>
+              <w:t>Optional</w:t>
+            </w:r>
+          </w:p>
+        </w:tc>
+        <w:tc>
+          <w:tcPr>
+            <w:tcW w:w="1656" w:type="dxa"/>
+          </w:tcPr>
+          <w:p>
+            <w:pPr>
+              <w:spacing w:after="0" w:line="240" w:lineRule="auto"/>
+              <w:jc w:val="left"/>
+            </w:pPr>
+            <w:r>
+              <w:t>120</w:t>
+            </w:r>
+          </w:p>
+        </w:tc>
+        <w:tc>
+          <w:tcPr>
+            <w:tcW w:w="2808" w:type="dxa"/>
+          </w:tcPr>
+          <w:p>
+            <w:pPr>
+              <w:spacing w:after="0" w:line="240" w:lineRule="auto"/>
+              <w:jc w:val="left"/>
+            </w:pPr>
+            <w:r>
+              <w:t>Historical duration analyzed for the detection.</w:t>
+            </w:r>
+          </w:p>
+        </w:tc>
+      </w:tr>
+      <w:tr>
+        <w:tc>
+          <w:tcPr>
+            <w:tcW w:w="1458" w:type="dxa"/>
+          </w:tcPr>
+          <w:p>
+            <w:pPr>
+              <w:spacing w:after="0" w:line="240" w:lineRule="auto"/>
+              <w:jc w:val="left"/>
+            </w:pPr>
+            <w:r>
+              <w:t>data_status</w:t>
             </w:r>
           </w:p>
         </w:tc>
@@ -12714,6 +12776,78 @@
               <w:jc w:val="left"/>
             </w:pPr>
             <w:r>
+              <w:t>NOT NULL</w:t>
+            </w:r>
+          </w:p>
+        </w:tc>
+        <w:tc>
+          <w:tcPr>
+            <w:tcW w:w="1656" w:type="dxa"/>
+          </w:tcPr>
+          <w:p>
+            <w:pPr>
+              <w:spacing w:after="0" w:line="240" w:lineRule="auto"/>
+              <w:jc w:val="left"/>
+            </w:pPr>
+            <w:r>
+              <w:t>ready | insufficient | stale</w:t>
+            </w:r>
+          </w:p>
+        </w:tc>
+        <w:tc>
+          <w:tcPr>
+            <w:tcW w:w="2808" w:type="dxa"/>
+          </w:tcPr>
+          <w:p>
+            <w:pPr>
+              <w:spacing w:after="0" w:line="240" w:lineRule="auto"/>
+              <w:jc w:val="left"/>
+            </w:pPr>
+            <w:r>
+              <w:t>Whether the sensor history is ready, insufficient, or outdated.</w:t>
+            </w:r>
+          </w:p>
+        </w:tc>
+      </w:tr>
+      <w:tr>
+        <w:tc>
+          <w:tcPr>
+            <w:tcW w:w="1458" w:type="dxa"/>
+          </w:tcPr>
+          <w:p>
+            <w:pPr>
+              <w:spacing w:after="0" w:line="240" w:lineRule="auto"/>
+              <w:jc w:val="left"/>
+            </w:pPr>
+            <w:r>
+              <w:t>source_recorded_at</w:t>
+            </w:r>
+          </w:p>
+        </w:tc>
+        <w:tc>
+          <w:tcPr>
+            <w:tcW w:w="1350" w:type="dxa"/>
+          </w:tcPr>
+          <w:p>
+            <w:pPr>
+              <w:spacing w:after="0" w:line="240" w:lineRule="auto"/>
+              <w:jc w:val="left"/>
+            </w:pPr>
+            <w:r>
+              <w:t>timestamp</w:t>
+            </w:r>
+          </w:p>
+        </w:tc>
+        <w:tc>
+          <w:tcPr>
+            <w:tcW w:w="1656" w:type="dxa"/>
+          </w:tcPr>
+          <w:p>
+            <w:pPr>
+              <w:spacing w:after="0" w:line="240" w:lineRule="auto"/>
+              <w:jc w:val="left"/>
+            </w:pPr>
+            <w:r>
               <w:t>Optional</w:t>
             </w:r>
           </w:p>
@@ -12728,37 +12862,37 @@
               <w:jc w:val="left"/>
             </w:pPr>
             <w:r>
-              <w:t>none_unsupervised</w:t>
-            </w:r>
-          </w:p>
-        </w:tc>
-        <w:tc>
-          <w:tcPr>
-            <w:tcW w:w="2808" w:type="dxa"/>
-          </w:tcPr>
-          <w:p>
-            <w:pPr>
-              <w:spacing w:after="0" w:line="240" w:lineRule="auto"/>
-              <w:jc w:val="left"/>
-            </w:pPr>
-            <w:r>
-              <w:t>Unsupervised model; no threshold-derived training labels are used.</w:t>
-            </w:r>
-          </w:p>
-        </w:tc>
-      </w:tr>
-      <w:tr>
-        <w:tc>
-          <w:tcPr>
-            <w:tcW w:w="1458" w:type="dxa"/>
-          </w:tcPr>
-          <w:p>
-            <w:pPr>
-              <w:spacing w:after="0" w:line="240" w:lineRule="auto"/>
-              <w:jc w:val="left"/>
-            </w:pPr>
-            <w:r>
-              <w:t>model_feature_count</w:t>
+              <w:t>2026-09-06 08:00:00</w:t>
+            </w:r>
+          </w:p>
+        </w:tc>
+        <w:tc>
+          <w:tcPr>
+            <w:tcW w:w="2808" w:type="dxa"/>
+          </w:tcPr>
+          <w:p>
+            <w:pPr>
+              <w:spacing w:after="0" w:line="240" w:lineRule="auto"/>
+              <w:jc w:val="left"/>
+            </w:pPr>
+            <w:r>
+              <w:t>Timestamp of the newest actual source reading.</w:t>
+            </w:r>
+          </w:p>
+        </w:tc>
+      </w:tr>
+      <w:tr>
+        <w:tc>
+          <w:tcPr>
+            <w:tcW w:w="1458" w:type="dxa"/>
+          </w:tcPr>
+          <w:p>
+            <w:pPr>
+              <w:spacing w:after="0" w:line="240" w:lineRule="auto"/>
+              <w:jc w:val="left"/>
+            </w:pPr>
+            <w:r>
+              <w:t>source_age_seconds</w:t>
             </w:r>
           </w:p>
         </w:tc>
@@ -12814,37 +12948,37 @@
               <w:jc w:val="left"/>
             </w:pPr>
             <w:r>
-              <w:t>Number of engineered model inputs.</w:t>
-            </w:r>
-          </w:p>
-        </w:tc>
-      </w:tr>
-      <w:tr>
-        <w:tc>
-          <w:tcPr>
-            <w:tcW w:w="1458" w:type="dxa"/>
-          </w:tcPr>
-          <w:p>
-            <w:pPr>
-              <w:spacing w:after="0" w:line="240" w:lineRule="auto"/>
-              <w:jc w:val="left"/>
-            </w:pPr>
-            <w:r>
-              <w:t>analysis_window_minutes</w:t>
-            </w:r>
-          </w:p>
-        </w:tc>
-        <w:tc>
-          <w:tcPr>
-            <w:tcW w:w="1350" w:type="dxa"/>
-          </w:tcPr>
-          <w:p>
-            <w:pPr>
-              <w:spacing w:after="0" w:line="240" w:lineRule="auto"/>
-              <w:jc w:val="left"/>
-            </w:pPr>
-            <w:r>
-              <w:t>int</w:t>
+              <w:t>Age of the newest source reading at processing time.</w:t>
+            </w:r>
+          </w:p>
+        </w:tc>
+      </w:tr>
+      <w:tr>
+        <w:tc>
+          <w:tcPr>
+            <w:tcW w:w="1458" w:type="dxa"/>
+          </w:tcPr>
+          <w:p>
+            <w:pPr>
+              <w:spacing w:after="0" w:line="240" w:lineRule="auto"/>
+              <w:jc w:val="left"/>
+            </w:pPr>
+            <w:r>
+              <w:t>driver</w:t>
+            </w:r>
+          </w:p>
+        </w:tc>
+        <w:tc>
+          <w:tcPr>
+            <w:tcW w:w="1350" w:type="dxa"/>
+          </w:tcPr>
+          <w:p>
+            <w:pPr>
+              <w:spacing w:after="0" w:line="240" w:lineRule="auto"/>
+              <w:jc w:val="left"/>
+            </w:pPr>
+            <w:r>
+              <w:t>varchar</w:t>
             </w:r>
           </w:p>
         </w:tc>
@@ -12867,300 +13001,9 @@
             <w:tcW w:w="1656" w:type="dxa"/>
           </w:tcPr>
           <w:p>
-            <w:pPr>
-              <w:spacing w:after="0" w:line="240" w:lineRule="auto"/>
-              <w:jc w:val="left"/>
-            </w:pPr>
-            <w:r>
-              <w:t>120</w:t>
-            </w:r>
-          </w:p>
-        </w:tc>
-        <w:tc>
-          <w:tcPr>
-            <w:tcW w:w="2808" w:type="dxa"/>
-          </w:tcPr>
-          <w:p>
-            <w:pPr>
-              <w:spacing w:after="0" w:line="240" w:lineRule="auto"/>
-              <w:jc w:val="left"/>
-            </w:pPr>
-            <w:r>
-              <w:t>Historical duration analyzed for the detection.</w:t>
-            </w:r>
-          </w:p>
-        </w:tc>
-      </w:tr>
-      <w:tr>
-        <w:tc>
-          <w:tcPr>
-            <w:tcW w:w="1458" w:type="dxa"/>
-          </w:tcPr>
-          <w:p>
-            <w:pPr>
-              <w:spacing w:after="0" w:line="240" w:lineRule="auto"/>
-              <w:jc w:val="left"/>
-            </w:pPr>
-            <w:r>
-              <w:t>data_status</w:t>
-            </w:r>
-          </w:p>
-        </w:tc>
-        <w:tc>
-          <w:tcPr>
-            <w:tcW w:w="1350" w:type="dxa"/>
-          </w:tcPr>
-          <w:p>
-            <w:pPr>
-              <w:spacing w:after="0" w:line="240" w:lineRule="auto"/>
-              <w:jc w:val="left"/>
-            </w:pPr>
-            <w:r>
-              <w:t>varchar</w:t>
-            </w:r>
-          </w:p>
-        </w:tc>
-        <w:tc>
-          <w:tcPr>
-            <w:tcW w:w="1656" w:type="dxa"/>
-          </w:tcPr>
-          <w:p>
-            <w:pPr>
-              <w:spacing w:after="0" w:line="240" w:lineRule="auto"/>
-              <w:jc w:val="left"/>
-            </w:pPr>
-            <w:r>
-              <w:t>NOT NULL</w:t>
-            </w:r>
-          </w:p>
-        </w:tc>
-        <w:tc>
-          <w:tcPr>
-            <w:tcW w:w="1656" w:type="dxa"/>
-          </w:tcPr>
-          <w:p>
-            <w:pPr>
-              <w:spacing w:after="0" w:line="240" w:lineRule="auto"/>
-              <w:jc w:val="left"/>
-            </w:pPr>
-            <w:r>
-              <w:t>ready | insufficient | stale</w:t>
-            </w:r>
-          </w:p>
-        </w:tc>
-        <w:tc>
-          <w:tcPr>
-            <w:tcW w:w="2808" w:type="dxa"/>
-          </w:tcPr>
-          <w:p>
-            <w:pPr>
-              <w:spacing w:after="0" w:line="240" w:lineRule="auto"/>
-              <w:jc w:val="left"/>
-            </w:pPr>
-            <w:r>
-              <w:t>Whether the sensor history is ready, insufficient, or outdated.</w:t>
-            </w:r>
-          </w:p>
-        </w:tc>
-      </w:tr>
-      <w:tr>
-        <w:tc>
-          <w:tcPr>
-            <w:tcW w:w="1458" w:type="dxa"/>
-          </w:tcPr>
-          <w:p>
-            <w:pPr>
-              <w:spacing w:after="0" w:line="240" w:lineRule="auto"/>
-              <w:jc w:val="left"/>
-            </w:pPr>
-            <w:r>
-              <w:t>source_recorded_at</w:t>
-            </w:r>
-          </w:p>
-        </w:tc>
-        <w:tc>
-          <w:tcPr>
-            <w:tcW w:w="1350" w:type="dxa"/>
-          </w:tcPr>
-          <w:p>
-            <w:pPr>
-              <w:spacing w:after="0" w:line="240" w:lineRule="auto"/>
-              <w:jc w:val="left"/>
-            </w:pPr>
-            <w:r>
-              <w:t>timestamp</w:t>
-            </w:r>
-          </w:p>
-        </w:tc>
-        <w:tc>
-          <w:tcPr>
-            <w:tcW w:w="1656" w:type="dxa"/>
-          </w:tcPr>
-          <w:p>
-            <w:pPr>
-              <w:spacing w:after="0" w:line="240" w:lineRule="auto"/>
-              <w:jc w:val="left"/>
-            </w:pPr>
-            <w:r>
-              <w:t>Optional</w:t>
-            </w:r>
-          </w:p>
-        </w:tc>
-        <w:tc>
-          <w:tcPr>
-            <w:tcW w:w="1656" w:type="dxa"/>
-          </w:tcPr>
-          <w:p>
-            <w:pPr>
-              <w:spacing w:after="0" w:line="240" w:lineRule="auto"/>
-              <w:jc w:val="left"/>
-            </w:pPr>
-            <w:r>
-              <w:t>2026-09-06 08:00:00</w:t>
-            </w:r>
-          </w:p>
-        </w:tc>
-        <w:tc>
-          <w:tcPr>
-            <w:tcW w:w="2808" w:type="dxa"/>
-          </w:tcPr>
-          <w:p>
-            <w:pPr>
-              <w:spacing w:after="0" w:line="240" w:lineRule="auto"/>
-              <w:jc w:val="left"/>
-            </w:pPr>
-            <w:r>
-              <w:t>Timestamp of the newest actual source reading.</w:t>
-            </w:r>
-          </w:p>
-        </w:tc>
-      </w:tr>
-      <w:tr>
-        <w:tc>
-          <w:tcPr>
-            <w:tcW w:w="1458" w:type="dxa"/>
-          </w:tcPr>
-          <w:p>
-            <w:pPr>
-              <w:spacing w:after="0" w:line="240" w:lineRule="auto"/>
-              <w:jc w:val="left"/>
-            </w:pPr>
-            <w:r>
-              <w:t>source_age_seconds</w:t>
-            </w:r>
-          </w:p>
-        </w:tc>
-        <w:tc>
-          <w:tcPr>
-            <w:tcW w:w="1350" w:type="dxa"/>
-          </w:tcPr>
-          <w:p>
-            <w:pPr>
-              <w:spacing w:after="0" w:line="240" w:lineRule="auto"/>
-              <w:jc w:val="left"/>
-            </w:pPr>
-            <w:r>
-              <w:t>int</w:t>
-            </w:r>
-          </w:p>
-        </w:tc>
-        <w:tc>
-          <w:tcPr>
-            <w:tcW w:w="1656" w:type="dxa"/>
-          </w:tcPr>
-          <w:p>
-            <w:pPr>
-              <w:spacing w:after="0" w:line="240" w:lineRule="auto"/>
-              <w:jc w:val="left"/>
-            </w:pPr>
-            <w:r>
-              <w:t>Optional</w:t>
-            </w:r>
-          </w:p>
-        </w:tc>
-        <w:tc>
-          <w:tcPr>
-            <w:tcW w:w="1656" w:type="dxa"/>
-          </w:tcPr>
-          <w:p>
-            <w:pPr>
-              <w:spacing w:after="0" w:line="240" w:lineRule="auto"/>
-              <w:jc w:val="left"/>
-            </w:pPr>
-            <w:r>
-              <w:t>1</w:t>
-            </w:r>
-          </w:p>
-        </w:tc>
-        <w:tc>
-          <w:tcPr>
-            <w:tcW w:w="2808" w:type="dxa"/>
-          </w:tcPr>
-          <w:p>
-            <w:pPr>
-              <w:spacing w:after="0" w:line="240" w:lineRule="auto"/>
-              <w:jc w:val="left"/>
-            </w:pPr>
-            <w:r>
-              <w:t>Age of the newest source reading at processing time.</w:t>
-            </w:r>
-          </w:p>
-        </w:tc>
-      </w:tr>
-      <w:tr>
-        <w:tc>
-          <w:tcPr>
-            <w:tcW w:w="1458" w:type="dxa"/>
-          </w:tcPr>
-          <w:p>
-            <w:pPr>
-              <w:spacing w:after="0" w:line="240" w:lineRule="auto"/>
-              <w:jc w:val="left"/>
-            </w:pPr>
-            <w:r>
-              <w:t>driver</w:t>
-            </w:r>
-          </w:p>
-        </w:tc>
-        <w:tc>
-          <w:tcPr>
-            <w:tcW w:w="1350" w:type="dxa"/>
-          </w:tcPr>
-          <w:p>
-            <w:pPr>
-              <w:spacing w:after="0" w:line="240" w:lineRule="auto"/>
-              <w:jc w:val="left"/>
-            </w:pPr>
-            <w:r>
-              <w:t>varchar</w:t>
-            </w:r>
-          </w:p>
-        </w:tc>
-        <w:tc>
-          <w:tcPr>
-            <w:tcW w:w="1656" w:type="dxa"/>
-          </w:tcPr>
-          <w:p>
-            <w:pPr>
-              <w:spacing w:after="0" w:line="240" w:lineRule="auto"/>
-              <w:jc w:val="left"/>
-            </w:pPr>
-            <w:r>
-              <w:t>Optional</w:t>
-            </w:r>
-          </w:p>
-        </w:tc>
-        <w:tc>
-          <w:tcPr>
-            <w:tcW w:w="1656" w:type="dxa"/>
-          </w:tcPr>
-          <w:p>
-            <w:pPr>
-              <w:spacing w:after="0" w:line="240" w:lineRule="auto"/>
-              <w:jc w:val="left"/>
-            </w:pPr>
-            <w:r>
-              <w:t>DO</w:t>
+            <w:r/>
+            <w:r>
+              <w:t>temp | pH | DO | turbidity | waterLevel | overall | N/A</w:t>
             </w:r>
           </w:p>
         </w:tc>
@@ -13555,10 +13398,18 @@
             <w:tcW w:w="1458" w:type="dxa"/>
           </w:tcPr>
           <w:p>
-            <w:pPr>
-              <w:spacing w:after="0" w:line="240" w:lineRule="auto"/>
-              <w:jc w:val="left"/>
-            </w:pPr>
+            <w:r/>
+            <w:r>
+              <w:t>processed_at</w:t>
+            </w:r>
+          </w:p>
+        </w:tc>
+        <w:tc>
+          <w:tcPr>
+            <w:tcW w:w="1350" w:type="dxa"/>
+          </w:tcPr>
+          <w:p>
+            <w:r/>
             <w:r>
               <w:t>timestamp</w:t>
             </w:r>
@@ -13566,20 +13417,6 @@
         </w:tc>
         <w:tc>
           <w:tcPr>
-            <w:tcW w:w="1350" w:type="dxa"/>
-          </w:tcPr>
-          <w:p>
-            <w:pPr>
-              <w:spacing w:after="0" w:line="240" w:lineRule="auto"/>
-              <w:jc w:val="left"/>
-            </w:pPr>
-            <w:r>
-              <w:t>text</w:t>
-            </w:r>
-          </w:p>
-        </w:tc>
-        <w:tc>
-          <w:tcPr>
             <w:tcW w:w="1656" w:type="dxa"/>
           </w:tcPr>
           <w:p>
@@ -13597,26 +13434,20 @@
             <w:tcW w:w="1656" w:type="dxa"/>
           </w:tcPr>
           <w:p>
-            <w:pPr>
-              <w:spacing w:after="0" w:line="240" w:lineRule="auto"/>
-              <w:jc w:val="left"/>
-            </w:pPr>
-            <w:r>
-              <w:t>ISO-8601 UTC</w:t>
-            </w:r>
-          </w:p>
-        </w:tc>
-        <w:tc>
-          <w:tcPr>
-            <w:tcW w:w="2808" w:type="dxa"/>
-          </w:tcPr>
-          <w:p>
-            <w:pPr>
-              <w:spacing w:after="0" w:line="240" w:lineRule="auto"/>
-              <w:jc w:val="left"/>
-            </w:pPr>
-            <w:r>
-              <w:t>Time the anomaly detection was processed (Firestore field name: timestamp).</w:t>
+            <w:r/>
+            <w:r>
+              <w:t>2026-09-06 08:00:00</w:t>
+            </w:r>
+          </w:p>
+        </w:tc>
+        <w:tc>
+          <w:tcPr>
+            <w:tcW w:w="2808" w:type="dxa"/>
+          </w:tcPr>
+          <w:p>
+            <w:r/>
+            <w:r>
+              <w:t>Processing time as Firestore Timestamp; the app orders history by it. Replaces the legacy timestamp string and ts_epoch int.</w:t>
             </w:r>
           </w:p>
         </w:tc>
@@ -13689,78 +13520,6 @@
             </w:pPr>
             <w:r>
               <w:t>Ranked contributing sensors stored on the detection document (logical model normalizes it into water_quality_anomaly_contributors).</w:t>
-            </w:r>
-          </w:p>
-        </w:tc>
-      </w:tr>
-      <w:tr>
-        <w:tc>
-          <w:tcPr>
-            <w:tcW w:w="1458" w:type="dxa"/>
-          </w:tcPr>
-          <w:p>
-            <w:pPr>
-              <w:spacing w:after="0" w:line="240" w:lineRule="auto"/>
-              <w:jc w:val="left"/>
-            </w:pPr>
-            <w:r>
-              <w:t>ts_epoch</w:t>
-            </w:r>
-          </w:p>
-        </w:tc>
-        <w:tc>
-          <w:tcPr>
-            <w:tcW w:w="1350" w:type="dxa"/>
-          </w:tcPr>
-          <w:p>
-            <w:pPr>
-              <w:spacing w:after="0" w:line="240" w:lineRule="auto"/>
-              <w:jc w:val="left"/>
-            </w:pPr>
-            <w:r>
-              <w:t>int</w:t>
-            </w:r>
-          </w:p>
-        </w:tc>
-        <w:tc>
-          <w:tcPr>
-            <w:tcW w:w="1656" w:type="dxa"/>
-          </w:tcPr>
-          <w:p>
-            <w:pPr>
-              <w:spacing w:after="0" w:line="240" w:lineRule="auto"/>
-              <w:jc w:val="left"/>
-            </w:pPr>
-            <w:r>
-              <w:t>NOT NULL</w:t>
-            </w:r>
-          </w:p>
-        </w:tc>
-        <w:tc>
-          <w:tcPr>
-            <w:tcW w:w="1656" w:type="dxa"/>
-          </w:tcPr>
-          <w:p>
-            <w:pPr>
-              <w:spacing w:after="0" w:line="240" w:lineRule="auto"/>
-              <w:jc w:val="left"/>
-            </w:pPr>
-            <w:r>
-              <w:t>epoch-seconds</w:t>
-            </w:r>
-          </w:p>
-        </w:tc>
-        <w:tc>
-          <w:tcPr>
-            <w:tcW w:w="2808" w:type="dxa"/>
-          </w:tcPr>
-          <w:p>
-            <w:pPr>
-              <w:spacing w:after="0" w:line="240" w:lineRule="auto"/>
-              <w:jc w:val="left"/>
-            </w:pPr>
-            <w:r>
-              <w:t>Processing time as integer epoch seconds (ESP-friendly).</w:t>
             </w:r>
           </w:p>
         </w:tc>
@@ -14029,12 +13788,9 @@
             <w:tcW w:w="2808" w:type="dxa"/>
           </w:tcPr>
           <w:p>
-            <w:pPr>
-              <w:spacing w:after="0" w:line="240" w:lineRule="auto"/>
-              <w:jc w:val="left"/>
-            </w:pPr>
-            <w:r>
-              <w:t>Identifier of the detection record.</w:t>
+            <w:r/>
+            <w:r>
+              <w:t>ID of the parent detection document; contributors[] is embedded in that document, not a separate collection.</w:t>
             </w:r>
           </w:p>
         </w:tc>
@@ -14101,12 +13857,9 @@
             <w:tcW w:w="2808" w:type="dxa"/>
           </w:tcPr>
           <w:p>
-            <w:pPr>
-              <w:spacing w:after="0" w:line="240" w:lineRule="auto"/>
-              <w:jc w:val="left"/>
-            </w:pPr>
-            <w:r>
-              <w:t>Position in the ranked list of sensor contributors.</w:t>
+            <w:r/>
+            <w:r>
+              <w:t>Position in the embedded contributors[] array (max 3 elements); not a separate table in Firestore.</w:t>
             </w:r>
           </w:p>
         </w:tc>
@@ -14421,19 +14174,83 @@
               <w:jc w:val="left"/>
             </w:pPr>
             <w:r>
+              <w:t>contribution_score</w:t>
+            </w:r>
+          </w:p>
+        </w:tc>
+        <w:tc>
+          <w:tcPr>
+            <w:tcW w:w="1350" w:type="dxa"/>
+          </w:tcPr>
+          <w:p>
+            <w:pPr>
+              <w:spacing w:after="0" w:line="240" w:lineRule="auto"/>
+              <w:jc w:val="left"/>
+            </w:pPr>
+            <w:r>
+              <w:t>decimal(10,4)</w:t>
+            </w:r>
+          </w:p>
+        </w:tc>
+        <w:tc>
+          <w:tcPr>
+            <w:tcW w:w="1656" w:type="dxa"/>
+          </w:tcPr>
+          <w:p>
+            <w:pPr>
+              <w:spacing w:after="0" w:line="240" w:lineRule="auto"/>
+              <w:jc w:val="left"/>
+            </w:pPr>
+            <w:r>
+              <w:t>Optional</w:t>
+            </w:r>
+          </w:p>
+        </w:tc>
+        <w:tc>
+          <w:tcPr>
+            <w:tcW w:w="1656" w:type="dxa"/>
+          </w:tcPr>
+          <w:p>
+            <w:pPr>
+              <w:spacing w:after="0" w:line="240" w:lineRule="auto"/>
+              <w:jc w:val="left"/>
+            </w:pPr>
+            <w:r>
+              <w:t>0.7500</w:t>
+            </w:r>
+          </w:p>
+        </w:tc>
+        <w:tc>
+          <w:tcPr>
+            <w:tcW w:w="2808" w:type="dxa"/>
+          </w:tcPr>
+          <w:p>
+            <w:pPr>
+              <w:spacing w:after="0" w:line="240" w:lineRule="auto"/>
+              <w:jc w:val="left"/>
+            </w:pPr>
+            <w:r>
+              <w:t>Relative contribution score used to rank the sensor; not a causal probability.</w:t>
+            </w:r>
+          </w:p>
+        </w:tc>
+      </w:tr>
+      <w:tr>
+        <w:tc>
+          <w:tcPr>
+            <w:tcW w:type="dxa" w:w="1458"/>
+          </w:tcPr>
+          <w:p>
+            <w:r>
               <w:t>direction</w:t>
             </w:r>
           </w:p>
         </w:tc>
         <w:tc>
           <w:tcPr>
-            <w:tcW w:w="1350" w:type="dxa"/>
-          </w:tcPr>
-          <w:p>
-            <w:pPr>
-              <w:spacing w:after="0" w:line="240" w:lineRule="auto"/>
-              <w:jc w:val="left"/>
-            </w:pPr>
+            <w:tcW w:type="dxa" w:w="1350"/>
+          </w:tcPr>
+          <w:p>
             <w:r>
               <w:t>varchar</w:t>
             </w:r>
@@ -14441,13 +14258,9 @@
         </w:tc>
         <w:tc>
           <w:tcPr>
-            <w:tcW w:w="1656" w:type="dxa"/>
-          </w:tcPr>
-          <w:p>
-            <w:pPr>
-              <w:spacing w:after="0" w:line="240" w:lineRule="auto"/>
-              <w:jc w:val="left"/>
-            </w:pPr>
+            <w:tcW w:type="dxa" w:w="1656"/>
+          </w:tcPr>
+          <w:p>
             <w:r>
               <w:t>Optional</w:t>
             </w:r>
@@ -14455,13 +14268,9 @@
         </w:tc>
         <w:tc>
           <w:tcPr>
-            <w:tcW w:w="1656" w:type="dxa"/>
-          </w:tcPr>
-          <w:p>
-            <w:pPr>
-              <w:spacing w:after="0" w:line="240" w:lineRule="auto"/>
-              <w:jc w:val="left"/>
-            </w:pPr>
+            <w:tcW w:type="dxa" w:w="1656"/>
+          </w:tcPr>
+          <w:p>
             <w:r>
               <w:t>increasing | decreasing | stable</w:t>
             </w:r>
@@ -14469,87 +14278,11 @@
         </w:tc>
         <w:tc>
           <w:tcPr>
-            <w:tcW w:w="2808" w:type="dxa"/>
-          </w:tcPr>
-          <w:p>
-            <w:pPr>
-              <w:spacing w:after="0" w:line="240" w:lineRule="auto"/>
-              <w:jc w:val="left"/>
-            </w:pPr>
-            <w:r>
-              <w:t>Whether the sensor reading is increasing, decreasing, or stable.</w:t>
-            </w:r>
-          </w:p>
-        </w:tc>
-      </w:tr>
-      <w:tr>
-        <w:tc>
-          <w:tcPr>
-            <w:tcW w:w="1458" w:type="dxa"/>
-          </w:tcPr>
-          <w:p>
-            <w:pPr>
-              <w:spacing w:after="0" w:line="240" w:lineRule="auto"/>
-              <w:jc w:val="left"/>
-            </w:pPr>
-            <w:r>
-              <w:t>contribution_score</w:t>
-            </w:r>
-          </w:p>
-        </w:tc>
-        <w:tc>
-          <w:tcPr>
-            <w:tcW w:w="1350" w:type="dxa"/>
-          </w:tcPr>
-          <w:p>
-            <w:pPr>
-              <w:spacing w:after="0" w:line="240" w:lineRule="auto"/>
-              <w:jc w:val="left"/>
-            </w:pPr>
-            <w:r>
-              <w:t>decimal(10,4)</w:t>
-            </w:r>
-          </w:p>
-        </w:tc>
-        <w:tc>
-          <w:tcPr>
-            <w:tcW w:w="1656" w:type="dxa"/>
-          </w:tcPr>
-          <w:p>
-            <w:pPr>
-              <w:spacing w:after="0" w:line="240" w:lineRule="auto"/>
-              <w:jc w:val="left"/>
-            </w:pPr>
-            <w:r>
-              <w:t>Optional</w:t>
-            </w:r>
-          </w:p>
-        </w:tc>
-        <w:tc>
-          <w:tcPr>
-            <w:tcW w:w="1656" w:type="dxa"/>
-          </w:tcPr>
-          <w:p>
-            <w:pPr>
-              <w:spacing w:after="0" w:line="240" w:lineRule="auto"/>
-              <w:jc w:val="left"/>
-            </w:pPr>
-            <w:r>
-              <w:t>0.7500</w:t>
-            </w:r>
-          </w:p>
-        </w:tc>
-        <w:tc>
-          <w:tcPr>
-            <w:tcW w:w="2808" w:type="dxa"/>
-          </w:tcPr>
-          <w:p>
-            <w:pPr>
-              <w:spacing w:after="0" w:line="240" w:lineRule="auto"/>
-              <w:jc w:val="left"/>
-            </w:pPr>
-            <w:r>
-              <w:t>Relative contribution score used to rank the sensor; not a causal probability.</w:t>
+            <w:tcW w:type="dxa" w:w="2808"/>
+          </w:tcPr>
+          <w:p>
+            <w:r>
+              <w:t>Recent direction used by the anomaly insight and recommendation.</w:t>
             </w:r>
           </w:p>
         </w:tc>
@@ -18408,6 +18141,7 @@
         </w:tc>
       </w:tr>
     </w:tbl>
+    <w:p/>
     <w:p/>
     <w:sectPr>
       <w:headerReference w:type="default" r:id="rId7"/>

</xml_diff>